<commit_message>
Added cover page and table for self-assessment to both Part 1 and Part 2 docs as per the Submission outline.
Finished A30, A27, A26, A24, A23, and A20.

Changed the vulnerable website for A4 since OWASP juice shop, which is a simulated vulnerable website, could not be used. Although, implementations can be done using it since it is a tested environment :D.

Changed/redid A5, A6, and A7 due to new understanding that the discover activities had to (preferably) be taken from real-world examples. May change A8, A11, and A17 as well later (A11 and A17 are in the midst of being reworked and some pictures have been added).
</commit_message>
<xml_diff>
--- a/Portfolio/Part-2-Activities.docx
+++ b/Portfolio/Part-2-Activities.docx
@@ -4,6 +4,344 @@
   <w:body>
     <w:p>
       <w:pPr>
+        <w:jc w:val="center"/>
+        <w:rPr>
+          <w:rFonts w:ascii="Times New Roman" w:hAnsi="Times New Roman" w:cs="Times New Roman"/>
+          <w:b/>
+          <w:bCs/>
+          <w:sz w:val="56"/>
+          <w:szCs w:val="56"/>
+        </w:rPr>
+      </w:pPr>
+    </w:p>
+    <w:p>
+      <w:pPr>
+        <w:rPr>
+          <w:rFonts w:ascii="Times New Roman" w:hAnsi="Times New Roman" w:cs="Times New Roman"/>
+          <w:b/>
+          <w:bCs/>
+          <w:sz w:val="56"/>
+          <w:szCs w:val="56"/>
+        </w:rPr>
+      </w:pPr>
+    </w:p>
+    <w:p>
+      <w:pPr>
+        <w:rPr>
+          <w:rFonts w:ascii="Times New Roman" w:hAnsi="Times New Roman" w:cs="Times New Roman"/>
+          <w:b/>
+          <w:bCs/>
+          <w:sz w:val="56"/>
+          <w:szCs w:val="56"/>
+        </w:rPr>
+      </w:pPr>
+    </w:p>
+    <w:p>
+      <w:pPr>
+        <w:spacing w:after="0" w:line="240" w:lineRule="auto"/>
+        <w:jc w:val="center"/>
+        <w:rPr>
+          <w:rFonts w:ascii="Times New Roman" w:hAnsi="Times New Roman" w:cs="Times New Roman"/>
+          <w:b/>
+          <w:bCs/>
+          <w:sz w:val="56"/>
+          <w:szCs w:val="56"/>
+        </w:rPr>
+      </w:pPr>
+      <w:r>
+        <w:rPr>
+          <w:rFonts w:ascii="Times New Roman" w:hAnsi="Times New Roman" w:cs="Times New Roman"/>
+          <w:b/>
+          <w:bCs/>
+          <w:sz w:val="56"/>
+          <w:szCs w:val="56"/>
+        </w:rPr>
+        <w:t>CITS2006:</w:t>
+      </w:r>
+    </w:p>
+    <w:p>
+      <w:pPr>
+        <w:spacing w:after="0" w:line="240" w:lineRule="auto"/>
+        <w:jc w:val="center"/>
+        <w:rPr>
+          <w:rFonts w:ascii="Times New Roman" w:hAnsi="Times New Roman" w:cs="Times New Roman"/>
+          <w:b/>
+          <w:bCs/>
+          <w:sz w:val="72"/>
+          <w:szCs w:val="72"/>
+        </w:rPr>
+      </w:pPr>
+      <w:r>
+        <w:rPr>
+          <w:rFonts w:ascii="Times New Roman" w:hAnsi="Times New Roman" w:cs="Times New Roman"/>
+          <w:b/>
+          <w:bCs/>
+          <w:noProof/>
+          <w:sz w:val="72"/>
+          <w:szCs w:val="72"/>
+        </w:rPr>
+        <mc:AlternateContent>
+          <mc:Choice Requires="wps">
+            <w:drawing>
+              <wp:anchor distT="0" distB="0" distL="114300" distR="114300" simplePos="0" relativeHeight="251659264" behindDoc="0" locked="0" layoutInCell="1" allowOverlap="1" wp14:anchorId="497F1E6F" wp14:editId="2CBF59B3">
+                <wp:simplePos x="0" y="0"/>
+                <wp:positionH relativeFrom="column">
+                  <wp:posOffset>429065</wp:posOffset>
+                </wp:positionH>
+                <wp:positionV relativeFrom="paragraph">
+                  <wp:posOffset>475664</wp:posOffset>
+                </wp:positionV>
+                <wp:extent cx="4860387" cy="0"/>
+                <wp:effectExtent l="0" t="0" r="0" b="0"/>
+                <wp:wrapNone/>
+                <wp:docPr id="634248226" name="Straight Connector 3"/>
+                <wp:cNvGraphicFramePr/>
+                <a:graphic xmlns:a="http://schemas.openxmlformats.org/drawingml/2006/main">
+                  <a:graphicData uri="http://schemas.microsoft.com/office/word/2010/wordprocessingShape">
+                    <wps:wsp>
+                      <wps:cNvCnPr/>
+                      <wps:spPr>
+                        <a:xfrm>
+                          <a:off x="0" y="0"/>
+                          <a:ext cx="4860387" cy="0"/>
+                        </a:xfrm>
+                        <a:prstGeom prst="line">
+                          <a:avLst/>
+                        </a:prstGeom>
+                        <a:ln w="19050">
+                          <a:solidFill>
+                            <a:schemeClr val="tx1"/>
+                          </a:solidFill>
+                        </a:ln>
+                      </wps:spPr>
+                      <wps:style>
+                        <a:lnRef idx="1">
+                          <a:schemeClr val="dk1"/>
+                        </a:lnRef>
+                        <a:fillRef idx="0">
+                          <a:schemeClr val="dk1"/>
+                        </a:fillRef>
+                        <a:effectRef idx="0">
+                          <a:schemeClr val="dk1"/>
+                        </a:effectRef>
+                        <a:fontRef idx="minor">
+                          <a:schemeClr val="tx1"/>
+                        </a:fontRef>
+                      </wps:style>
+                      <wps:bodyPr/>
+                    </wps:wsp>
+                  </a:graphicData>
+                </a:graphic>
+                <wp14:sizeRelH relativeFrom="margin">
+                  <wp14:pctWidth>0</wp14:pctWidth>
+                </wp14:sizeRelH>
+                <wp14:sizeRelV relativeFrom="margin">
+                  <wp14:pctHeight>0</wp14:pctHeight>
+                </wp14:sizeRelV>
+              </wp:anchor>
+            </w:drawing>
+          </mc:Choice>
+          <mc:Fallback>
+            <w:pict>
+              <v:line w14:anchorId="6D3413AA" id="Straight Connector 3" o:spid="_x0000_s1026" style="position:absolute;z-index:251659264;visibility:visible;mso-wrap-style:square;mso-width-percent:0;mso-height-percent:0;mso-wrap-distance-left:9pt;mso-wrap-distance-top:0;mso-wrap-distance-right:9pt;mso-wrap-distance-bottom:0;mso-position-horizontal:absolute;mso-position-horizontal-relative:text;mso-position-vertical:absolute;mso-position-vertical-relative:text;mso-width-percent:0;mso-height-percent:0;mso-width-relative:margin;mso-height-relative:margin" from="33.8pt,37.45pt" to="416.5pt,37.45pt" o:gfxdata="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" strokecolor="black [3213]" strokeweight="1.5pt">
+                <v:stroke joinstyle="miter"/>
+              </v:line>
+            </w:pict>
+          </mc:Fallback>
+        </mc:AlternateContent>
+      </w:r>
+      <w:r>
+        <w:rPr>
+          <w:rFonts w:ascii="Times New Roman" w:hAnsi="Times New Roman" w:cs="Times New Roman"/>
+          <w:b/>
+          <w:bCs/>
+          <w:sz w:val="72"/>
+          <w:szCs w:val="72"/>
+        </w:rPr>
+        <w:t xml:space="preserve">Defensive Cybersecurity </w:t>
+      </w:r>
+      <w:r>
+        <w:rPr>
+          <w:rFonts w:ascii="Times New Roman" w:hAnsi="Times New Roman" w:cs="Times New Roman"/>
+          <w:b/>
+          <w:bCs/>
+          <w:sz w:val="160"/>
+          <w:szCs w:val="160"/>
+        </w:rPr>
+        <w:t>Portfolio</w:t>
+      </w:r>
+      <w:r>
+        <w:rPr>
+          <w:rFonts w:ascii="Times New Roman" w:hAnsi="Times New Roman" w:cs="Times New Roman"/>
+          <w:b/>
+          <w:bCs/>
+          <w:sz w:val="96"/>
+          <w:szCs w:val="96"/>
+        </w:rPr>
+        <w:t xml:space="preserve"> </w:t>
+      </w:r>
+    </w:p>
+    <w:p>
+      <w:pPr>
+        <w:spacing w:after="0" w:line="240" w:lineRule="auto"/>
+        <w:jc w:val="center"/>
+        <w:rPr>
+          <w:rFonts w:ascii="Times New Roman" w:hAnsi="Times New Roman" w:cs="Times New Roman"/>
+          <w:b/>
+          <w:bCs/>
+          <w:sz w:val="72"/>
+          <w:szCs w:val="72"/>
+        </w:rPr>
+      </w:pPr>
+      <w:r>
+        <w:rPr>
+          <w:rFonts w:ascii="Times New Roman" w:hAnsi="Times New Roman" w:cs="Times New Roman"/>
+          <w:b/>
+          <w:bCs/>
+          <w:sz w:val="72"/>
+          <w:szCs w:val="72"/>
+        </w:rPr>
+        <w:t xml:space="preserve">Part </w:t>
+      </w:r>
+      <w:r>
+        <w:rPr>
+          <w:rFonts w:ascii="Times New Roman" w:hAnsi="Times New Roman" w:cs="Times New Roman"/>
+          <w:b/>
+          <w:bCs/>
+          <w:sz w:val="72"/>
+          <w:szCs w:val="72"/>
+        </w:rPr>
+        <w:t>2</w:t>
+      </w:r>
+    </w:p>
+    <w:p>
+      <w:pPr>
+        <w:jc w:val="center"/>
+        <w:rPr>
+          <w:rFonts w:ascii="Times New Roman" w:hAnsi="Times New Roman" w:cs="Times New Roman"/>
+          <w:b/>
+          <w:bCs/>
+          <w:sz w:val="72"/>
+          <w:szCs w:val="72"/>
+        </w:rPr>
+      </w:pPr>
+    </w:p>
+    <w:p>
+      <w:pPr>
+        <w:jc w:val="center"/>
+        <w:rPr>
+          <w:rFonts w:ascii="Times New Roman" w:hAnsi="Times New Roman" w:cs="Times New Roman"/>
+          <w:b/>
+          <w:bCs/>
+          <w:sz w:val="32"/>
+          <w:szCs w:val="32"/>
+        </w:rPr>
+      </w:pPr>
+      <w:r>
+        <w:rPr>
+          <w:rFonts w:ascii="Times New Roman" w:hAnsi="Times New Roman" w:cs="Times New Roman"/>
+          <w:b/>
+          <w:bCs/>
+          <w:sz w:val="32"/>
+          <w:szCs w:val="32"/>
+        </w:rPr>
+        <w:t>Submitted by:</w:t>
+      </w:r>
+    </w:p>
+    <w:p>
+      <w:pPr>
+        <w:jc w:val="center"/>
+        <w:rPr>
+          <w:rFonts w:ascii="Times New Roman" w:hAnsi="Times New Roman" w:cs="Times New Roman"/>
+          <w:b/>
+          <w:bCs/>
+          <w:sz w:val="32"/>
+          <w:szCs w:val="32"/>
+        </w:rPr>
+      </w:pPr>
+    </w:p>
+    <w:p>
+      <w:pPr>
+        <w:jc w:val="center"/>
+        <w:rPr>
+          <w:rFonts w:ascii="Times New Roman" w:hAnsi="Times New Roman" w:cs="Times New Roman"/>
+          <w:b/>
+          <w:bCs/>
+          <w:sz w:val="32"/>
+          <w:szCs w:val="32"/>
+        </w:rPr>
+      </w:pPr>
+      <w:r>
+        <w:rPr>
+          <w:rFonts w:ascii="Times New Roman" w:hAnsi="Times New Roman" w:cs="Times New Roman"/>
+          <w:b/>
+          <w:bCs/>
+          <w:sz w:val="32"/>
+          <w:szCs w:val="32"/>
+        </w:rPr>
+        <w:t>Kelly Valencia</w:t>
+      </w:r>
+    </w:p>
+    <w:p>
+      <w:pPr>
+        <w:jc w:val="center"/>
+        <w:rPr>
+          <w:rFonts w:ascii="Times New Roman" w:hAnsi="Times New Roman" w:cs="Times New Roman"/>
+          <w:b/>
+          <w:bCs/>
+          <w:sz w:val="32"/>
+          <w:szCs w:val="32"/>
+        </w:rPr>
+      </w:pPr>
+      <w:r>
+        <w:rPr>
+          <w:rFonts w:ascii="Times New Roman" w:hAnsi="Times New Roman" w:cs="Times New Roman"/>
+          <w:b/>
+          <w:bCs/>
+          <w:sz w:val="32"/>
+          <w:szCs w:val="32"/>
+        </w:rPr>
+        <w:t>24540356</w:t>
+      </w:r>
+    </w:p>
+    <w:p>
+      <w:pPr>
+        <w:jc w:val="center"/>
+        <w:rPr>
+          <w:rFonts w:ascii="Times New Roman" w:hAnsi="Times New Roman" w:cs="Times New Roman"/>
+          <w:b/>
+          <w:bCs/>
+          <w:sz w:val="32"/>
+          <w:szCs w:val="32"/>
+        </w:rPr>
+      </w:pPr>
+      <w:hyperlink r:id="rId5" w:history="1">
+        <w:r>
+          <w:rPr>
+            <w:rStyle w:val="Hyperlink"/>
+            <w:rFonts w:ascii="Times New Roman" w:hAnsi="Times New Roman" w:cs="Times New Roman"/>
+            <w:b/>
+            <w:bCs/>
+            <w:sz w:val="32"/>
+            <w:szCs w:val="32"/>
+          </w:rPr>
+          <w:t>https://github.com/Kelly-Vl/Defensive-Cybersecurity-Portfolio</w:t>
+        </w:r>
+      </w:hyperlink>
+      <w:r>
+        <w:rPr>
+          <w:rFonts w:ascii="Times New Roman" w:hAnsi="Times New Roman" w:cs="Times New Roman"/>
+          <w:b/>
+          <w:bCs/>
+          <w:sz w:val="32"/>
+          <w:szCs w:val="32"/>
+        </w:rPr>
+        <w:t xml:space="preserve"> </w:t>
+      </w:r>
+    </w:p>
+    <w:p>
+      <w:pPr>
+        <w:jc w:val="both"/>
         <w:rPr>
           <w:rFonts w:ascii="Times New Roman" w:hAnsi="Times New Roman" w:cs="Times New Roman"/>
           <w:b/>
@@ -12,7 +350,10 @@
           <w:szCs w:val="40"/>
         </w:rPr>
       </w:pPr>
-      <w:r>
+    </w:p>
+    <w:p>
+      <w:pPr>
+        <w:jc w:val="both"/>
         <w:rPr>
           <w:rFonts w:ascii="Times New Roman" w:hAnsi="Times New Roman" w:cs="Times New Roman"/>
           <w:b/>
@@ -20,9 +361,11 @@
           <w:sz w:val="40"/>
           <w:szCs w:val="40"/>
         </w:rPr>
-        <w:t xml:space="preserve">Part 2 </w:t>
-      </w:r>
-      <w:r>
+      </w:pPr>
+    </w:p>
+    <w:p>
+      <w:pPr>
+        <w:jc w:val="both"/>
         <w:rPr>
           <w:rFonts w:ascii="Times New Roman" w:hAnsi="Times New Roman" w:cs="Times New Roman"/>
           <w:b/>
@@ -30,9 +373,11 @@
           <w:sz w:val="40"/>
           <w:szCs w:val="40"/>
         </w:rPr>
-        <w:t>A</w:t>
-      </w:r>
-      <w:r>
+      </w:pPr>
+    </w:p>
+    <w:p>
+      <w:pPr>
+        <w:jc w:val="both"/>
         <w:rPr>
           <w:rFonts w:ascii="Times New Roman" w:hAnsi="Times New Roman" w:cs="Times New Roman"/>
           <w:b/>
@@ -40,11 +385,11 @@
           <w:sz w:val="40"/>
           <w:szCs w:val="40"/>
         </w:rPr>
-        <w:t xml:space="preserve">ctivities </w:t>
-      </w:r>
-    </w:p>
-    <w:p>
-      <w:pPr>
+      </w:pPr>
+    </w:p>
+    <w:p>
+      <w:pPr>
+        <w:jc w:val="both"/>
         <w:rPr>
           <w:rFonts w:ascii="Times New Roman" w:hAnsi="Times New Roman" w:cs="Times New Roman"/>
           <w:b/>
@@ -61,9 +406,1637 @@
           <w:sz w:val="40"/>
           <w:szCs w:val="40"/>
         </w:rPr>
-        <w:t>(</w:t>
-      </w:r>
-      <w:r>
+        <w:lastRenderedPageBreak/>
+        <w:t>Table of Self-Assessment</w:t>
+      </w:r>
+    </w:p>
+    <w:tbl>
+      <w:tblPr>
+        <w:tblStyle w:val="TableGrid"/>
+        <w:tblW w:w="0" w:type="auto"/>
+        <w:tblLook w:val="04A0" w:firstRow="1" w:lastRow="0" w:firstColumn="1" w:lastColumn="0" w:noHBand="0" w:noVBand="1"/>
+      </w:tblPr>
+      <w:tblGrid>
+        <w:gridCol w:w="1165"/>
+        <w:gridCol w:w="6841"/>
+        <w:gridCol w:w="1010"/>
+      </w:tblGrid>
+      <w:tr>
+        <w:tc>
+          <w:tcPr>
+            <w:tcW w:w="1165" w:type="dxa"/>
+            <w:shd w:val="clear" w:color="auto" w:fill="BFBFBF" w:themeFill="background1" w:themeFillShade="BF"/>
+          </w:tcPr>
+          <w:p>
+            <w:pPr>
+              <w:rPr>
+                <w:rFonts w:ascii="Times New Roman" w:hAnsi="Times New Roman" w:cs="Times New Roman"/>
+              </w:rPr>
+            </w:pPr>
+            <w:r>
+              <w:rPr>
+                <w:rFonts w:ascii="Times New Roman" w:hAnsi="Times New Roman" w:cs="Times New Roman"/>
+                <w:b/>
+                <w:bCs/>
+                <w:sz w:val="28"/>
+                <w:szCs w:val="28"/>
+              </w:rPr>
+              <w:t>Activity</w:t>
+            </w:r>
+          </w:p>
+        </w:tc>
+        <w:tc>
+          <w:tcPr>
+            <w:tcW w:w="6910" w:type="dxa"/>
+            <w:shd w:val="clear" w:color="auto" w:fill="BFBFBF" w:themeFill="background1" w:themeFillShade="BF"/>
+          </w:tcPr>
+          <w:p>
+            <w:pPr>
+              <w:rPr>
+                <w:rFonts w:ascii="Times New Roman" w:hAnsi="Times New Roman" w:cs="Times New Roman"/>
+              </w:rPr>
+            </w:pPr>
+            <w:r>
+              <w:rPr>
+                <w:rFonts w:ascii="Times New Roman" w:hAnsi="Times New Roman" w:cs="Times New Roman"/>
+                <w:b/>
+                <w:bCs/>
+                <w:sz w:val="28"/>
+                <w:szCs w:val="28"/>
+              </w:rPr>
+              <w:t>Description</w:t>
+            </w:r>
+          </w:p>
+        </w:tc>
+        <w:tc>
+          <w:tcPr>
+            <w:tcW w:w="941" w:type="dxa"/>
+            <w:shd w:val="clear" w:color="auto" w:fill="BFBFBF" w:themeFill="background1" w:themeFillShade="BF"/>
+          </w:tcPr>
+          <w:p>
+            <w:pPr>
+              <w:rPr>
+                <w:rFonts w:ascii="Times New Roman" w:hAnsi="Times New Roman" w:cs="Times New Roman"/>
+              </w:rPr>
+            </w:pPr>
+            <w:r>
+              <w:rPr>
+                <w:rFonts w:ascii="Times New Roman" w:hAnsi="Times New Roman" w:cs="Times New Roman"/>
+                <w:b/>
+                <w:bCs/>
+                <w:sz w:val="28"/>
+                <w:szCs w:val="28"/>
+              </w:rPr>
+              <w:t>Marks</w:t>
+            </w:r>
+          </w:p>
+        </w:tc>
+      </w:tr>
+      <w:tr>
+        <w:tc>
+          <w:tcPr>
+            <w:tcW w:w="1165" w:type="dxa"/>
+          </w:tcPr>
+          <w:p>
+            <w:pPr>
+              <w:jc w:val="center"/>
+              <w:rPr>
+                <w:rFonts w:ascii="Times New Roman" w:hAnsi="Times New Roman" w:cs="Times New Roman"/>
+              </w:rPr>
+            </w:pPr>
+            <w:r>
+              <w:rPr>
+                <w:rFonts w:ascii="Times New Roman" w:hAnsi="Times New Roman" w:cs="Times New Roman"/>
+              </w:rPr>
+              <w:t>B1</w:t>
+            </w:r>
+          </w:p>
+        </w:tc>
+        <w:tc>
+          <w:tcPr>
+            <w:tcW w:w="6910" w:type="dxa"/>
+          </w:tcPr>
+          <w:p>
+            <w:pPr>
+              <w:rPr>
+                <w:rFonts w:ascii="Times New Roman" w:hAnsi="Times New Roman" w:cs="Times New Roman"/>
+              </w:rPr>
+            </w:pPr>
+            <w:r>
+              <w:rPr>
+                <w:rFonts w:ascii="Times New Roman" w:hAnsi="Times New Roman" w:cs="Times New Roman"/>
+              </w:rPr>
+              <w:t>Discover 5 unique weak/vulnerable security implementations</w:t>
+            </w:r>
+          </w:p>
+        </w:tc>
+        <w:tc>
+          <w:tcPr>
+            <w:tcW w:w="941" w:type="dxa"/>
+          </w:tcPr>
+          <w:p>
+            <w:pPr>
+              <w:rPr>
+                <w:rFonts w:ascii="Times New Roman" w:hAnsi="Times New Roman" w:cs="Times New Roman"/>
+              </w:rPr>
+            </w:pPr>
+          </w:p>
+        </w:tc>
+      </w:tr>
+      <w:tr>
+        <w:tc>
+          <w:tcPr>
+            <w:tcW w:w="1165" w:type="dxa"/>
+          </w:tcPr>
+          <w:p>
+            <w:pPr>
+              <w:jc w:val="center"/>
+              <w:rPr>
+                <w:rFonts w:ascii="Times New Roman" w:hAnsi="Times New Roman" w:cs="Times New Roman"/>
+              </w:rPr>
+            </w:pPr>
+            <w:r>
+              <w:rPr>
+                <w:rFonts w:ascii="Times New Roman" w:hAnsi="Times New Roman" w:cs="Times New Roman"/>
+              </w:rPr>
+              <w:t>B2</w:t>
+            </w:r>
+          </w:p>
+        </w:tc>
+        <w:tc>
+          <w:tcPr>
+            <w:tcW w:w="6910" w:type="dxa"/>
+          </w:tcPr>
+          <w:p>
+            <w:pPr>
+              <w:rPr>
+                <w:rFonts w:ascii="Times New Roman" w:hAnsi="Times New Roman" w:cs="Times New Roman"/>
+              </w:rPr>
+            </w:pPr>
+            <w:r>
+              <w:rPr>
+                <w:rFonts w:ascii="Times New Roman" w:hAnsi="Times New Roman" w:cs="Times New Roman"/>
+              </w:rPr>
+              <w:t>Discover 5 unique strong security implementations</w:t>
+            </w:r>
+          </w:p>
+        </w:tc>
+        <w:tc>
+          <w:tcPr>
+            <w:tcW w:w="941" w:type="dxa"/>
+          </w:tcPr>
+          <w:p>
+            <w:pPr>
+              <w:rPr>
+                <w:rFonts w:ascii="Times New Roman" w:hAnsi="Times New Roman" w:cs="Times New Roman"/>
+              </w:rPr>
+            </w:pPr>
+          </w:p>
+        </w:tc>
+      </w:tr>
+      <w:tr>
+        <w:tc>
+          <w:tcPr>
+            <w:tcW w:w="1165" w:type="dxa"/>
+          </w:tcPr>
+          <w:p>
+            <w:pPr>
+              <w:jc w:val="center"/>
+              <w:rPr>
+                <w:rFonts w:ascii="Times New Roman" w:hAnsi="Times New Roman" w:cs="Times New Roman"/>
+              </w:rPr>
+            </w:pPr>
+            <w:r>
+              <w:rPr>
+                <w:rFonts w:ascii="Times New Roman" w:hAnsi="Times New Roman" w:cs="Times New Roman"/>
+              </w:rPr>
+              <w:t>B3</w:t>
+            </w:r>
+          </w:p>
+        </w:tc>
+        <w:tc>
+          <w:tcPr>
+            <w:tcW w:w="6910" w:type="dxa"/>
+          </w:tcPr>
+          <w:p>
+            <w:pPr>
+              <w:rPr>
+                <w:rFonts w:ascii="Times New Roman" w:hAnsi="Times New Roman" w:cs="Times New Roman"/>
+              </w:rPr>
+            </w:pPr>
+            <w:r>
+              <w:rPr>
+                <w:rFonts w:ascii="Times New Roman" w:hAnsi="Times New Roman" w:cs="Times New Roman"/>
+              </w:rPr>
+              <w:t>Discover 3 proactive security implementations in practice</w:t>
+            </w:r>
+          </w:p>
+        </w:tc>
+        <w:tc>
+          <w:tcPr>
+            <w:tcW w:w="941" w:type="dxa"/>
+          </w:tcPr>
+          <w:p>
+            <w:pPr>
+              <w:rPr>
+                <w:rFonts w:ascii="Times New Roman" w:hAnsi="Times New Roman" w:cs="Times New Roman"/>
+              </w:rPr>
+            </w:pPr>
+          </w:p>
+        </w:tc>
+      </w:tr>
+      <w:tr>
+        <w:tc>
+          <w:tcPr>
+            <w:tcW w:w="1165" w:type="dxa"/>
+          </w:tcPr>
+          <w:p>
+            <w:pPr>
+              <w:jc w:val="center"/>
+              <w:rPr>
+                <w:rFonts w:ascii="Times New Roman" w:hAnsi="Times New Roman" w:cs="Times New Roman"/>
+              </w:rPr>
+            </w:pPr>
+            <w:r>
+              <w:rPr>
+                <w:rFonts w:ascii="Times New Roman" w:hAnsi="Times New Roman" w:cs="Times New Roman"/>
+              </w:rPr>
+              <w:t>B4</w:t>
+            </w:r>
+          </w:p>
+        </w:tc>
+        <w:tc>
+          <w:tcPr>
+            <w:tcW w:w="6910" w:type="dxa"/>
+          </w:tcPr>
+          <w:p>
+            <w:pPr>
+              <w:rPr>
+                <w:rFonts w:ascii="Times New Roman" w:hAnsi="Times New Roman" w:cs="Times New Roman"/>
+              </w:rPr>
+            </w:pPr>
+            <w:r>
+              <w:rPr>
+                <w:rFonts w:ascii="Times New Roman" w:hAnsi="Times New Roman" w:cs="Times New Roman"/>
+              </w:rPr>
+              <w:t>Participate in 3 in-class activities in labs (facilitators will administer such activities)</w:t>
+            </w:r>
+          </w:p>
+        </w:tc>
+        <w:tc>
+          <w:tcPr>
+            <w:tcW w:w="941" w:type="dxa"/>
+          </w:tcPr>
+          <w:p>
+            <w:pPr>
+              <w:rPr>
+                <w:rFonts w:ascii="Times New Roman" w:hAnsi="Times New Roman" w:cs="Times New Roman"/>
+              </w:rPr>
+            </w:pPr>
+          </w:p>
+        </w:tc>
+      </w:tr>
+      <w:tr>
+        <w:tc>
+          <w:tcPr>
+            <w:tcW w:w="1165" w:type="dxa"/>
+          </w:tcPr>
+          <w:p>
+            <w:pPr>
+              <w:jc w:val="center"/>
+              <w:rPr>
+                <w:rFonts w:ascii="Times New Roman" w:hAnsi="Times New Roman" w:cs="Times New Roman"/>
+              </w:rPr>
+            </w:pPr>
+            <w:r>
+              <w:rPr>
+                <w:rFonts w:ascii="Times New Roman" w:hAnsi="Times New Roman" w:cs="Times New Roman"/>
+              </w:rPr>
+              <w:t>B5</w:t>
+            </w:r>
+          </w:p>
+        </w:tc>
+        <w:tc>
+          <w:tcPr>
+            <w:tcW w:w="6910" w:type="dxa"/>
+          </w:tcPr>
+          <w:p>
+            <w:pPr>
+              <w:rPr>
+                <w:rFonts w:ascii="Times New Roman" w:hAnsi="Times New Roman" w:cs="Times New Roman"/>
+              </w:rPr>
+            </w:pPr>
+            <w:r>
+              <w:rPr>
+                <w:rFonts w:ascii="Times New Roman" w:hAnsi="Times New Roman" w:cs="Times New Roman"/>
+              </w:rPr>
+              <w:t>Attend 2 cybersecurity related talks/seminars</w:t>
+            </w:r>
+          </w:p>
+        </w:tc>
+        <w:tc>
+          <w:tcPr>
+            <w:tcW w:w="941" w:type="dxa"/>
+          </w:tcPr>
+          <w:p>
+            <w:pPr>
+              <w:rPr>
+                <w:rFonts w:ascii="Times New Roman" w:hAnsi="Times New Roman" w:cs="Times New Roman"/>
+              </w:rPr>
+            </w:pPr>
+          </w:p>
+        </w:tc>
+      </w:tr>
+      <w:tr>
+        <w:tc>
+          <w:tcPr>
+            <w:tcW w:w="1165" w:type="dxa"/>
+          </w:tcPr>
+          <w:p>
+            <w:pPr>
+              <w:jc w:val="center"/>
+              <w:rPr>
+                <w:rFonts w:ascii="Times New Roman" w:hAnsi="Times New Roman" w:cs="Times New Roman"/>
+              </w:rPr>
+            </w:pPr>
+            <w:r>
+              <w:rPr>
+                <w:rFonts w:ascii="Times New Roman" w:hAnsi="Times New Roman" w:cs="Times New Roman"/>
+              </w:rPr>
+              <w:t>B6</w:t>
+            </w:r>
+          </w:p>
+        </w:tc>
+        <w:tc>
+          <w:tcPr>
+            <w:tcW w:w="6910" w:type="dxa"/>
+          </w:tcPr>
+          <w:p>
+            <w:pPr>
+              <w:rPr>
+                <w:rFonts w:ascii="Times New Roman" w:hAnsi="Times New Roman" w:cs="Times New Roman"/>
+              </w:rPr>
+            </w:pPr>
+            <w:r>
+              <w:rPr>
+                <w:rFonts w:ascii="Times New Roman" w:hAnsi="Times New Roman" w:cs="Times New Roman"/>
+              </w:rPr>
+              <w:t>Attend 2 cyber ethics/law related talks/seminars</w:t>
+            </w:r>
+          </w:p>
+        </w:tc>
+        <w:tc>
+          <w:tcPr>
+            <w:tcW w:w="941" w:type="dxa"/>
+          </w:tcPr>
+          <w:p>
+            <w:pPr>
+              <w:rPr>
+                <w:rFonts w:ascii="Times New Roman" w:hAnsi="Times New Roman" w:cs="Times New Roman"/>
+              </w:rPr>
+            </w:pPr>
+          </w:p>
+        </w:tc>
+      </w:tr>
+      <w:tr>
+        <w:tc>
+          <w:tcPr>
+            <w:tcW w:w="1165" w:type="dxa"/>
+          </w:tcPr>
+          <w:p>
+            <w:pPr>
+              <w:jc w:val="center"/>
+              <w:rPr>
+                <w:rFonts w:ascii="Times New Roman" w:hAnsi="Times New Roman" w:cs="Times New Roman"/>
+              </w:rPr>
+            </w:pPr>
+            <w:r>
+              <w:rPr>
+                <w:rFonts w:ascii="Times New Roman" w:hAnsi="Times New Roman" w:cs="Times New Roman"/>
+              </w:rPr>
+              <w:t>B7</w:t>
+            </w:r>
+          </w:p>
+        </w:tc>
+        <w:tc>
+          <w:tcPr>
+            <w:tcW w:w="6910" w:type="dxa"/>
+          </w:tcPr>
+          <w:p>
+            <w:pPr>
+              <w:rPr>
+                <w:rFonts w:ascii="Times New Roman" w:hAnsi="Times New Roman" w:cs="Times New Roman"/>
+              </w:rPr>
+            </w:pPr>
+            <w:r>
+              <w:rPr>
+                <w:rFonts w:ascii="Times New Roman" w:hAnsi="Times New Roman" w:cs="Times New Roman"/>
+              </w:rPr>
+              <w:t>Participate in CS/DS/cybersecurity clubs’ activity</w:t>
+            </w:r>
+          </w:p>
+        </w:tc>
+        <w:tc>
+          <w:tcPr>
+            <w:tcW w:w="941" w:type="dxa"/>
+          </w:tcPr>
+          <w:p>
+            <w:pPr>
+              <w:rPr>
+                <w:rFonts w:ascii="Times New Roman" w:hAnsi="Times New Roman" w:cs="Times New Roman"/>
+              </w:rPr>
+            </w:pPr>
+          </w:p>
+        </w:tc>
+      </w:tr>
+      <w:tr>
+        <w:tc>
+          <w:tcPr>
+            <w:tcW w:w="1165" w:type="dxa"/>
+          </w:tcPr>
+          <w:p>
+            <w:pPr>
+              <w:jc w:val="center"/>
+              <w:rPr>
+                <w:rFonts w:ascii="Times New Roman" w:hAnsi="Times New Roman" w:cs="Times New Roman"/>
+              </w:rPr>
+            </w:pPr>
+            <w:r>
+              <w:rPr>
+                <w:rFonts w:ascii="Times New Roman" w:hAnsi="Times New Roman" w:cs="Times New Roman"/>
+              </w:rPr>
+              <w:t>B8</w:t>
+            </w:r>
+          </w:p>
+        </w:tc>
+        <w:tc>
+          <w:tcPr>
+            <w:tcW w:w="6910" w:type="dxa"/>
+          </w:tcPr>
+          <w:p>
+            <w:pPr>
+              <w:rPr>
+                <w:rFonts w:ascii="Times New Roman" w:hAnsi="Times New Roman" w:cs="Times New Roman"/>
+              </w:rPr>
+            </w:pPr>
+            <w:r>
+              <w:rPr>
+                <w:rFonts w:ascii="Times New Roman" w:hAnsi="Times New Roman" w:cs="Times New Roman"/>
+              </w:rPr>
+              <w:t>Participate in a hackathon</w:t>
+            </w:r>
+          </w:p>
+        </w:tc>
+        <w:tc>
+          <w:tcPr>
+            <w:tcW w:w="941" w:type="dxa"/>
+          </w:tcPr>
+          <w:p>
+            <w:pPr>
+              <w:rPr>
+                <w:rFonts w:ascii="Times New Roman" w:hAnsi="Times New Roman" w:cs="Times New Roman"/>
+              </w:rPr>
+            </w:pPr>
+          </w:p>
+        </w:tc>
+      </w:tr>
+      <w:tr>
+        <w:tc>
+          <w:tcPr>
+            <w:tcW w:w="1165" w:type="dxa"/>
+          </w:tcPr>
+          <w:p>
+            <w:pPr>
+              <w:jc w:val="center"/>
+              <w:rPr>
+                <w:rFonts w:ascii="Times New Roman" w:hAnsi="Times New Roman" w:cs="Times New Roman"/>
+              </w:rPr>
+            </w:pPr>
+            <w:r>
+              <w:rPr>
+                <w:rFonts w:ascii="Times New Roman" w:hAnsi="Times New Roman" w:cs="Times New Roman"/>
+              </w:rPr>
+              <w:t>B9</w:t>
+            </w:r>
+          </w:p>
+        </w:tc>
+        <w:tc>
+          <w:tcPr>
+            <w:tcW w:w="6910" w:type="dxa"/>
+          </w:tcPr>
+          <w:p>
+            <w:pPr>
+              <w:rPr>
+                <w:rFonts w:ascii="Times New Roman" w:hAnsi="Times New Roman" w:cs="Times New Roman"/>
+              </w:rPr>
+            </w:pPr>
+            <w:r>
+              <w:rPr>
+                <w:rFonts w:ascii="Times New Roman" w:hAnsi="Times New Roman" w:cs="Times New Roman"/>
+              </w:rPr>
+              <w:t>Participate in an industry-related cybersecurity event</w:t>
+            </w:r>
+          </w:p>
+        </w:tc>
+        <w:tc>
+          <w:tcPr>
+            <w:tcW w:w="941" w:type="dxa"/>
+          </w:tcPr>
+          <w:p>
+            <w:pPr>
+              <w:rPr>
+                <w:rFonts w:ascii="Times New Roman" w:hAnsi="Times New Roman" w:cs="Times New Roman"/>
+              </w:rPr>
+            </w:pPr>
+          </w:p>
+        </w:tc>
+      </w:tr>
+      <w:tr>
+        <w:tc>
+          <w:tcPr>
+            <w:tcW w:w="1165" w:type="dxa"/>
+          </w:tcPr>
+          <w:p>
+            <w:pPr>
+              <w:jc w:val="center"/>
+              <w:rPr>
+                <w:rFonts w:ascii="Times New Roman" w:hAnsi="Times New Roman" w:cs="Times New Roman"/>
+              </w:rPr>
+            </w:pPr>
+            <w:r>
+              <w:rPr>
+                <w:rFonts w:ascii="Times New Roman" w:hAnsi="Times New Roman" w:cs="Times New Roman"/>
+              </w:rPr>
+              <w:t>B10</w:t>
+            </w:r>
+          </w:p>
+        </w:tc>
+        <w:tc>
+          <w:tcPr>
+            <w:tcW w:w="6910" w:type="dxa"/>
+          </w:tcPr>
+          <w:p>
+            <w:pPr>
+              <w:rPr>
+                <w:rFonts w:ascii="Times New Roman" w:hAnsi="Times New Roman" w:cs="Times New Roman"/>
+              </w:rPr>
+            </w:pPr>
+            <w:r>
+              <w:rPr>
+                <w:rFonts w:ascii="Times New Roman" w:hAnsi="Times New Roman" w:cs="Times New Roman"/>
+              </w:rPr>
+              <w:t>Participate in a cybersecurity activity as part of job/internship/volunteering etc</w:t>
+            </w:r>
+          </w:p>
+        </w:tc>
+        <w:tc>
+          <w:tcPr>
+            <w:tcW w:w="941" w:type="dxa"/>
+          </w:tcPr>
+          <w:p>
+            <w:pPr>
+              <w:rPr>
+                <w:rFonts w:ascii="Times New Roman" w:hAnsi="Times New Roman" w:cs="Times New Roman"/>
+              </w:rPr>
+            </w:pPr>
+          </w:p>
+        </w:tc>
+      </w:tr>
+      <w:tr>
+        <w:tc>
+          <w:tcPr>
+            <w:tcW w:w="1165" w:type="dxa"/>
+          </w:tcPr>
+          <w:p>
+            <w:pPr>
+              <w:jc w:val="center"/>
+              <w:rPr>
+                <w:rFonts w:ascii="Times New Roman" w:hAnsi="Times New Roman" w:cs="Times New Roman"/>
+              </w:rPr>
+            </w:pPr>
+            <w:r>
+              <w:rPr>
+                <w:rFonts w:ascii="Times New Roman" w:hAnsi="Times New Roman" w:cs="Times New Roman"/>
+              </w:rPr>
+              <w:t>B11</w:t>
+            </w:r>
+          </w:p>
+        </w:tc>
+        <w:tc>
+          <w:tcPr>
+            <w:tcW w:w="6910" w:type="dxa"/>
+          </w:tcPr>
+          <w:p>
+            <w:pPr>
+              <w:rPr>
+                <w:rFonts w:ascii="Times New Roman" w:hAnsi="Times New Roman" w:cs="Times New Roman"/>
+              </w:rPr>
+            </w:pPr>
+            <w:r>
+              <w:rPr>
+                <w:rFonts w:ascii="Times New Roman" w:hAnsi="Times New Roman" w:cs="Times New Roman"/>
+              </w:rPr>
+              <w:t>Talk to 2 cybersecurity experts from the industry and find out their latest projects</w:t>
+            </w:r>
+          </w:p>
+        </w:tc>
+        <w:tc>
+          <w:tcPr>
+            <w:tcW w:w="941" w:type="dxa"/>
+          </w:tcPr>
+          <w:p>
+            <w:pPr>
+              <w:rPr>
+                <w:rFonts w:ascii="Times New Roman" w:hAnsi="Times New Roman" w:cs="Times New Roman"/>
+              </w:rPr>
+            </w:pPr>
+          </w:p>
+        </w:tc>
+      </w:tr>
+      <w:tr>
+        <w:tc>
+          <w:tcPr>
+            <w:tcW w:w="1165" w:type="dxa"/>
+          </w:tcPr>
+          <w:p>
+            <w:pPr>
+              <w:jc w:val="center"/>
+              <w:rPr>
+                <w:rFonts w:ascii="Times New Roman" w:hAnsi="Times New Roman" w:cs="Times New Roman"/>
+              </w:rPr>
+            </w:pPr>
+            <w:r>
+              <w:rPr>
+                <w:rFonts w:ascii="Times New Roman" w:hAnsi="Times New Roman" w:cs="Times New Roman"/>
+              </w:rPr>
+              <w:t>B12</w:t>
+            </w:r>
+          </w:p>
+        </w:tc>
+        <w:tc>
+          <w:tcPr>
+            <w:tcW w:w="6910" w:type="dxa"/>
+          </w:tcPr>
+          <w:p>
+            <w:pPr>
+              <w:rPr>
+                <w:rFonts w:ascii="Times New Roman" w:hAnsi="Times New Roman" w:cs="Times New Roman"/>
+              </w:rPr>
+            </w:pPr>
+            <w:r>
+              <w:rPr>
+                <w:rFonts w:ascii="Times New Roman" w:hAnsi="Times New Roman" w:cs="Times New Roman"/>
+              </w:rPr>
+              <w:t>Discover two bias cases when using a generative AI system</w:t>
+            </w:r>
+          </w:p>
+        </w:tc>
+        <w:tc>
+          <w:tcPr>
+            <w:tcW w:w="941" w:type="dxa"/>
+          </w:tcPr>
+          <w:p>
+            <w:pPr>
+              <w:rPr>
+                <w:rFonts w:ascii="Times New Roman" w:hAnsi="Times New Roman" w:cs="Times New Roman"/>
+              </w:rPr>
+            </w:pPr>
+          </w:p>
+        </w:tc>
+      </w:tr>
+      <w:tr>
+        <w:tc>
+          <w:tcPr>
+            <w:tcW w:w="1165" w:type="dxa"/>
+          </w:tcPr>
+          <w:p>
+            <w:pPr>
+              <w:jc w:val="center"/>
+              <w:rPr>
+                <w:rFonts w:ascii="Times New Roman" w:hAnsi="Times New Roman" w:cs="Times New Roman"/>
+              </w:rPr>
+            </w:pPr>
+            <w:r>
+              <w:rPr>
+                <w:rFonts w:ascii="Times New Roman" w:hAnsi="Times New Roman" w:cs="Times New Roman"/>
+              </w:rPr>
+              <w:t>B13</w:t>
+            </w:r>
+          </w:p>
+        </w:tc>
+        <w:tc>
+          <w:tcPr>
+            <w:tcW w:w="6910" w:type="dxa"/>
+          </w:tcPr>
+          <w:p>
+            <w:pPr>
+              <w:rPr>
+                <w:rFonts w:ascii="Times New Roman" w:hAnsi="Times New Roman" w:cs="Times New Roman"/>
+              </w:rPr>
+            </w:pPr>
+            <w:r>
+              <w:rPr>
+                <w:rFonts w:ascii="Times New Roman" w:hAnsi="Times New Roman" w:cs="Times New Roman"/>
+              </w:rPr>
+              <w:t>Perform a jailbreak attack on a generative AI assistant (controlled test only)</w:t>
+            </w:r>
+          </w:p>
+        </w:tc>
+        <w:tc>
+          <w:tcPr>
+            <w:tcW w:w="941" w:type="dxa"/>
+          </w:tcPr>
+          <w:p>
+            <w:pPr>
+              <w:rPr>
+                <w:rFonts w:ascii="Times New Roman" w:hAnsi="Times New Roman" w:cs="Times New Roman"/>
+              </w:rPr>
+            </w:pPr>
+          </w:p>
+        </w:tc>
+      </w:tr>
+      <w:tr>
+        <w:tc>
+          <w:tcPr>
+            <w:tcW w:w="1165" w:type="dxa"/>
+          </w:tcPr>
+          <w:p>
+            <w:pPr>
+              <w:jc w:val="center"/>
+              <w:rPr>
+                <w:rFonts w:ascii="Times New Roman" w:hAnsi="Times New Roman" w:cs="Times New Roman"/>
+              </w:rPr>
+            </w:pPr>
+            <w:r>
+              <w:rPr>
+                <w:rFonts w:ascii="Times New Roman" w:hAnsi="Times New Roman" w:cs="Times New Roman"/>
+              </w:rPr>
+              <w:t>B14</w:t>
+            </w:r>
+          </w:p>
+        </w:tc>
+        <w:tc>
+          <w:tcPr>
+            <w:tcW w:w="6910" w:type="dxa"/>
+          </w:tcPr>
+          <w:p>
+            <w:pPr>
+              <w:rPr>
+                <w:rFonts w:ascii="Times New Roman" w:hAnsi="Times New Roman" w:cs="Times New Roman"/>
+              </w:rPr>
+            </w:pPr>
+            <w:r>
+              <w:rPr>
+                <w:rFonts w:ascii="Times New Roman" w:hAnsi="Times New Roman" w:cs="Times New Roman"/>
+              </w:rPr>
+              <w:t>Teach your friends about cybersecurity topic of your choice</w:t>
+            </w:r>
+          </w:p>
+        </w:tc>
+        <w:tc>
+          <w:tcPr>
+            <w:tcW w:w="941" w:type="dxa"/>
+          </w:tcPr>
+          <w:p>
+            <w:pPr>
+              <w:rPr>
+                <w:rFonts w:ascii="Times New Roman" w:hAnsi="Times New Roman" w:cs="Times New Roman"/>
+              </w:rPr>
+            </w:pPr>
+          </w:p>
+        </w:tc>
+      </w:tr>
+      <w:tr>
+        <w:tc>
+          <w:tcPr>
+            <w:tcW w:w="1165" w:type="dxa"/>
+          </w:tcPr>
+          <w:p>
+            <w:pPr>
+              <w:jc w:val="center"/>
+              <w:rPr>
+                <w:rFonts w:ascii="Times New Roman" w:hAnsi="Times New Roman" w:cs="Times New Roman"/>
+              </w:rPr>
+            </w:pPr>
+            <w:r>
+              <w:rPr>
+                <w:rFonts w:ascii="Times New Roman" w:hAnsi="Times New Roman" w:cs="Times New Roman"/>
+              </w:rPr>
+              <w:t>B15</w:t>
+            </w:r>
+          </w:p>
+        </w:tc>
+        <w:tc>
+          <w:tcPr>
+            <w:tcW w:w="6910" w:type="dxa"/>
+          </w:tcPr>
+          <w:p>
+            <w:pPr>
+              <w:rPr>
+                <w:rFonts w:ascii="Times New Roman" w:hAnsi="Times New Roman" w:cs="Times New Roman"/>
+              </w:rPr>
+            </w:pPr>
+            <w:r>
+              <w:rPr>
+                <w:rFonts w:ascii="Times New Roman" w:hAnsi="Times New Roman" w:cs="Times New Roman"/>
+              </w:rPr>
+              <w:t>Teach an elderly person about cybersecurity topic of your choice</w:t>
+            </w:r>
+          </w:p>
+        </w:tc>
+        <w:tc>
+          <w:tcPr>
+            <w:tcW w:w="941" w:type="dxa"/>
+          </w:tcPr>
+          <w:p>
+            <w:pPr>
+              <w:rPr>
+                <w:rFonts w:ascii="Times New Roman" w:hAnsi="Times New Roman" w:cs="Times New Roman"/>
+              </w:rPr>
+            </w:pPr>
+          </w:p>
+        </w:tc>
+      </w:tr>
+      <w:tr>
+        <w:tc>
+          <w:tcPr>
+            <w:tcW w:w="1165" w:type="dxa"/>
+          </w:tcPr>
+          <w:p>
+            <w:pPr>
+              <w:jc w:val="center"/>
+              <w:rPr>
+                <w:rFonts w:ascii="Times New Roman" w:hAnsi="Times New Roman" w:cs="Times New Roman"/>
+              </w:rPr>
+            </w:pPr>
+            <w:r>
+              <w:rPr>
+                <w:rFonts w:ascii="Times New Roman" w:hAnsi="Times New Roman" w:cs="Times New Roman"/>
+              </w:rPr>
+              <w:t>B16</w:t>
+            </w:r>
+          </w:p>
+        </w:tc>
+        <w:tc>
+          <w:tcPr>
+            <w:tcW w:w="6910" w:type="dxa"/>
+          </w:tcPr>
+          <w:p>
+            <w:pPr>
+              <w:rPr>
+                <w:rFonts w:ascii="Times New Roman" w:hAnsi="Times New Roman" w:cs="Times New Roman"/>
+              </w:rPr>
+            </w:pPr>
+            <w:r>
+              <w:rPr>
+                <w:rFonts w:ascii="Times New Roman" w:hAnsi="Times New Roman" w:cs="Times New Roman"/>
+              </w:rPr>
+              <w:t>Survey the current state-of-the-art solutions in cybersecurity</w:t>
+            </w:r>
+          </w:p>
+        </w:tc>
+        <w:tc>
+          <w:tcPr>
+            <w:tcW w:w="941" w:type="dxa"/>
+          </w:tcPr>
+          <w:p>
+            <w:pPr>
+              <w:rPr>
+                <w:rFonts w:ascii="Times New Roman" w:hAnsi="Times New Roman" w:cs="Times New Roman"/>
+              </w:rPr>
+            </w:pPr>
+          </w:p>
+        </w:tc>
+      </w:tr>
+      <w:tr>
+        <w:tc>
+          <w:tcPr>
+            <w:tcW w:w="1165" w:type="dxa"/>
+          </w:tcPr>
+          <w:p>
+            <w:pPr>
+              <w:jc w:val="center"/>
+              <w:rPr>
+                <w:rFonts w:ascii="Times New Roman" w:hAnsi="Times New Roman" w:cs="Times New Roman"/>
+              </w:rPr>
+            </w:pPr>
+            <w:r>
+              <w:rPr>
+                <w:rFonts w:ascii="Times New Roman" w:hAnsi="Times New Roman" w:cs="Times New Roman"/>
+              </w:rPr>
+              <w:t>B17</w:t>
+            </w:r>
+          </w:p>
+        </w:tc>
+        <w:tc>
+          <w:tcPr>
+            <w:tcW w:w="6910" w:type="dxa"/>
+          </w:tcPr>
+          <w:p>
+            <w:pPr>
+              <w:rPr>
+                <w:rFonts w:ascii="Times New Roman" w:hAnsi="Times New Roman" w:cs="Times New Roman"/>
+              </w:rPr>
+            </w:pPr>
+            <w:r>
+              <w:rPr>
+                <w:rFonts w:ascii="Times New Roman" w:hAnsi="Times New Roman" w:cs="Times New Roman"/>
+              </w:rPr>
+              <w:t>Implement one of the current state-of-the-art solutions and evaluate it</w:t>
+            </w:r>
+          </w:p>
+        </w:tc>
+        <w:tc>
+          <w:tcPr>
+            <w:tcW w:w="941" w:type="dxa"/>
+          </w:tcPr>
+          <w:p>
+            <w:pPr>
+              <w:rPr>
+                <w:rFonts w:ascii="Times New Roman" w:hAnsi="Times New Roman" w:cs="Times New Roman"/>
+              </w:rPr>
+            </w:pPr>
+          </w:p>
+        </w:tc>
+      </w:tr>
+      <w:tr>
+        <w:tc>
+          <w:tcPr>
+            <w:tcW w:w="1165" w:type="dxa"/>
+          </w:tcPr>
+          <w:p>
+            <w:pPr>
+              <w:jc w:val="center"/>
+              <w:rPr>
+                <w:rFonts w:ascii="Times New Roman" w:hAnsi="Times New Roman" w:cs="Times New Roman"/>
+              </w:rPr>
+            </w:pPr>
+            <w:r>
+              <w:rPr>
+                <w:rFonts w:ascii="Times New Roman" w:hAnsi="Times New Roman" w:cs="Times New Roman"/>
+              </w:rPr>
+              <w:t>B18</w:t>
+            </w:r>
+          </w:p>
+        </w:tc>
+        <w:tc>
+          <w:tcPr>
+            <w:tcW w:w="6910" w:type="dxa"/>
+          </w:tcPr>
+          <w:p>
+            <w:pPr>
+              <w:rPr>
+                <w:rFonts w:ascii="Times New Roman" w:hAnsi="Times New Roman" w:cs="Times New Roman"/>
+              </w:rPr>
+            </w:pPr>
+            <w:r>
+              <w:rPr>
+                <w:rFonts w:ascii="Times New Roman" w:hAnsi="Times New Roman" w:cs="Times New Roman"/>
+              </w:rPr>
+              <w:t>Contribute to an open-source project related to cybersecurity</w:t>
+            </w:r>
+          </w:p>
+        </w:tc>
+        <w:tc>
+          <w:tcPr>
+            <w:tcW w:w="941" w:type="dxa"/>
+          </w:tcPr>
+          <w:p>
+            <w:pPr>
+              <w:rPr>
+                <w:rFonts w:ascii="Times New Roman" w:hAnsi="Times New Roman" w:cs="Times New Roman"/>
+              </w:rPr>
+            </w:pPr>
+          </w:p>
+        </w:tc>
+      </w:tr>
+      <w:tr>
+        <w:tc>
+          <w:tcPr>
+            <w:tcW w:w="1165" w:type="dxa"/>
+          </w:tcPr>
+          <w:p>
+            <w:pPr>
+              <w:jc w:val="center"/>
+              <w:rPr>
+                <w:rFonts w:ascii="Times New Roman" w:hAnsi="Times New Roman" w:cs="Times New Roman"/>
+              </w:rPr>
+            </w:pPr>
+            <w:r>
+              <w:rPr>
+                <w:rFonts w:ascii="Times New Roman" w:hAnsi="Times New Roman" w:cs="Times New Roman"/>
+              </w:rPr>
+              <w:t>B19</w:t>
+            </w:r>
+          </w:p>
+        </w:tc>
+        <w:tc>
+          <w:tcPr>
+            <w:tcW w:w="6910" w:type="dxa"/>
+          </w:tcPr>
+          <w:p>
+            <w:pPr>
+              <w:rPr>
+                <w:rFonts w:ascii="Times New Roman" w:hAnsi="Times New Roman" w:cs="Times New Roman"/>
+              </w:rPr>
+            </w:pPr>
+            <w:r>
+              <w:rPr>
+                <w:rFonts w:ascii="Times New Roman" w:hAnsi="Times New Roman" w:cs="Times New Roman"/>
+              </w:rPr>
+              <w:t>Find and fix a vulnerability from a GitHub project</w:t>
+            </w:r>
+          </w:p>
+        </w:tc>
+        <w:tc>
+          <w:tcPr>
+            <w:tcW w:w="941" w:type="dxa"/>
+          </w:tcPr>
+          <w:p>
+            <w:pPr>
+              <w:rPr>
+                <w:rFonts w:ascii="Times New Roman" w:hAnsi="Times New Roman" w:cs="Times New Roman"/>
+              </w:rPr>
+            </w:pPr>
+          </w:p>
+        </w:tc>
+      </w:tr>
+      <w:tr>
+        <w:tc>
+          <w:tcPr>
+            <w:tcW w:w="1165" w:type="dxa"/>
+          </w:tcPr>
+          <w:p>
+            <w:pPr>
+              <w:jc w:val="center"/>
+              <w:rPr>
+                <w:rFonts w:ascii="Times New Roman" w:hAnsi="Times New Roman" w:cs="Times New Roman"/>
+              </w:rPr>
+            </w:pPr>
+            <w:r>
+              <w:rPr>
+                <w:rFonts w:ascii="Times New Roman" w:hAnsi="Times New Roman" w:cs="Times New Roman"/>
+              </w:rPr>
+              <w:t>B20</w:t>
+            </w:r>
+          </w:p>
+        </w:tc>
+        <w:tc>
+          <w:tcPr>
+            <w:tcW w:w="6910" w:type="dxa"/>
+          </w:tcPr>
+          <w:p>
+            <w:pPr>
+              <w:rPr>
+                <w:rFonts w:ascii="Times New Roman" w:hAnsi="Times New Roman" w:cs="Times New Roman"/>
+              </w:rPr>
+            </w:pPr>
+            <w:r>
+              <w:rPr>
+                <w:rFonts w:ascii="Times New Roman" w:hAnsi="Times New Roman" w:cs="Times New Roman"/>
+              </w:rPr>
+              <w:t>Enhance the security of a GitHub project</w:t>
+            </w:r>
+          </w:p>
+        </w:tc>
+        <w:tc>
+          <w:tcPr>
+            <w:tcW w:w="941" w:type="dxa"/>
+          </w:tcPr>
+          <w:p>
+            <w:pPr>
+              <w:rPr>
+                <w:rFonts w:ascii="Times New Roman" w:hAnsi="Times New Roman" w:cs="Times New Roman"/>
+              </w:rPr>
+            </w:pPr>
+          </w:p>
+        </w:tc>
+      </w:tr>
+      <w:tr>
+        <w:tc>
+          <w:tcPr>
+            <w:tcW w:w="1165" w:type="dxa"/>
+          </w:tcPr>
+          <w:p>
+            <w:pPr>
+              <w:jc w:val="center"/>
+              <w:rPr>
+                <w:rFonts w:ascii="Times New Roman" w:hAnsi="Times New Roman" w:cs="Times New Roman"/>
+              </w:rPr>
+            </w:pPr>
+            <w:r>
+              <w:rPr>
+                <w:rFonts w:ascii="Times New Roman" w:hAnsi="Times New Roman" w:cs="Times New Roman"/>
+              </w:rPr>
+              <w:t>B21</w:t>
+            </w:r>
+          </w:p>
+        </w:tc>
+        <w:tc>
+          <w:tcPr>
+            <w:tcW w:w="6910" w:type="dxa"/>
+          </w:tcPr>
+          <w:p>
+            <w:pPr>
+              <w:rPr>
+                <w:rFonts w:ascii="Times New Roman" w:hAnsi="Times New Roman" w:cs="Times New Roman"/>
+              </w:rPr>
+            </w:pPr>
+            <w:r>
+              <w:rPr>
+                <w:rFonts w:ascii="Times New Roman" w:hAnsi="Times New Roman" w:cs="Times New Roman"/>
+              </w:rPr>
+              <w:t>Design and implement a cybersecurity learning activity</w:t>
+            </w:r>
+          </w:p>
+        </w:tc>
+        <w:tc>
+          <w:tcPr>
+            <w:tcW w:w="941" w:type="dxa"/>
+          </w:tcPr>
+          <w:p>
+            <w:pPr>
+              <w:rPr>
+                <w:rFonts w:ascii="Times New Roman" w:hAnsi="Times New Roman" w:cs="Times New Roman"/>
+              </w:rPr>
+            </w:pPr>
+          </w:p>
+        </w:tc>
+      </w:tr>
+      <w:tr>
+        <w:tc>
+          <w:tcPr>
+            <w:tcW w:w="1165" w:type="dxa"/>
+          </w:tcPr>
+          <w:p>
+            <w:pPr>
+              <w:jc w:val="center"/>
+              <w:rPr>
+                <w:rFonts w:ascii="Times New Roman" w:hAnsi="Times New Roman" w:cs="Times New Roman"/>
+              </w:rPr>
+            </w:pPr>
+            <w:r>
+              <w:rPr>
+                <w:rFonts w:ascii="Times New Roman" w:hAnsi="Times New Roman" w:cs="Times New Roman"/>
+              </w:rPr>
+              <w:t>B22</w:t>
+            </w:r>
+          </w:p>
+        </w:tc>
+        <w:tc>
+          <w:tcPr>
+            <w:tcW w:w="6910" w:type="dxa"/>
+          </w:tcPr>
+          <w:p>
+            <w:pPr>
+              <w:rPr>
+                <w:rFonts w:ascii="Times New Roman" w:hAnsi="Times New Roman" w:cs="Times New Roman"/>
+              </w:rPr>
+            </w:pPr>
+            <w:r>
+              <w:rPr>
+                <w:rFonts w:ascii="Times New Roman" w:hAnsi="Times New Roman" w:cs="Times New Roman"/>
+              </w:rPr>
+              <w:t>Enhance the cybersecurity of a website from your community</w:t>
+            </w:r>
+          </w:p>
+        </w:tc>
+        <w:tc>
+          <w:tcPr>
+            <w:tcW w:w="941" w:type="dxa"/>
+          </w:tcPr>
+          <w:p>
+            <w:pPr>
+              <w:rPr>
+                <w:rFonts w:ascii="Times New Roman" w:hAnsi="Times New Roman" w:cs="Times New Roman"/>
+              </w:rPr>
+            </w:pPr>
+          </w:p>
+        </w:tc>
+      </w:tr>
+      <w:tr>
+        <w:tc>
+          <w:tcPr>
+            <w:tcW w:w="1165" w:type="dxa"/>
+          </w:tcPr>
+          <w:p>
+            <w:pPr>
+              <w:jc w:val="center"/>
+              <w:rPr>
+                <w:rFonts w:ascii="Times New Roman" w:hAnsi="Times New Roman" w:cs="Times New Roman"/>
+              </w:rPr>
+            </w:pPr>
+            <w:r>
+              <w:rPr>
+                <w:rFonts w:ascii="Times New Roman" w:hAnsi="Times New Roman" w:cs="Times New Roman"/>
+              </w:rPr>
+              <w:t>B23</w:t>
+            </w:r>
+          </w:p>
+        </w:tc>
+        <w:tc>
+          <w:tcPr>
+            <w:tcW w:w="6910" w:type="dxa"/>
+          </w:tcPr>
+          <w:p>
+            <w:pPr>
+              <w:rPr>
+                <w:rFonts w:ascii="Times New Roman" w:hAnsi="Times New Roman" w:cs="Times New Roman"/>
+              </w:rPr>
+            </w:pPr>
+            <w:r>
+              <w:rPr>
+                <w:rFonts w:ascii="Times New Roman" w:hAnsi="Times New Roman" w:cs="Times New Roman"/>
+              </w:rPr>
+              <w:t>Test an intrusion detection system and discuss its effectiveness</w:t>
+            </w:r>
+          </w:p>
+        </w:tc>
+        <w:tc>
+          <w:tcPr>
+            <w:tcW w:w="941" w:type="dxa"/>
+          </w:tcPr>
+          <w:p>
+            <w:pPr>
+              <w:rPr>
+                <w:rFonts w:ascii="Times New Roman" w:hAnsi="Times New Roman" w:cs="Times New Roman"/>
+              </w:rPr>
+            </w:pPr>
+          </w:p>
+        </w:tc>
+      </w:tr>
+      <w:tr>
+        <w:tc>
+          <w:tcPr>
+            <w:tcW w:w="1165" w:type="dxa"/>
+          </w:tcPr>
+          <w:p>
+            <w:pPr>
+              <w:jc w:val="center"/>
+              <w:rPr>
+                <w:rFonts w:ascii="Times New Roman" w:hAnsi="Times New Roman" w:cs="Times New Roman"/>
+              </w:rPr>
+            </w:pPr>
+            <w:r>
+              <w:rPr>
+                <w:rFonts w:ascii="Times New Roman" w:hAnsi="Times New Roman" w:cs="Times New Roman"/>
+              </w:rPr>
+              <w:t>B24</w:t>
+            </w:r>
+          </w:p>
+        </w:tc>
+        <w:tc>
+          <w:tcPr>
+            <w:tcW w:w="6910" w:type="dxa"/>
+          </w:tcPr>
+          <w:p>
+            <w:pPr>
+              <w:rPr>
+                <w:rFonts w:ascii="Times New Roman" w:hAnsi="Times New Roman" w:cs="Times New Roman"/>
+              </w:rPr>
+            </w:pPr>
+            <w:r>
+              <w:rPr>
+                <w:rFonts w:ascii="Times New Roman" w:hAnsi="Times New Roman" w:cs="Times New Roman"/>
+              </w:rPr>
+              <w:t>Design and implement access control of your choice</w:t>
+            </w:r>
+          </w:p>
+        </w:tc>
+        <w:tc>
+          <w:tcPr>
+            <w:tcW w:w="941" w:type="dxa"/>
+          </w:tcPr>
+          <w:p>
+            <w:pPr>
+              <w:rPr>
+                <w:rFonts w:ascii="Times New Roman" w:hAnsi="Times New Roman" w:cs="Times New Roman"/>
+              </w:rPr>
+            </w:pPr>
+          </w:p>
+        </w:tc>
+      </w:tr>
+      <w:tr>
+        <w:tc>
+          <w:tcPr>
+            <w:tcW w:w="1165" w:type="dxa"/>
+          </w:tcPr>
+          <w:p>
+            <w:pPr>
+              <w:jc w:val="center"/>
+              <w:rPr>
+                <w:rFonts w:ascii="Times New Roman" w:hAnsi="Times New Roman" w:cs="Times New Roman"/>
+              </w:rPr>
+            </w:pPr>
+            <w:r>
+              <w:rPr>
+                <w:rFonts w:ascii="Times New Roman" w:hAnsi="Times New Roman" w:cs="Times New Roman"/>
+              </w:rPr>
+              <w:t>B25</w:t>
+            </w:r>
+          </w:p>
+        </w:tc>
+        <w:tc>
+          <w:tcPr>
+            <w:tcW w:w="6910" w:type="dxa"/>
+          </w:tcPr>
+          <w:p>
+            <w:pPr>
+              <w:rPr>
+                <w:rFonts w:ascii="Times New Roman" w:hAnsi="Times New Roman" w:cs="Times New Roman"/>
+              </w:rPr>
+            </w:pPr>
+            <w:r>
+              <w:rPr>
+                <w:rFonts w:ascii="Times New Roman" w:hAnsi="Times New Roman" w:cs="Times New Roman"/>
+              </w:rPr>
+              <w:t>Design and implement a threat intelligence module of your choice</w:t>
+            </w:r>
+          </w:p>
+        </w:tc>
+        <w:tc>
+          <w:tcPr>
+            <w:tcW w:w="941" w:type="dxa"/>
+          </w:tcPr>
+          <w:p>
+            <w:pPr>
+              <w:rPr>
+                <w:rFonts w:ascii="Times New Roman" w:hAnsi="Times New Roman" w:cs="Times New Roman"/>
+              </w:rPr>
+            </w:pPr>
+          </w:p>
+        </w:tc>
+      </w:tr>
+      <w:tr>
+        <w:tc>
+          <w:tcPr>
+            <w:tcW w:w="1165" w:type="dxa"/>
+          </w:tcPr>
+          <w:p>
+            <w:pPr>
+              <w:jc w:val="center"/>
+              <w:rPr>
+                <w:rFonts w:ascii="Times New Roman" w:hAnsi="Times New Roman" w:cs="Times New Roman"/>
+              </w:rPr>
+            </w:pPr>
+            <w:r>
+              <w:rPr>
+                <w:rFonts w:ascii="Times New Roman" w:hAnsi="Times New Roman" w:cs="Times New Roman"/>
+              </w:rPr>
+              <w:t>B26</w:t>
+            </w:r>
+          </w:p>
+        </w:tc>
+        <w:tc>
+          <w:tcPr>
+            <w:tcW w:w="6910" w:type="dxa"/>
+          </w:tcPr>
+          <w:p>
+            <w:pPr>
+              <w:rPr>
+                <w:rFonts w:ascii="Times New Roman" w:hAnsi="Times New Roman" w:cs="Times New Roman"/>
+              </w:rPr>
+            </w:pPr>
+            <w:r>
+              <w:rPr>
+                <w:rFonts w:ascii="Times New Roman" w:hAnsi="Times New Roman" w:cs="Times New Roman"/>
+              </w:rPr>
+              <w:t>Help another student in this unit struggling to understand/learn a cybersecurity concept</w:t>
+            </w:r>
+          </w:p>
+        </w:tc>
+        <w:tc>
+          <w:tcPr>
+            <w:tcW w:w="941" w:type="dxa"/>
+          </w:tcPr>
+          <w:p>
+            <w:pPr>
+              <w:rPr>
+                <w:rFonts w:ascii="Times New Roman" w:hAnsi="Times New Roman" w:cs="Times New Roman"/>
+              </w:rPr>
+            </w:pPr>
+          </w:p>
+        </w:tc>
+      </w:tr>
+      <w:tr>
+        <w:tc>
+          <w:tcPr>
+            <w:tcW w:w="1165" w:type="dxa"/>
+          </w:tcPr>
+          <w:p>
+            <w:pPr>
+              <w:jc w:val="center"/>
+              <w:rPr>
+                <w:rFonts w:ascii="Times New Roman" w:hAnsi="Times New Roman" w:cs="Times New Roman"/>
+              </w:rPr>
+            </w:pPr>
+            <w:r>
+              <w:rPr>
+                <w:rFonts w:ascii="Times New Roman" w:hAnsi="Times New Roman" w:cs="Times New Roman"/>
+              </w:rPr>
+              <w:t>B27</w:t>
+            </w:r>
+          </w:p>
+        </w:tc>
+        <w:tc>
+          <w:tcPr>
+            <w:tcW w:w="6910" w:type="dxa"/>
+          </w:tcPr>
+          <w:p>
+            <w:pPr>
+              <w:rPr>
+                <w:rFonts w:ascii="Times New Roman" w:hAnsi="Times New Roman" w:cs="Times New Roman"/>
+              </w:rPr>
+            </w:pPr>
+            <w:r>
+              <w:rPr>
+                <w:rFonts w:ascii="Times New Roman" w:hAnsi="Times New Roman" w:cs="Times New Roman"/>
+              </w:rPr>
+              <w:t>Apply a learned concept in this unit to a real-world application/problem/environment</w:t>
+            </w:r>
+          </w:p>
+        </w:tc>
+        <w:tc>
+          <w:tcPr>
+            <w:tcW w:w="941" w:type="dxa"/>
+          </w:tcPr>
+          <w:p>
+            <w:pPr>
+              <w:rPr>
+                <w:rFonts w:ascii="Times New Roman" w:hAnsi="Times New Roman" w:cs="Times New Roman"/>
+              </w:rPr>
+            </w:pPr>
+          </w:p>
+        </w:tc>
+      </w:tr>
+      <w:tr>
+        <w:tc>
+          <w:tcPr>
+            <w:tcW w:w="1165" w:type="dxa"/>
+          </w:tcPr>
+          <w:p>
+            <w:pPr>
+              <w:jc w:val="center"/>
+              <w:rPr>
+                <w:rFonts w:ascii="Times New Roman" w:hAnsi="Times New Roman" w:cs="Times New Roman"/>
+              </w:rPr>
+            </w:pPr>
+            <w:r>
+              <w:rPr>
+                <w:rFonts w:ascii="Times New Roman" w:hAnsi="Times New Roman" w:cs="Times New Roman"/>
+              </w:rPr>
+              <w:t>B28</w:t>
+            </w:r>
+          </w:p>
+        </w:tc>
+        <w:tc>
+          <w:tcPr>
+            <w:tcW w:w="6910" w:type="dxa"/>
+          </w:tcPr>
+          <w:p>
+            <w:pPr>
+              <w:rPr>
+                <w:rFonts w:ascii="Times New Roman" w:hAnsi="Times New Roman" w:cs="Times New Roman"/>
+              </w:rPr>
+            </w:pPr>
+            <w:r>
+              <w:rPr>
+                <w:rFonts w:ascii="Times New Roman" w:hAnsi="Times New Roman" w:cs="Times New Roman"/>
+              </w:rPr>
+              <w:t>Produce a cyber safety flyer for (choose 1): elders, high school students, CEOs, Uni students</w:t>
+            </w:r>
+          </w:p>
+        </w:tc>
+        <w:tc>
+          <w:tcPr>
+            <w:tcW w:w="941" w:type="dxa"/>
+          </w:tcPr>
+          <w:p>
+            <w:pPr>
+              <w:rPr>
+                <w:rFonts w:ascii="Times New Roman" w:hAnsi="Times New Roman" w:cs="Times New Roman"/>
+              </w:rPr>
+            </w:pPr>
+          </w:p>
+        </w:tc>
+      </w:tr>
+      <w:tr>
+        <w:tc>
+          <w:tcPr>
+            <w:tcW w:w="1165" w:type="dxa"/>
+          </w:tcPr>
+          <w:p>
+            <w:pPr>
+              <w:jc w:val="center"/>
+              <w:rPr>
+                <w:rFonts w:ascii="Times New Roman" w:hAnsi="Times New Roman" w:cs="Times New Roman"/>
+              </w:rPr>
+            </w:pPr>
+            <w:r>
+              <w:rPr>
+                <w:rFonts w:ascii="Times New Roman" w:hAnsi="Times New Roman" w:cs="Times New Roman"/>
+              </w:rPr>
+              <w:t>B29</w:t>
+            </w:r>
+          </w:p>
+        </w:tc>
+        <w:tc>
+          <w:tcPr>
+            <w:tcW w:w="6910" w:type="dxa"/>
+          </w:tcPr>
+          <w:p>
+            <w:pPr>
+              <w:rPr>
+                <w:rFonts w:ascii="Times New Roman" w:hAnsi="Times New Roman" w:cs="Times New Roman"/>
+              </w:rPr>
+            </w:pPr>
+            <w:r>
+              <w:rPr>
+                <w:rFonts w:ascii="Times New Roman" w:hAnsi="Times New Roman" w:cs="Times New Roman"/>
+              </w:rPr>
+              <w:t>Find a CVE in this year and fix it using three different generative AI systems (e</w:t>
+            </w:r>
+            <w:r>
+              <w:rPr>
+                <w:rFonts w:ascii="Times New Roman" w:hAnsi="Times New Roman" w:cs="Times New Roman"/>
+              </w:rPr>
+              <w:t>.g.</w:t>
+            </w:r>
+            <w:r>
+              <w:rPr>
+                <w:rFonts w:ascii="Times New Roman" w:hAnsi="Times New Roman" w:cs="Times New Roman"/>
+              </w:rPr>
+              <w:t xml:space="preserve"> ChatGPT, Gemini), comparing the consistency</w:t>
+            </w:r>
+          </w:p>
+        </w:tc>
+        <w:tc>
+          <w:tcPr>
+            <w:tcW w:w="941" w:type="dxa"/>
+          </w:tcPr>
+          <w:p>
+            <w:pPr>
+              <w:rPr>
+                <w:rFonts w:ascii="Times New Roman" w:hAnsi="Times New Roman" w:cs="Times New Roman"/>
+              </w:rPr>
+            </w:pPr>
+          </w:p>
+        </w:tc>
+      </w:tr>
+      <w:tr>
+        <w:tc>
+          <w:tcPr>
+            <w:tcW w:w="1165" w:type="dxa"/>
+          </w:tcPr>
+          <w:p>
+            <w:pPr>
+              <w:jc w:val="center"/>
+              <w:rPr>
+                <w:rFonts w:ascii="Times New Roman" w:hAnsi="Times New Roman" w:cs="Times New Roman"/>
+              </w:rPr>
+            </w:pPr>
+            <w:r>
+              <w:rPr>
+                <w:rFonts w:ascii="Times New Roman" w:hAnsi="Times New Roman" w:cs="Times New Roman"/>
+              </w:rPr>
+              <w:t>B30</w:t>
+            </w:r>
+          </w:p>
+        </w:tc>
+        <w:tc>
+          <w:tcPr>
+            <w:tcW w:w="6910" w:type="dxa"/>
+          </w:tcPr>
+          <w:p>
+            <w:pPr>
+              <w:rPr>
+                <w:rFonts w:ascii="Times New Roman" w:hAnsi="Times New Roman" w:cs="Times New Roman"/>
+              </w:rPr>
+            </w:pPr>
+            <w:r>
+              <w:rPr>
+                <w:rFonts w:ascii="Times New Roman" w:hAnsi="Times New Roman" w:cs="Times New Roman"/>
+              </w:rPr>
+              <w:t>Generate an AI-created image, applying an imperceptible watermark on it and then perform an image-to-image regeneration or editing process to make sure the watermark is detectable---the watermark survives</w:t>
+            </w:r>
+          </w:p>
+        </w:tc>
+        <w:tc>
+          <w:tcPr>
+            <w:tcW w:w="941" w:type="dxa"/>
+          </w:tcPr>
+          <w:p>
+            <w:pPr>
+              <w:rPr>
+                <w:rFonts w:ascii="Times New Roman" w:hAnsi="Times New Roman" w:cs="Times New Roman"/>
+              </w:rPr>
+            </w:pPr>
+          </w:p>
+        </w:tc>
+      </w:tr>
+    </w:tbl>
+    <w:p>
+      <w:pPr>
         <w:rPr>
           <w:rFonts w:ascii="Times New Roman" w:hAnsi="Times New Roman" w:cs="Times New Roman"/>
           <w:b/>
@@ -71,9 +2044,10 @@
           <w:sz w:val="40"/>
           <w:szCs w:val="40"/>
         </w:rPr>
-        <w:t>D</w:t>
-      </w:r>
-      <w:r>
+      </w:pPr>
+    </w:p>
+    <w:p>
+      <w:pPr>
         <w:rPr>
           <w:rFonts w:ascii="Times New Roman" w:hAnsi="Times New Roman" w:cs="Times New Roman"/>
           <w:b/>
@@ -81,8 +2055,7 @@
           <w:sz w:val="40"/>
           <w:szCs w:val="40"/>
         </w:rPr>
-        <w:t xml:space="preserve">ue end of </w:t>
-      </w:r>
+      </w:pPr>
       <w:r>
         <w:rPr>
           <w:rFonts w:ascii="Times New Roman" w:hAnsi="Times New Roman" w:cs="Times New Roman"/>
@@ -91,7 +2064,8 @@
           <w:sz w:val="40"/>
           <w:szCs w:val="40"/>
         </w:rPr>
-        <w:t>W</w:t>
+        <w:lastRenderedPageBreak/>
+        <w:t xml:space="preserve">Part 2 </w:t>
       </w:r>
       <w:r>
         <w:rPr>
@@ -101,114 +2075,185 @@
           <w:sz w:val="40"/>
           <w:szCs w:val="40"/>
         </w:rPr>
-        <w:t>eek 12, Friday 11.59pm AWST).</w:t>
-      </w:r>
-    </w:p>
-    <w:p>
-      <w:pPr>
-        <w:rPr>
-          <w:rFonts w:ascii="Times New Roman" w:hAnsi="Times New Roman" w:cs="Times New Roman"/>
-        </w:rPr>
-      </w:pPr>
-      <w:r>
-        <w:rPr>
-          <w:rFonts w:ascii="Times New Roman" w:hAnsi="Times New Roman" w:cs="Times New Roman"/>
-        </w:rPr>
-        <w:t xml:space="preserve">Done counter: </w:t>
-      </w:r>
-      <w:r>
-        <w:rPr>
-          <w:rFonts w:ascii="Times New Roman" w:hAnsi="Times New Roman" w:cs="Times New Roman"/>
-        </w:rPr>
-        <w:t>2</w:t>
-      </w:r>
-      <w:r>
-        <w:rPr>
-          <w:rFonts w:ascii="Times New Roman" w:hAnsi="Times New Roman" w:cs="Times New Roman"/>
-        </w:rPr>
-        <w:t>/25</w:t>
-      </w:r>
-    </w:p>
-    <w:p>
-      <w:pPr>
-        <w:rPr>
-          <w:rFonts w:ascii="Times New Roman" w:hAnsi="Times New Roman" w:cs="Times New Roman"/>
-        </w:rPr>
-      </w:pPr>
-      <w:r>
-        <w:rPr>
-          <w:rFonts w:ascii="Times New Roman" w:hAnsi="Times New Roman" w:cs="Times New Roman"/>
-        </w:rPr>
-        <w:t>Choose any 25 activities from the following list to complete and submit.</w:t>
-      </w:r>
-    </w:p>
-    <w:p>
-      <w:pPr>
-        <w:rPr>
-          <w:rFonts w:ascii="Times New Roman" w:hAnsi="Times New Roman" w:cs="Times New Roman"/>
-        </w:rPr>
-      </w:pPr>
-    </w:p>
-    <w:p>
-      <w:pPr>
-        <w:rPr>
-          <w:rFonts w:ascii="Times New Roman" w:hAnsi="Times New Roman" w:cs="Times New Roman"/>
-        </w:rPr>
-      </w:pPr>
-      <w:r>
-        <w:rPr>
-          <w:rFonts w:ascii="Times New Roman" w:hAnsi="Times New Roman" w:cs="Times New Roman"/>
-        </w:rPr>
-        <w:t>B1. Discover 5 unique weak/vulnerable security implementations.</w:t>
-      </w:r>
-    </w:p>
-    <w:p>
-      <w:pPr>
-        <w:rPr>
-          <w:rFonts w:ascii="Times New Roman" w:hAnsi="Times New Roman" w:cs="Times New Roman"/>
-        </w:rPr>
-      </w:pPr>
-      <w:r>
-        <w:rPr>
-          <w:rFonts w:ascii="Times New Roman" w:hAnsi="Times New Roman" w:cs="Times New Roman"/>
-        </w:rPr>
-        <w:t>B2. Discover 5 unique strong security implementations.</w:t>
-      </w:r>
-    </w:p>
-    <w:p>
-      <w:pPr>
-        <w:rPr>
-          <w:rFonts w:ascii="Times New Roman" w:hAnsi="Times New Roman" w:cs="Times New Roman"/>
-        </w:rPr>
-      </w:pPr>
-      <w:r>
-        <w:rPr>
-          <w:rFonts w:ascii="Times New Roman" w:hAnsi="Times New Roman" w:cs="Times New Roman"/>
-        </w:rPr>
-        <w:t>B3. Discover 3 proactive security implementations in practice.</w:t>
-      </w:r>
-    </w:p>
-    <w:p>
-      <w:pPr>
+        <w:t>A</w:t>
+      </w:r>
+      <w:r>
         <w:rPr>
           <w:rFonts w:ascii="Times New Roman" w:hAnsi="Times New Roman" w:cs="Times New Roman"/>
           <w:b/>
           <w:bCs/>
-        </w:rPr>
-      </w:pPr>
-      <w:r>
+          <w:sz w:val="40"/>
+          <w:szCs w:val="40"/>
+        </w:rPr>
+        <w:t xml:space="preserve">ctivities </w:t>
+      </w:r>
+    </w:p>
+    <w:p>
+      <w:pPr>
         <w:rPr>
           <w:rFonts w:ascii="Times New Roman" w:hAnsi="Times New Roman" w:cs="Times New Roman"/>
           <w:b/>
           <w:bCs/>
-        </w:rPr>
-        <w:t xml:space="preserve">B4. </w:t>
-      </w:r>
+          <w:sz w:val="40"/>
+          <w:szCs w:val="40"/>
+        </w:rPr>
+      </w:pPr>
       <w:r>
         <w:rPr>
           <w:rFonts w:ascii="Times New Roman" w:hAnsi="Times New Roman" w:cs="Times New Roman"/>
           <w:b/>
           <w:bCs/>
+          <w:sz w:val="40"/>
+          <w:szCs w:val="40"/>
+        </w:rPr>
+        <w:t>(</w:t>
+      </w:r>
+      <w:r>
+        <w:rPr>
+          <w:rFonts w:ascii="Times New Roman" w:hAnsi="Times New Roman" w:cs="Times New Roman"/>
+          <w:b/>
+          <w:bCs/>
+          <w:sz w:val="40"/>
+          <w:szCs w:val="40"/>
+        </w:rPr>
+        <w:t>D</w:t>
+      </w:r>
+      <w:r>
+        <w:rPr>
+          <w:rFonts w:ascii="Times New Roman" w:hAnsi="Times New Roman" w:cs="Times New Roman"/>
+          <w:b/>
+          <w:bCs/>
+          <w:sz w:val="40"/>
+          <w:szCs w:val="40"/>
+        </w:rPr>
+        <w:t xml:space="preserve">ue end of </w:t>
+      </w:r>
+      <w:r>
+        <w:rPr>
+          <w:rFonts w:ascii="Times New Roman" w:hAnsi="Times New Roman" w:cs="Times New Roman"/>
+          <w:b/>
+          <w:bCs/>
+          <w:sz w:val="40"/>
+          <w:szCs w:val="40"/>
+        </w:rPr>
+        <w:t>W</w:t>
+      </w:r>
+      <w:r>
+        <w:rPr>
+          <w:rFonts w:ascii="Times New Roman" w:hAnsi="Times New Roman" w:cs="Times New Roman"/>
+          <w:b/>
+          <w:bCs/>
+          <w:sz w:val="40"/>
+          <w:szCs w:val="40"/>
+        </w:rPr>
+        <w:t>eek 12, Friday 11.59pm AWST).</w:t>
+      </w:r>
+    </w:p>
+    <w:p>
+      <w:pPr>
+        <w:rPr>
+          <w:rFonts w:ascii="Times New Roman" w:hAnsi="Times New Roman" w:cs="Times New Roman"/>
+        </w:rPr>
+      </w:pPr>
+      <w:r>
+        <w:rPr>
+          <w:rFonts w:ascii="Times New Roman" w:hAnsi="Times New Roman" w:cs="Times New Roman"/>
+        </w:rPr>
+        <w:t xml:space="preserve">Done counter: </w:t>
+      </w:r>
+      <w:r>
+        <w:rPr>
+          <w:rFonts w:ascii="Times New Roman" w:hAnsi="Times New Roman" w:cs="Times New Roman"/>
+        </w:rPr>
+        <w:t>2</w:t>
+      </w:r>
+      <w:r>
+        <w:rPr>
+          <w:rFonts w:ascii="Times New Roman" w:hAnsi="Times New Roman" w:cs="Times New Roman"/>
+        </w:rPr>
+        <w:t>/25</w:t>
+      </w:r>
+    </w:p>
+    <w:p>
+      <w:pPr>
+        <w:rPr>
+          <w:rFonts w:ascii="Times New Roman" w:hAnsi="Times New Roman" w:cs="Times New Roman"/>
+        </w:rPr>
+      </w:pPr>
+      <w:r>
+        <w:rPr>
+          <w:rFonts w:ascii="Times New Roman" w:hAnsi="Times New Roman" w:cs="Times New Roman"/>
+        </w:rPr>
+        <w:t>Choose any 25 activities from the following list to complete and submit.</w:t>
+      </w:r>
+    </w:p>
+    <w:p>
+      <w:pPr>
+        <w:rPr>
+          <w:rFonts w:ascii="Times New Roman" w:hAnsi="Times New Roman" w:cs="Times New Roman"/>
+        </w:rPr>
+      </w:pPr>
+    </w:p>
+    <w:p>
+      <w:pPr>
+        <w:rPr>
+          <w:rFonts w:ascii="Times New Roman" w:hAnsi="Times New Roman" w:cs="Times New Roman"/>
+        </w:rPr>
+      </w:pPr>
+      <w:r>
+        <w:rPr>
+          <w:rFonts w:ascii="Times New Roman" w:hAnsi="Times New Roman" w:cs="Times New Roman"/>
+        </w:rPr>
+        <w:t>B1. Discover 5 unique weak/vulnerable security implementations.</w:t>
+      </w:r>
+    </w:p>
+    <w:p>
+      <w:pPr>
+        <w:rPr>
+          <w:rFonts w:ascii="Times New Roman" w:hAnsi="Times New Roman" w:cs="Times New Roman"/>
+        </w:rPr>
+      </w:pPr>
+      <w:r>
+        <w:rPr>
+          <w:rFonts w:ascii="Times New Roman" w:hAnsi="Times New Roman" w:cs="Times New Roman"/>
+        </w:rPr>
+        <w:t>B2. Discover 5 unique strong security implementations.</w:t>
+      </w:r>
+    </w:p>
+    <w:p>
+      <w:pPr>
+        <w:rPr>
+          <w:rFonts w:ascii="Times New Roman" w:hAnsi="Times New Roman" w:cs="Times New Roman"/>
+        </w:rPr>
+      </w:pPr>
+      <w:r>
+        <w:rPr>
+          <w:rFonts w:ascii="Times New Roman" w:hAnsi="Times New Roman" w:cs="Times New Roman"/>
+        </w:rPr>
+        <w:t>B3. Discover 3 proactive security implementations in practice.</w:t>
+      </w:r>
+    </w:p>
+    <w:p>
+      <w:pPr>
+        <w:rPr>
+          <w:rFonts w:ascii="Times New Roman" w:hAnsi="Times New Roman" w:cs="Times New Roman"/>
+          <w:b/>
+          <w:bCs/>
+        </w:rPr>
+      </w:pPr>
+      <w:r>
+        <w:rPr>
+          <w:rFonts w:ascii="Times New Roman" w:hAnsi="Times New Roman" w:cs="Times New Roman"/>
+          <w:b/>
+          <w:bCs/>
+        </w:rPr>
+        <w:t xml:space="preserve">B4. </w:t>
+      </w:r>
+      <w:r>
+        <w:rPr>
+          <w:rFonts w:ascii="Times New Roman" w:hAnsi="Times New Roman" w:cs="Times New Roman"/>
+          <w:b/>
+          <w:bCs/>
         </w:rPr>
         <w:t>Participate in 3 in-class activities in labs (facilitators will administer such activities).</w:t>
       </w:r>
@@ -356,8 +2401,16 @@
       <w:pPr>
         <w:rPr>
           <w:rFonts w:ascii="Times New Roman" w:hAnsi="Times New Roman" w:cs="Times New Roman"/>
-        </w:rPr>
-      </w:pPr>
+          <w:u w:val="single"/>
+        </w:rPr>
+      </w:pPr>
+      <w:r>
+        <w:rPr>
+          <w:rFonts w:ascii="Times New Roman" w:hAnsi="Times New Roman" w:cs="Times New Roman"/>
+          <w:u w:val="single"/>
+        </w:rPr>
+        <w:t>In-Class Lab Activity 2 (Monday, 9 March 2026)</w:t>
+      </w:r>
     </w:p>
     <w:p>
       <w:pPr>
@@ -428,11 +2481,13 @@
       <w:pPr>
         <w:rPr>
           <w:rFonts w:ascii="Times New Roman" w:hAnsi="Times New Roman" w:cs="Times New Roman"/>
-        </w:rPr>
-      </w:pPr>
-      <w:r>
-        <w:rPr>
-          <w:rFonts w:ascii="Times New Roman" w:hAnsi="Times New Roman" w:cs="Times New Roman"/>
+          <w:strike/>
+        </w:rPr>
+      </w:pPr>
+      <w:r>
+        <w:rPr>
+          <w:rFonts w:ascii="Times New Roman" w:hAnsi="Times New Roman" w:cs="Times New Roman"/>
+          <w:strike/>
         </w:rPr>
         <w:t>B10. Participate in a cybersecurity activity as part of job/internship/volunteering etc.</w:t>
       </w:r>
@@ -492,6 +2547,24 @@
     </w:p>
     <w:p>
       <w:pPr>
+        <w:pStyle w:val="ListParagraph"/>
+        <w:numPr>
+          <w:ilvl w:val="0"/>
+          <w:numId w:val="3"/>
+        </w:numPr>
+        <w:rPr>
+          <w:rFonts w:ascii="Times New Roman" w:hAnsi="Times New Roman" w:cs="Times New Roman"/>
+        </w:rPr>
+      </w:pPr>
+      <w:r>
+        <w:rPr>
+          <w:rFonts w:ascii="Times New Roman" w:hAnsi="Times New Roman" w:cs="Times New Roman"/>
+        </w:rPr>
+        <w:t>Taught MCP during lab</w:t>
+      </w:r>
+    </w:p>
+    <w:p>
+      <w:pPr>
         <w:rPr>
           <w:rFonts w:ascii="Times New Roman" w:hAnsi="Times New Roman" w:cs="Times New Roman"/>
         </w:rPr>
@@ -659,6 +2732,7 @@
       <w:r>
         <w:rPr>
           <w:rFonts w:ascii="Times New Roman" w:hAnsi="Times New Roman" w:cs="Times New Roman"/>
+          <w:noProof/>
         </w:rPr>
         <w:drawing>
           <wp:inline distT="0" distB="0" distL="0" distR="0" wp14:anchorId="7C65F98A" wp14:editId="735A432A">
@@ -676,7 +2750,7 @@
                     <pic:cNvPicPr/>
                   </pic:nvPicPr>
                   <pic:blipFill>
-                    <a:blip r:embed="rId5"/>
+                    <a:blip r:embed="rId6"/>
                     <a:stretch>
                       <a:fillRect/>
                     </a:stretch>
@@ -743,20 +2817,20 @@
         <w:rPr>
           <w:rFonts w:ascii="Times New Roman" w:hAnsi="Times New Roman" w:cs="Times New Roman"/>
         </w:rPr>
-        <w:t>One-way property means that it is easy to get the hash of the message (forward direction), but it is very difficult/computationally infeasible to do the inverse, i.e. figure out the message from its hash.</w:t>
-      </w:r>
-      <w:r>
-        <w:rPr>
-          <w:rFonts w:ascii="Times New Roman" w:hAnsi="Times New Roman" w:cs="Times New Roman"/>
-        </w:rPr>
-        <w:t xml:space="preserve"> Thus, even if two messages have the same hash </w:t>
+        <w:t xml:space="preserve">One-way property means that it is easy to get the hash of the message (forward direction), but it is very difficult/computationally infeasible to do the inverse, i.e. </w:t>
       </w:r>
       <w:r>
         <w:rPr>
           <w:rFonts w:ascii="Times New Roman" w:hAnsi="Times New Roman" w:cs="Times New Roman"/>
         </w:rPr>
         <w:lastRenderedPageBreak/>
-        <w:t>value, it is very difficult to find what the messages are that gave those same hash results.</w:t>
+        <w:t>figure out the message from its hash.</w:t>
+      </w:r>
+      <w:r>
+        <w:rPr>
+          <w:rFonts w:ascii="Times New Roman" w:hAnsi="Times New Roman" w:cs="Times New Roman"/>
+        </w:rPr>
+        <w:t xml:space="preserve"> Thus, even if two messages have the same hash value, it is very difficult to find what the messages are that gave those same hash results.</w:t>
       </w:r>
     </w:p>
     <w:p>
@@ -866,10 +2940,10 @@
 <file path=word/numbering.xml><?xml version="1.0" encoding="utf-8"?>
 <w:numbering xmlns:wpc="http://schemas.microsoft.com/office/word/2010/wordprocessingCanvas" xmlns:cx="http://schemas.microsoft.com/office/drawing/2014/chartex" xmlns:cx1="http://schemas.microsoft.com/office/drawing/2015/9/8/chartex" xmlns:cx2="http://schemas.microsoft.com/office/drawing/2015/10/21/chartex" xmlns:cx3="http://schemas.microsoft.com/office/drawing/2016/5/9/chartex" xmlns:cx4="http://schemas.microsoft.com/office/drawing/2016/5/10/chartex" xmlns:cx5="http://schemas.microsoft.com/office/drawing/2016/5/11/chartex" xmlns:cx6="http://schemas.microsoft.com/office/drawing/2016/5/12/chartex" xmlns:cx7="http://schemas.microsoft.com/office/drawing/2016/5/13/chartex" xmlns:cx8="http://schemas.microsoft.com/office/drawing/2016/5/14/chartex" xmlns:mc="http://schemas.openxmlformats.org/markup-compatibility/2006" xmlns:aink="http://schemas.microsoft.com/office/drawing/2016/ink" xmlns:am3d="http://schemas.microsoft.com/office/drawing/2017/model3d" xmlns:o="urn:schemas-microsoft-com:office:office" xmlns:oel="http://schemas.microsoft.com/office/2019/extlst" xmlns:r="http://schemas.openxmlformats.org/officeDocument/2006/relationships" xmlns:m="http://schemas.openxmlformats.org/officeDocument/2006/math" xmlns:v="urn:schemas-microsoft-com:vml" xmlns:wp14="http://schemas.microsoft.com/office/word/2010/wordprocessingDrawing" xmlns:wp="http://schemas.openxmlformats.org/drawingml/2006/wordprocessingDrawing" xmlns:w10="urn:schemas-microsoft-com:office:word" xmlns:w="http://schemas.openxmlformats.org/wordprocessingml/2006/main" xmlns:w14="http://schemas.microsoft.com/office/word/2010/wordml" xmlns:w15="http://schemas.microsoft.com/office/word/2012/wordml" xmlns:w16cex="http://schemas.microsoft.com/office/word/2018/wordml/cex" xmlns:w16cid="http://schemas.microsoft.com/office/word/2016/wordml/cid" xmlns:w16="http://schemas.microsoft.com/office/word/2018/wordml" xmlns:w16du="http://schemas.microsoft.com/office/word/2023/wordml/word16du" xmlns:w16sdtdh="http://schemas.microsoft.com/office/word/2020/wordml/sdtdatahash" xmlns:w16sdtfl="http://schemas.microsoft.com/office/word/2024/wordml/sdtformatlock" xmlns:w16se="http://schemas.microsoft.com/office/word/2015/wordml/symex" xmlns:wpg="http://schemas.microsoft.com/office/word/2010/wordprocessingGroup" xmlns:wpi="http://schemas.microsoft.com/office/word/2010/wordprocessingInk" xmlns:wne="http://schemas.microsoft.com/office/word/2006/wordml" xmlns:wps="http://schemas.microsoft.com/office/word/2010/wordprocessingShape" mc:Ignorable="w14 w15 w16se w16cid w16 w16cex w16sdtdh w16sdtfl w16du wp14">
   <w:abstractNum w:abstractNumId="0" w15:restartNumberingAfterBreak="0">
-    <w:nsid w:val="3A837167"/>
+    <w:nsid w:val="2E4E2B84"/>
     <w:multiLevelType w:val="hybridMultilevel"/>
-    <w:tmpl w:val="22E28BE2"/>
-    <w:lvl w:ilvl="0" w:tplc="8A28A610">
+    <w:tmpl w:val="607CD28C"/>
+    <w:lvl w:ilvl="0" w:tplc="BA280AD2">
       <w:numFmt w:val="bullet"/>
       <w:lvlText w:val="-"/>
       <w:lvlJc w:val="left"/>
@@ -978,10 +3052,10 @@
     </w:lvl>
   </w:abstractNum>
   <w:abstractNum w:abstractNumId="1" w15:restartNumberingAfterBreak="0">
-    <w:nsid w:val="5BD67332"/>
+    <w:nsid w:val="3A837167"/>
     <w:multiLevelType w:val="hybridMultilevel"/>
-    <w:tmpl w:val="A9B05A78"/>
-    <w:lvl w:ilvl="0" w:tplc="CE1EC964">
+    <w:tmpl w:val="22E28BE2"/>
+    <w:lvl w:ilvl="0" w:tplc="8A28A610">
       <w:numFmt w:val="bullet"/>
       <w:lvlText w:val="-"/>
       <w:lvlJc w:val="left"/>
@@ -1089,11 +3163,126 @@
       </w:rPr>
     </w:lvl>
   </w:abstractNum>
+  <w:abstractNum w:abstractNumId="2" w15:restartNumberingAfterBreak="0">
+    <w:nsid w:val="5BD67332"/>
+    <w:multiLevelType w:val="hybridMultilevel"/>
+    <w:tmpl w:val="A9B05A78"/>
+    <w:lvl w:ilvl="0" w:tplc="CE1EC964">
+      <w:numFmt w:val="bullet"/>
+      <w:lvlText w:val="-"/>
+      <w:lvlJc w:val="left"/>
+      <w:pPr>
+        <w:ind w:left="720" w:hanging="360"/>
+      </w:pPr>
+      <w:rPr>
+        <w:rFonts w:ascii="Times New Roman" w:eastAsiaTheme="minorEastAsia" w:hAnsi="Times New Roman" w:cs="Times New Roman" w:hint="default"/>
+      </w:rPr>
+    </w:lvl>
+    <w:lvl w:ilvl="1" w:tplc="38090003" w:tentative="1">
+      <w:start w:val="1"/>
+      <w:numFmt w:val="bullet"/>
+      <w:lvlText w:val="o"/>
+      <w:lvlJc w:val="left"/>
+      <w:pPr>
+        <w:ind w:left="1440" w:hanging="360"/>
+      </w:pPr>
+      <w:rPr>
+        <w:rFonts w:ascii="Courier New" w:hAnsi="Courier New" w:cs="Courier New" w:hint="default"/>
+      </w:rPr>
+    </w:lvl>
+    <w:lvl w:ilvl="2" w:tplc="38090005" w:tentative="1">
+      <w:start w:val="1"/>
+      <w:numFmt w:val="bullet"/>
+      <w:lvlText w:val=""/>
+      <w:lvlJc w:val="left"/>
+      <w:pPr>
+        <w:ind w:left="2160" w:hanging="360"/>
+      </w:pPr>
+      <w:rPr>
+        <w:rFonts w:ascii="Wingdings" w:hAnsi="Wingdings" w:hint="default"/>
+      </w:rPr>
+    </w:lvl>
+    <w:lvl w:ilvl="3" w:tplc="38090001" w:tentative="1">
+      <w:start w:val="1"/>
+      <w:numFmt w:val="bullet"/>
+      <w:lvlText w:val=""/>
+      <w:lvlJc w:val="left"/>
+      <w:pPr>
+        <w:ind w:left="2880" w:hanging="360"/>
+      </w:pPr>
+      <w:rPr>
+        <w:rFonts w:ascii="Symbol" w:hAnsi="Symbol" w:hint="default"/>
+      </w:rPr>
+    </w:lvl>
+    <w:lvl w:ilvl="4" w:tplc="38090003" w:tentative="1">
+      <w:start w:val="1"/>
+      <w:numFmt w:val="bullet"/>
+      <w:lvlText w:val="o"/>
+      <w:lvlJc w:val="left"/>
+      <w:pPr>
+        <w:ind w:left="3600" w:hanging="360"/>
+      </w:pPr>
+      <w:rPr>
+        <w:rFonts w:ascii="Courier New" w:hAnsi="Courier New" w:cs="Courier New" w:hint="default"/>
+      </w:rPr>
+    </w:lvl>
+    <w:lvl w:ilvl="5" w:tplc="38090005" w:tentative="1">
+      <w:start w:val="1"/>
+      <w:numFmt w:val="bullet"/>
+      <w:lvlText w:val=""/>
+      <w:lvlJc w:val="left"/>
+      <w:pPr>
+        <w:ind w:left="4320" w:hanging="360"/>
+      </w:pPr>
+      <w:rPr>
+        <w:rFonts w:ascii="Wingdings" w:hAnsi="Wingdings" w:hint="default"/>
+      </w:rPr>
+    </w:lvl>
+    <w:lvl w:ilvl="6" w:tplc="38090001" w:tentative="1">
+      <w:start w:val="1"/>
+      <w:numFmt w:val="bullet"/>
+      <w:lvlText w:val=""/>
+      <w:lvlJc w:val="left"/>
+      <w:pPr>
+        <w:ind w:left="5040" w:hanging="360"/>
+      </w:pPr>
+      <w:rPr>
+        <w:rFonts w:ascii="Symbol" w:hAnsi="Symbol" w:hint="default"/>
+      </w:rPr>
+    </w:lvl>
+    <w:lvl w:ilvl="7" w:tplc="38090003" w:tentative="1">
+      <w:start w:val="1"/>
+      <w:numFmt w:val="bullet"/>
+      <w:lvlText w:val="o"/>
+      <w:lvlJc w:val="left"/>
+      <w:pPr>
+        <w:ind w:left="5760" w:hanging="360"/>
+      </w:pPr>
+      <w:rPr>
+        <w:rFonts w:ascii="Courier New" w:hAnsi="Courier New" w:cs="Courier New" w:hint="default"/>
+      </w:rPr>
+    </w:lvl>
+    <w:lvl w:ilvl="8" w:tplc="38090005" w:tentative="1">
+      <w:start w:val="1"/>
+      <w:numFmt w:val="bullet"/>
+      <w:lvlText w:val=""/>
+      <w:lvlJc w:val="left"/>
+      <w:pPr>
+        <w:ind w:left="6480" w:hanging="360"/>
+      </w:pPr>
+      <w:rPr>
+        <w:rFonts w:ascii="Wingdings" w:hAnsi="Wingdings" w:hint="default"/>
+      </w:rPr>
+    </w:lvl>
+  </w:abstractNum>
   <w:num w:numId="1" w16cid:durableId="1117142885">
-    <w:abstractNumId w:val="0"/>
+    <w:abstractNumId w:val="1"/>
   </w:num>
   <w:num w:numId="2" w16cid:durableId="1716612018">
-    <w:abstractNumId w:val="1"/>
+    <w:abstractNumId w:val="2"/>
+  </w:num>
+  <w:num w:numId="3" w16cid:durableId="273758257">
+    <w:abstractNumId w:val="0"/>
   </w:num>
 </w:numbering>
 </file>
@@ -1701,7 +3890,6 @@
   <w:style w:type="character" w:default="1" w:styleId="DefaultParagraphFont">
     <w:name w:val="Default Paragraph Font"/>
     <w:uiPriority w:val="1"/>
-    <w:semiHidden/>
     <w:unhideWhenUsed/>
   </w:style>
   <w:style w:type="table" w:default="1" w:styleId="TableNormal">
@@ -2034,6 +4222,36 @@
       <w:szCs w:val="18"/>
     </w:rPr>
   </w:style>
+  <w:style w:type="character" w:styleId="Hyperlink">
+    <w:name w:val="Hyperlink"/>
+    <w:basedOn w:val="DefaultParagraphFont"/>
+    <w:uiPriority w:val="99"/>
+    <w:unhideWhenUsed/>
+    <w:rsid w:val="0033557F"/>
+    <w:rPr>
+      <w:color w:val="0563C1" w:themeColor="hyperlink"/>
+      <w:u w:val="single"/>
+    </w:rPr>
+  </w:style>
+  <w:style w:type="table" w:styleId="TableGrid">
+    <w:name w:val="Table Grid"/>
+    <w:basedOn w:val="TableNormal"/>
+    <w:uiPriority w:val="39"/>
+    <w:rsid w:val="00B3307E"/>
+    <w:pPr>
+      <w:spacing w:after="0" w:line="240" w:lineRule="auto"/>
+    </w:pPr>
+    <w:tblPr>
+      <w:tblBorders>
+        <w:top w:val="single" w:sz="4" w:space="0" w:color="auto"/>
+        <w:left w:val="single" w:sz="4" w:space="0" w:color="auto"/>
+        <w:bottom w:val="single" w:sz="4" w:space="0" w:color="auto"/>
+        <w:right w:val="single" w:sz="4" w:space="0" w:color="auto"/>
+        <w:insideH w:val="single" w:sz="4" w:space="0" w:color="auto"/>
+        <w:insideV w:val="single" w:sz="4" w:space="0" w:color="auto"/>
+      </w:tblBorders>
+    </w:tblPr>
+  </w:style>
 </w:styles>
 </file>
 

</xml_diff>

<commit_message>
Updated formatting and added progress update to Part-2-Activities and finished B11 along with its evidence.
Finished A12, A13, and A18. Updated A8 to include an example.
</commit_message>
<xml_diff>
--- a/Portfolio/Part-2-Activities.docx
+++ b/Portfolio/Part-2-Activities.docx
@@ -4,7 +4,7 @@
   <w:body>
     <w:p>
       <w:pPr>
-        <w:jc w:val="center"/>
+        <w:jc w:val="both"/>
         <w:rPr>
           <w:rFonts w:ascii="Times New Roman" w:hAnsi="Times New Roman" w:cs="Times New Roman"/>
           <w:b/>
@@ -16,6 +16,7 @@
     </w:p>
     <w:p>
       <w:pPr>
+        <w:jc w:val="both"/>
         <w:rPr>
           <w:rFonts w:ascii="Times New Roman" w:hAnsi="Times New Roman" w:cs="Times New Roman"/>
           <w:b/>
@@ -27,6 +28,7 @@
     </w:p>
     <w:p>
       <w:pPr>
+        <w:jc w:val="both"/>
         <w:rPr>
           <w:rFonts w:ascii="Times New Roman" w:hAnsi="Times New Roman" w:cs="Times New Roman"/>
           <w:b/>
@@ -170,16 +172,6 @@
         </w:rPr>
         <w:t>Portfolio</w:t>
       </w:r>
-      <w:r>
-        <w:rPr>
-          <w:rFonts w:ascii="Times New Roman" w:hAnsi="Times New Roman" w:cs="Times New Roman"/>
-          <w:b/>
-          <w:bCs/>
-          <w:sz w:val="96"/>
-          <w:szCs w:val="96"/>
-        </w:rPr>
-        <w:t xml:space="preserve"> </w:t>
-      </w:r>
     </w:p>
     <w:p>
       <w:pPr>
@@ -328,16 +320,6 @@
           <w:t>https://github.com/Kelly-Vl/Defensive-Cybersecurity-Portfolio</w:t>
         </w:r>
       </w:hyperlink>
-      <w:r>
-        <w:rPr>
-          <w:rFonts w:ascii="Times New Roman" w:hAnsi="Times New Roman" w:cs="Times New Roman"/>
-          <w:b/>
-          <w:bCs/>
-          <w:sz w:val="32"/>
-          <w:szCs w:val="32"/>
-        </w:rPr>
-        <w:t xml:space="preserve"> </w:t>
-      </w:r>
     </w:p>
     <w:p>
       <w:pPr>
@@ -429,6 +411,7 @@
           </w:tcPr>
           <w:p>
             <w:pPr>
+              <w:jc w:val="both"/>
               <w:rPr>
                 <w:rFonts w:ascii="Times New Roman" w:hAnsi="Times New Roman" w:cs="Times New Roman"/>
               </w:rPr>
@@ -452,6 +435,7 @@
           </w:tcPr>
           <w:p>
             <w:pPr>
+              <w:jc w:val="both"/>
               <w:rPr>
                 <w:rFonts w:ascii="Times New Roman" w:hAnsi="Times New Roman" w:cs="Times New Roman"/>
               </w:rPr>
@@ -475,6 +459,7 @@
           </w:tcPr>
           <w:p>
             <w:pPr>
+              <w:jc w:val="both"/>
               <w:rPr>
                 <w:rFonts w:ascii="Times New Roman" w:hAnsi="Times New Roman" w:cs="Times New Roman"/>
               </w:rPr>
@@ -499,43 +484,45 @@
           </w:tcPr>
           <w:p>
             <w:pPr>
+              <w:jc w:val="both"/>
+              <w:rPr>
+                <w:rFonts w:ascii="Times New Roman" w:hAnsi="Times New Roman" w:cs="Times New Roman"/>
+              </w:rPr>
+            </w:pPr>
+            <w:r>
+              <w:rPr>
+                <w:rFonts w:ascii="Times New Roman" w:hAnsi="Times New Roman" w:cs="Times New Roman"/>
+              </w:rPr>
+              <w:t>B1</w:t>
+            </w:r>
+          </w:p>
+        </w:tc>
+        <w:tc>
+          <w:tcPr>
+            <w:tcW w:w="6910" w:type="dxa"/>
+          </w:tcPr>
+          <w:p>
+            <w:pPr>
+              <w:jc w:val="both"/>
+              <w:rPr>
+                <w:rFonts w:ascii="Times New Roman" w:hAnsi="Times New Roman" w:cs="Times New Roman"/>
+              </w:rPr>
+            </w:pPr>
+            <w:r>
+              <w:rPr>
+                <w:rFonts w:ascii="Times New Roman" w:hAnsi="Times New Roman" w:cs="Times New Roman"/>
+              </w:rPr>
+              <w:t>Discover 5 unique weak/vulnerable security implementations</w:t>
+            </w:r>
+          </w:p>
+        </w:tc>
+        <w:tc>
+          <w:tcPr>
+            <w:tcW w:w="941" w:type="dxa"/>
+          </w:tcPr>
+          <w:p>
+            <w:pPr>
               <w:jc w:val="center"/>
-              <w:rPr>
-                <w:rFonts w:ascii="Times New Roman" w:hAnsi="Times New Roman" w:cs="Times New Roman"/>
-              </w:rPr>
-            </w:pPr>
-            <w:r>
-              <w:rPr>
-                <w:rFonts w:ascii="Times New Roman" w:hAnsi="Times New Roman" w:cs="Times New Roman"/>
-              </w:rPr>
-              <w:t>B1</w:t>
-            </w:r>
-          </w:p>
-        </w:tc>
-        <w:tc>
-          <w:tcPr>
-            <w:tcW w:w="6910" w:type="dxa"/>
-          </w:tcPr>
-          <w:p>
-            <w:pPr>
-              <w:rPr>
-                <w:rFonts w:ascii="Times New Roman" w:hAnsi="Times New Roman" w:cs="Times New Roman"/>
-              </w:rPr>
-            </w:pPr>
-            <w:r>
-              <w:rPr>
-                <w:rFonts w:ascii="Times New Roman" w:hAnsi="Times New Roman" w:cs="Times New Roman"/>
-              </w:rPr>
-              <w:t>Discover 5 unique weak/vulnerable security implementations</w:t>
-            </w:r>
-          </w:p>
-        </w:tc>
-        <w:tc>
-          <w:tcPr>
-            <w:tcW w:w="941" w:type="dxa"/>
-          </w:tcPr>
-          <w:p>
-            <w:pPr>
               <w:rPr>
                 <w:rFonts w:ascii="Times New Roman" w:hAnsi="Times New Roman" w:cs="Times New Roman"/>
               </w:rPr>
@@ -550,43 +537,45 @@
           </w:tcPr>
           <w:p>
             <w:pPr>
+              <w:jc w:val="both"/>
+              <w:rPr>
+                <w:rFonts w:ascii="Times New Roman" w:hAnsi="Times New Roman" w:cs="Times New Roman"/>
+              </w:rPr>
+            </w:pPr>
+            <w:r>
+              <w:rPr>
+                <w:rFonts w:ascii="Times New Roman" w:hAnsi="Times New Roman" w:cs="Times New Roman"/>
+              </w:rPr>
+              <w:t>B2</w:t>
+            </w:r>
+          </w:p>
+        </w:tc>
+        <w:tc>
+          <w:tcPr>
+            <w:tcW w:w="6910" w:type="dxa"/>
+          </w:tcPr>
+          <w:p>
+            <w:pPr>
+              <w:jc w:val="both"/>
+              <w:rPr>
+                <w:rFonts w:ascii="Times New Roman" w:hAnsi="Times New Roman" w:cs="Times New Roman"/>
+              </w:rPr>
+            </w:pPr>
+            <w:r>
+              <w:rPr>
+                <w:rFonts w:ascii="Times New Roman" w:hAnsi="Times New Roman" w:cs="Times New Roman"/>
+              </w:rPr>
+              <w:t>Discover 5 unique strong security implementations</w:t>
+            </w:r>
+          </w:p>
+        </w:tc>
+        <w:tc>
+          <w:tcPr>
+            <w:tcW w:w="941" w:type="dxa"/>
+          </w:tcPr>
+          <w:p>
+            <w:pPr>
               <w:jc w:val="center"/>
-              <w:rPr>
-                <w:rFonts w:ascii="Times New Roman" w:hAnsi="Times New Roman" w:cs="Times New Roman"/>
-              </w:rPr>
-            </w:pPr>
-            <w:r>
-              <w:rPr>
-                <w:rFonts w:ascii="Times New Roman" w:hAnsi="Times New Roman" w:cs="Times New Roman"/>
-              </w:rPr>
-              <w:t>B2</w:t>
-            </w:r>
-          </w:p>
-        </w:tc>
-        <w:tc>
-          <w:tcPr>
-            <w:tcW w:w="6910" w:type="dxa"/>
-          </w:tcPr>
-          <w:p>
-            <w:pPr>
-              <w:rPr>
-                <w:rFonts w:ascii="Times New Roman" w:hAnsi="Times New Roman" w:cs="Times New Roman"/>
-              </w:rPr>
-            </w:pPr>
-            <w:r>
-              <w:rPr>
-                <w:rFonts w:ascii="Times New Roman" w:hAnsi="Times New Roman" w:cs="Times New Roman"/>
-              </w:rPr>
-              <w:t>Discover 5 unique strong security implementations</w:t>
-            </w:r>
-          </w:p>
-        </w:tc>
-        <w:tc>
-          <w:tcPr>
-            <w:tcW w:w="941" w:type="dxa"/>
-          </w:tcPr>
-          <w:p>
-            <w:pPr>
               <w:rPr>
                 <w:rFonts w:ascii="Times New Roman" w:hAnsi="Times New Roman" w:cs="Times New Roman"/>
               </w:rPr>
@@ -601,43 +590,45 @@
           </w:tcPr>
           <w:p>
             <w:pPr>
+              <w:jc w:val="both"/>
+              <w:rPr>
+                <w:rFonts w:ascii="Times New Roman" w:hAnsi="Times New Roman" w:cs="Times New Roman"/>
+              </w:rPr>
+            </w:pPr>
+            <w:r>
+              <w:rPr>
+                <w:rFonts w:ascii="Times New Roman" w:hAnsi="Times New Roman" w:cs="Times New Roman"/>
+              </w:rPr>
+              <w:t>B3</w:t>
+            </w:r>
+          </w:p>
+        </w:tc>
+        <w:tc>
+          <w:tcPr>
+            <w:tcW w:w="6910" w:type="dxa"/>
+          </w:tcPr>
+          <w:p>
+            <w:pPr>
+              <w:jc w:val="both"/>
+              <w:rPr>
+                <w:rFonts w:ascii="Times New Roman" w:hAnsi="Times New Roman" w:cs="Times New Roman"/>
+              </w:rPr>
+            </w:pPr>
+            <w:r>
+              <w:rPr>
+                <w:rFonts w:ascii="Times New Roman" w:hAnsi="Times New Roman" w:cs="Times New Roman"/>
+              </w:rPr>
+              <w:t>Discover 3 proactive security implementations in practice</w:t>
+            </w:r>
+          </w:p>
+        </w:tc>
+        <w:tc>
+          <w:tcPr>
+            <w:tcW w:w="941" w:type="dxa"/>
+          </w:tcPr>
+          <w:p>
+            <w:pPr>
               <w:jc w:val="center"/>
-              <w:rPr>
-                <w:rFonts w:ascii="Times New Roman" w:hAnsi="Times New Roman" w:cs="Times New Roman"/>
-              </w:rPr>
-            </w:pPr>
-            <w:r>
-              <w:rPr>
-                <w:rFonts w:ascii="Times New Roman" w:hAnsi="Times New Roman" w:cs="Times New Roman"/>
-              </w:rPr>
-              <w:t>B3</w:t>
-            </w:r>
-          </w:p>
-        </w:tc>
-        <w:tc>
-          <w:tcPr>
-            <w:tcW w:w="6910" w:type="dxa"/>
-          </w:tcPr>
-          <w:p>
-            <w:pPr>
-              <w:rPr>
-                <w:rFonts w:ascii="Times New Roman" w:hAnsi="Times New Roman" w:cs="Times New Roman"/>
-              </w:rPr>
-            </w:pPr>
-            <w:r>
-              <w:rPr>
-                <w:rFonts w:ascii="Times New Roman" w:hAnsi="Times New Roman" w:cs="Times New Roman"/>
-              </w:rPr>
-              <w:t>Discover 3 proactive security implementations in practice</w:t>
-            </w:r>
-          </w:p>
-        </w:tc>
-        <w:tc>
-          <w:tcPr>
-            <w:tcW w:w="941" w:type="dxa"/>
-          </w:tcPr>
-          <w:p>
-            <w:pPr>
               <w:rPr>
                 <w:rFonts w:ascii="Times New Roman" w:hAnsi="Times New Roman" w:cs="Times New Roman"/>
               </w:rPr>
@@ -652,6 +643,44 @@
           </w:tcPr>
           <w:p>
             <w:pPr>
+              <w:jc w:val="both"/>
+              <w:rPr>
+                <w:rFonts w:ascii="Times New Roman" w:hAnsi="Times New Roman" w:cs="Times New Roman"/>
+              </w:rPr>
+            </w:pPr>
+            <w:r>
+              <w:rPr>
+                <w:rFonts w:ascii="Times New Roman" w:hAnsi="Times New Roman" w:cs="Times New Roman"/>
+              </w:rPr>
+              <w:t>B4</w:t>
+            </w:r>
+          </w:p>
+        </w:tc>
+        <w:tc>
+          <w:tcPr>
+            <w:tcW w:w="6910" w:type="dxa"/>
+          </w:tcPr>
+          <w:p>
+            <w:pPr>
+              <w:jc w:val="both"/>
+              <w:rPr>
+                <w:rFonts w:ascii="Times New Roman" w:hAnsi="Times New Roman" w:cs="Times New Roman"/>
+              </w:rPr>
+            </w:pPr>
+            <w:r>
+              <w:rPr>
+                <w:rFonts w:ascii="Times New Roman" w:hAnsi="Times New Roman" w:cs="Times New Roman"/>
+              </w:rPr>
+              <w:t>Participate in 3 in-class activities in labs (facilitators will administer such activities)</w:t>
+            </w:r>
+          </w:p>
+        </w:tc>
+        <w:tc>
+          <w:tcPr>
+            <w:tcW w:w="941" w:type="dxa"/>
+          </w:tcPr>
+          <w:p>
+            <w:pPr>
               <w:jc w:val="center"/>
               <w:rPr>
                 <w:rFonts w:ascii="Times New Roman" w:hAnsi="Times New Roman" w:cs="Times New Roman"/>
@@ -661,38 +690,8 @@
               <w:rPr>
                 <w:rFonts w:ascii="Times New Roman" w:hAnsi="Times New Roman" w:cs="Times New Roman"/>
               </w:rPr>
-              <w:t>B4</w:t>
-            </w:r>
-          </w:p>
-        </w:tc>
-        <w:tc>
-          <w:tcPr>
-            <w:tcW w:w="6910" w:type="dxa"/>
-          </w:tcPr>
-          <w:p>
-            <w:pPr>
-              <w:rPr>
-                <w:rFonts w:ascii="Times New Roman" w:hAnsi="Times New Roman" w:cs="Times New Roman"/>
-              </w:rPr>
-            </w:pPr>
-            <w:r>
-              <w:rPr>
-                <w:rFonts w:ascii="Times New Roman" w:hAnsi="Times New Roman" w:cs="Times New Roman"/>
-              </w:rPr>
-              <w:t>Participate in 3 in-class activities in labs (facilitators will administer such activities)</w:t>
-            </w:r>
-          </w:p>
-        </w:tc>
-        <w:tc>
-          <w:tcPr>
-            <w:tcW w:w="941" w:type="dxa"/>
-          </w:tcPr>
-          <w:p>
-            <w:pPr>
-              <w:rPr>
-                <w:rFonts w:ascii="Times New Roman" w:hAnsi="Times New Roman" w:cs="Times New Roman"/>
-              </w:rPr>
-            </w:pPr>
+              <w:t>In Prog.</w:t>
+            </w:r>
           </w:p>
         </w:tc>
       </w:tr>
@@ -703,6 +702,44 @@
           </w:tcPr>
           <w:p>
             <w:pPr>
+              <w:jc w:val="both"/>
+              <w:rPr>
+                <w:rFonts w:ascii="Times New Roman" w:hAnsi="Times New Roman" w:cs="Times New Roman"/>
+              </w:rPr>
+            </w:pPr>
+            <w:r>
+              <w:rPr>
+                <w:rFonts w:ascii="Times New Roman" w:hAnsi="Times New Roman" w:cs="Times New Roman"/>
+              </w:rPr>
+              <w:t>B5</w:t>
+            </w:r>
+          </w:p>
+        </w:tc>
+        <w:tc>
+          <w:tcPr>
+            <w:tcW w:w="6910" w:type="dxa"/>
+          </w:tcPr>
+          <w:p>
+            <w:pPr>
+              <w:jc w:val="both"/>
+              <w:rPr>
+                <w:rFonts w:ascii="Times New Roman" w:hAnsi="Times New Roman" w:cs="Times New Roman"/>
+              </w:rPr>
+            </w:pPr>
+            <w:r>
+              <w:rPr>
+                <w:rFonts w:ascii="Times New Roman" w:hAnsi="Times New Roman" w:cs="Times New Roman"/>
+              </w:rPr>
+              <w:t>Attend 2 cybersecurity related talks/seminars</w:t>
+            </w:r>
+          </w:p>
+        </w:tc>
+        <w:tc>
+          <w:tcPr>
+            <w:tcW w:w="941" w:type="dxa"/>
+          </w:tcPr>
+          <w:p>
+            <w:pPr>
               <w:jc w:val="center"/>
               <w:rPr>
                 <w:rFonts w:ascii="Times New Roman" w:hAnsi="Times New Roman" w:cs="Times New Roman"/>
@@ -712,38 +749,8 @@
               <w:rPr>
                 <w:rFonts w:ascii="Times New Roman" w:hAnsi="Times New Roman" w:cs="Times New Roman"/>
               </w:rPr>
-              <w:t>B5</w:t>
-            </w:r>
-          </w:p>
-        </w:tc>
-        <w:tc>
-          <w:tcPr>
-            <w:tcW w:w="6910" w:type="dxa"/>
-          </w:tcPr>
-          <w:p>
-            <w:pPr>
-              <w:rPr>
-                <w:rFonts w:ascii="Times New Roman" w:hAnsi="Times New Roman" w:cs="Times New Roman"/>
-              </w:rPr>
-            </w:pPr>
-            <w:r>
-              <w:rPr>
-                <w:rFonts w:ascii="Times New Roman" w:hAnsi="Times New Roman" w:cs="Times New Roman"/>
-              </w:rPr>
-              <w:t>Attend 2 cybersecurity related talks/seminars</w:t>
-            </w:r>
-          </w:p>
-        </w:tc>
-        <w:tc>
-          <w:tcPr>
-            <w:tcW w:w="941" w:type="dxa"/>
-          </w:tcPr>
-          <w:p>
-            <w:pPr>
-              <w:rPr>
-                <w:rFonts w:ascii="Times New Roman" w:hAnsi="Times New Roman" w:cs="Times New Roman"/>
-              </w:rPr>
-            </w:pPr>
+              <w:t>In Prog.</w:t>
+            </w:r>
           </w:p>
         </w:tc>
       </w:tr>
@@ -754,6 +761,44 @@
           </w:tcPr>
           <w:p>
             <w:pPr>
+              <w:jc w:val="both"/>
+              <w:rPr>
+                <w:rFonts w:ascii="Times New Roman" w:hAnsi="Times New Roman" w:cs="Times New Roman"/>
+              </w:rPr>
+            </w:pPr>
+            <w:r>
+              <w:rPr>
+                <w:rFonts w:ascii="Times New Roman" w:hAnsi="Times New Roman" w:cs="Times New Roman"/>
+              </w:rPr>
+              <w:t>B6</w:t>
+            </w:r>
+          </w:p>
+        </w:tc>
+        <w:tc>
+          <w:tcPr>
+            <w:tcW w:w="6910" w:type="dxa"/>
+          </w:tcPr>
+          <w:p>
+            <w:pPr>
+              <w:jc w:val="both"/>
+              <w:rPr>
+                <w:rFonts w:ascii="Times New Roman" w:hAnsi="Times New Roman" w:cs="Times New Roman"/>
+              </w:rPr>
+            </w:pPr>
+            <w:r>
+              <w:rPr>
+                <w:rFonts w:ascii="Times New Roman" w:hAnsi="Times New Roman" w:cs="Times New Roman"/>
+              </w:rPr>
+              <w:t>Attend 2 cyber ethics/law related talks/seminars</w:t>
+            </w:r>
+          </w:p>
+        </w:tc>
+        <w:tc>
+          <w:tcPr>
+            <w:tcW w:w="941" w:type="dxa"/>
+          </w:tcPr>
+          <w:p>
+            <w:pPr>
               <w:jc w:val="center"/>
               <w:rPr>
                 <w:rFonts w:ascii="Times New Roman" w:hAnsi="Times New Roman" w:cs="Times New Roman"/>
@@ -763,38 +808,8 @@
               <w:rPr>
                 <w:rFonts w:ascii="Times New Roman" w:hAnsi="Times New Roman" w:cs="Times New Roman"/>
               </w:rPr>
-              <w:t>B6</w:t>
-            </w:r>
-          </w:p>
-        </w:tc>
-        <w:tc>
-          <w:tcPr>
-            <w:tcW w:w="6910" w:type="dxa"/>
-          </w:tcPr>
-          <w:p>
-            <w:pPr>
-              <w:rPr>
-                <w:rFonts w:ascii="Times New Roman" w:hAnsi="Times New Roman" w:cs="Times New Roman"/>
-              </w:rPr>
-            </w:pPr>
-            <w:r>
-              <w:rPr>
-                <w:rFonts w:ascii="Times New Roman" w:hAnsi="Times New Roman" w:cs="Times New Roman"/>
-              </w:rPr>
-              <w:t>Attend 2 cyber ethics/law related talks/seminars</w:t>
-            </w:r>
-          </w:p>
-        </w:tc>
-        <w:tc>
-          <w:tcPr>
-            <w:tcW w:w="941" w:type="dxa"/>
-          </w:tcPr>
-          <w:p>
-            <w:pPr>
-              <w:rPr>
-                <w:rFonts w:ascii="Times New Roman" w:hAnsi="Times New Roman" w:cs="Times New Roman"/>
-              </w:rPr>
-            </w:pPr>
+              <w:t>0</w:t>
+            </w:r>
           </w:p>
         </w:tc>
       </w:tr>
@@ -805,6 +820,44 @@
           </w:tcPr>
           <w:p>
             <w:pPr>
+              <w:jc w:val="both"/>
+              <w:rPr>
+                <w:rFonts w:ascii="Times New Roman" w:hAnsi="Times New Roman" w:cs="Times New Roman"/>
+              </w:rPr>
+            </w:pPr>
+            <w:r>
+              <w:rPr>
+                <w:rFonts w:ascii="Times New Roman" w:hAnsi="Times New Roman" w:cs="Times New Roman"/>
+              </w:rPr>
+              <w:t>B7</w:t>
+            </w:r>
+          </w:p>
+        </w:tc>
+        <w:tc>
+          <w:tcPr>
+            <w:tcW w:w="6910" w:type="dxa"/>
+          </w:tcPr>
+          <w:p>
+            <w:pPr>
+              <w:jc w:val="both"/>
+              <w:rPr>
+                <w:rFonts w:ascii="Times New Roman" w:hAnsi="Times New Roman" w:cs="Times New Roman"/>
+              </w:rPr>
+            </w:pPr>
+            <w:r>
+              <w:rPr>
+                <w:rFonts w:ascii="Times New Roman" w:hAnsi="Times New Roman" w:cs="Times New Roman"/>
+              </w:rPr>
+              <w:t>Participate in CS/DS/cybersecurity clubs’ activity</w:t>
+            </w:r>
+          </w:p>
+        </w:tc>
+        <w:tc>
+          <w:tcPr>
+            <w:tcW w:w="941" w:type="dxa"/>
+          </w:tcPr>
+          <w:p>
+            <w:pPr>
               <w:jc w:val="center"/>
               <w:rPr>
                 <w:rFonts w:ascii="Times New Roman" w:hAnsi="Times New Roman" w:cs="Times New Roman"/>
@@ -814,38 +867,8 @@
               <w:rPr>
                 <w:rFonts w:ascii="Times New Roman" w:hAnsi="Times New Roman" w:cs="Times New Roman"/>
               </w:rPr>
-              <w:t>B7</w:t>
-            </w:r>
-          </w:p>
-        </w:tc>
-        <w:tc>
-          <w:tcPr>
-            <w:tcW w:w="6910" w:type="dxa"/>
-          </w:tcPr>
-          <w:p>
-            <w:pPr>
-              <w:rPr>
-                <w:rFonts w:ascii="Times New Roman" w:hAnsi="Times New Roman" w:cs="Times New Roman"/>
-              </w:rPr>
-            </w:pPr>
-            <w:r>
-              <w:rPr>
-                <w:rFonts w:ascii="Times New Roman" w:hAnsi="Times New Roman" w:cs="Times New Roman"/>
-              </w:rPr>
-              <w:t>Participate in CS/DS/cybersecurity clubs’ activity</w:t>
-            </w:r>
-          </w:p>
-        </w:tc>
-        <w:tc>
-          <w:tcPr>
-            <w:tcW w:w="941" w:type="dxa"/>
-          </w:tcPr>
-          <w:p>
-            <w:pPr>
-              <w:rPr>
-                <w:rFonts w:ascii="Times New Roman" w:hAnsi="Times New Roman" w:cs="Times New Roman"/>
-              </w:rPr>
-            </w:pPr>
+              <w:t>0</w:t>
+            </w:r>
           </w:p>
         </w:tc>
       </w:tr>
@@ -856,6 +879,44 @@
           </w:tcPr>
           <w:p>
             <w:pPr>
+              <w:jc w:val="both"/>
+              <w:rPr>
+                <w:rFonts w:ascii="Times New Roman" w:hAnsi="Times New Roman" w:cs="Times New Roman"/>
+              </w:rPr>
+            </w:pPr>
+            <w:r>
+              <w:rPr>
+                <w:rFonts w:ascii="Times New Roman" w:hAnsi="Times New Roman" w:cs="Times New Roman"/>
+              </w:rPr>
+              <w:t>B8</w:t>
+            </w:r>
+          </w:p>
+        </w:tc>
+        <w:tc>
+          <w:tcPr>
+            <w:tcW w:w="6910" w:type="dxa"/>
+          </w:tcPr>
+          <w:p>
+            <w:pPr>
+              <w:jc w:val="both"/>
+              <w:rPr>
+                <w:rFonts w:ascii="Times New Roman" w:hAnsi="Times New Roman" w:cs="Times New Roman"/>
+              </w:rPr>
+            </w:pPr>
+            <w:r>
+              <w:rPr>
+                <w:rFonts w:ascii="Times New Roman" w:hAnsi="Times New Roman" w:cs="Times New Roman"/>
+              </w:rPr>
+              <w:t>Participate in a hackathon</w:t>
+            </w:r>
+          </w:p>
+        </w:tc>
+        <w:tc>
+          <w:tcPr>
+            <w:tcW w:w="941" w:type="dxa"/>
+          </w:tcPr>
+          <w:p>
+            <w:pPr>
               <w:jc w:val="center"/>
               <w:rPr>
                 <w:rFonts w:ascii="Times New Roman" w:hAnsi="Times New Roman" w:cs="Times New Roman"/>
@@ -865,38 +926,8 @@
               <w:rPr>
                 <w:rFonts w:ascii="Times New Roman" w:hAnsi="Times New Roman" w:cs="Times New Roman"/>
               </w:rPr>
-              <w:t>B8</w:t>
-            </w:r>
-          </w:p>
-        </w:tc>
-        <w:tc>
-          <w:tcPr>
-            <w:tcW w:w="6910" w:type="dxa"/>
-          </w:tcPr>
-          <w:p>
-            <w:pPr>
-              <w:rPr>
-                <w:rFonts w:ascii="Times New Roman" w:hAnsi="Times New Roman" w:cs="Times New Roman"/>
-              </w:rPr>
-            </w:pPr>
-            <w:r>
-              <w:rPr>
-                <w:rFonts w:ascii="Times New Roman" w:hAnsi="Times New Roman" w:cs="Times New Roman"/>
-              </w:rPr>
-              <w:t>Participate in a hackathon</w:t>
-            </w:r>
-          </w:p>
-        </w:tc>
-        <w:tc>
-          <w:tcPr>
-            <w:tcW w:w="941" w:type="dxa"/>
-          </w:tcPr>
-          <w:p>
-            <w:pPr>
-              <w:rPr>
-                <w:rFonts w:ascii="Times New Roman" w:hAnsi="Times New Roman" w:cs="Times New Roman"/>
-              </w:rPr>
-            </w:pPr>
+              <w:t>0</w:t>
+            </w:r>
           </w:p>
         </w:tc>
       </w:tr>
@@ -907,6 +938,44 @@
           </w:tcPr>
           <w:p>
             <w:pPr>
+              <w:jc w:val="both"/>
+              <w:rPr>
+                <w:rFonts w:ascii="Times New Roman" w:hAnsi="Times New Roman" w:cs="Times New Roman"/>
+              </w:rPr>
+            </w:pPr>
+            <w:r>
+              <w:rPr>
+                <w:rFonts w:ascii="Times New Roman" w:hAnsi="Times New Roman" w:cs="Times New Roman"/>
+              </w:rPr>
+              <w:t>B9</w:t>
+            </w:r>
+          </w:p>
+        </w:tc>
+        <w:tc>
+          <w:tcPr>
+            <w:tcW w:w="6910" w:type="dxa"/>
+          </w:tcPr>
+          <w:p>
+            <w:pPr>
+              <w:jc w:val="both"/>
+              <w:rPr>
+                <w:rFonts w:ascii="Times New Roman" w:hAnsi="Times New Roman" w:cs="Times New Roman"/>
+              </w:rPr>
+            </w:pPr>
+            <w:r>
+              <w:rPr>
+                <w:rFonts w:ascii="Times New Roman" w:hAnsi="Times New Roman" w:cs="Times New Roman"/>
+              </w:rPr>
+              <w:t>Participate in an industry-related cybersecurity event</w:t>
+            </w:r>
+          </w:p>
+        </w:tc>
+        <w:tc>
+          <w:tcPr>
+            <w:tcW w:w="941" w:type="dxa"/>
+          </w:tcPr>
+          <w:p>
+            <w:pPr>
               <w:jc w:val="center"/>
               <w:rPr>
                 <w:rFonts w:ascii="Times New Roman" w:hAnsi="Times New Roman" w:cs="Times New Roman"/>
@@ -916,38 +985,8 @@
               <w:rPr>
                 <w:rFonts w:ascii="Times New Roman" w:hAnsi="Times New Roman" w:cs="Times New Roman"/>
               </w:rPr>
-              <w:t>B9</w:t>
-            </w:r>
-          </w:p>
-        </w:tc>
-        <w:tc>
-          <w:tcPr>
-            <w:tcW w:w="6910" w:type="dxa"/>
-          </w:tcPr>
-          <w:p>
-            <w:pPr>
-              <w:rPr>
-                <w:rFonts w:ascii="Times New Roman" w:hAnsi="Times New Roman" w:cs="Times New Roman"/>
-              </w:rPr>
-            </w:pPr>
-            <w:r>
-              <w:rPr>
-                <w:rFonts w:ascii="Times New Roman" w:hAnsi="Times New Roman" w:cs="Times New Roman"/>
-              </w:rPr>
-              <w:t>Participate in an industry-related cybersecurity event</w:t>
-            </w:r>
-          </w:p>
-        </w:tc>
-        <w:tc>
-          <w:tcPr>
-            <w:tcW w:w="941" w:type="dxa"/>
-          </w:tcPr>
-          <w:p>
-            <w:pPr>
-              <w:rPr>
-                <w:rFonts w:ascii="Times New Roman" w:hAnsi="Times New Roman" w:cs="Times New Roman"/>
-              </w:rPr>
-            </w:pPr>
+              <w:t>In Prog.</w:t>
+            </w:r>
           </w:p>
         </w:tc>
       </w:tr>
@@ -958,6 +997,44 @@
           </w:tcPr>
           <w:p>
             <w:pPr>
+              <w:jc w:val="both"/>
+              <w:rPr>
+                <w:rFonts w:ascii="Times New Roman" w:hAnsi="Times New Roman" w:cs="Times New Roman"/>
+              </w:rPr>
+            </w:pPr>
+            <w:r>
+              <w:rPr>
+                <w:rFonts w:ascii="Times New Roman" w:hAnsi="Times New Roman" w:cs="Times New Roman"/>
+              </w:rPr>
+              <w:t>B10</w:t>
+            </w:r>
+          </w:p>
+        </w:tc>
+        <w:tc>
+          <w:tcPr>
+            <w:tcW w:w="6910" w:type="dxa"/>
+          </w:tcPr>
+          <w:p>
+            <w:pPr>
+              <w:jc w:val="both"/>
+              <w:rPr>
+                <w:rFonts w:ascii="Times New Roman" w:hAnsi="Times New Roman" w:cs="Times New Roman"/>
+              </w:rPr>
+            </w:pPr>
+            <w:r>
+              <w:rPr>
+                <w:rFonts w:ascii="Times New Roman" w:hAnsi="Times New Roman" w:cs="Times New Roman"/>
+              </w:rPr>
+              <w:t>Participate in a cybersecurity activity as part of job/internship/volunteering etc</w:t>
+            </w:r>
+          </w:p>
+        </w:tc>
+        <w:tc>
+          <w:tcPr>
+            <w:tcW w:w="941" w:type="dxa"/>
+          </w:tcPr>
+          <w:p>
+            <w:pPr>
               <w:jc w:val="center"/>
               <w:rPr>
                 <w:rFonts w:ascii="Times New Roman" w:hAnsi="Times New Roman" w:cs="Times New Roman"/>
@@ -967,38 +1044,8 @@
               <w:rPr>
                 <w:rFonts w:ascii="Times New Roman" w:hAnsi="Times New Roman" w:cs="Times New Roman"/>
               </w:rPr>
-              <w:t>B10</w:t>
-            </w:r>
-          </w:p>
-        </w:tc>
-        <w:tc>
-          <w:tcPr>
-            <w:tcW w:w="6910" w:type="dxa"/>
-          </w:tcPr>
-          <w:p>
-            <w:pPr>
-              <w:rPr>
-                <w:rFonts w:ascii="Times New Roman" w:hAnsi="Times New Roman" w:cs="Times New Roman"/>
-              </w:rPr>
-            </w:pPr>
-            <w:r>
-              <w:rPr>
-                <w:rFonts w:ascii="Times New Roman" w:hAnsi="Times New Roman" w:cs="Times New Roman"/>
-              </w:rPr>
-              <w:t>Participate in a cybersecurity activity as part of job/internship/volunteering etc</w:t>
-            </w:r>
-          </w:p>
-        </w:tc>
-        <w:tc>
-          <w:tcPr>
-            <w:tcW w:w="941" w:type="dxa"/>
-          </w:tcPr>
-          <w:p>
-            <w:pPr>
-              <w:rPr>
-                <w:rFonts w:ascii="Times New Roman" w:hAnsi="Times New Roman" w:cs="Times New Roman"/>
-              </w:rPr>
-            </w:pPr>
+              <w:t>0</w:t>
+            </w:r>
           </w:p>
         </w:tc>
       </w:tr>
@@ -1009,6 +1056,44 @@
           </w:tcPr>
           <w:p>
             <w:pPr>
+              <w:jc w:val="both"/>
+              <w:rPr>
+                <w:rFonts w:ascii="Times New Roman" w:hAnsi="Times New Roman" w:cs="Times New Roman"/>
+              </w:rPr>
+            </w:pPr>
+            <w:r>
+              <w:rPr>
+                <w:rFonts w:ascii="Times New Roman" w:hAnsi="Times New Roman" w:cs="Times New Roman"/>
+              </w:rPr>
+              <w:t>B11</w:t>
+            </w:r>
+          </w:p>
+        </w:tc>
+        <w:tc>
+          <w:tcPr>
+            <w:tcW w:w="6910" w:type="dxa"/>
+          </w:tcPr>
+          <w:p>
+            <w:pPr>
+              <w:jc w:val="both"/>
+              <w:rPr>
+                <w:rFonts w:ascii="Times New Roman" w:hAnsi="Times New Roman" w:cs="Times New Roman"/>
+              </w:rPr>
+            </w:pPr>
+            <w:r>
+              <w:rPr>
+                <w:rFonts w:ascii="Times New Roman" w:hAnsi="Times New Roman" w:cs="Times New Roman"/>
+              </w:rPr>
+              <w:t>Talk to 2 cybersecurity experts from the industry and find out their latest projects</w:t>
+            </w:r>
+          </w:p>
+        </w:tc>
+        <w:tc>
+          <w:tcPr>
+            <w:tcW w:w="941" w:type="dxa"/>
+          </w:tcPr>
+          <w:p>
+            <w:pPr>
               <w:jc w:val="center"/>
               <w:rPr>
                 <w:rFonts w:ascii="Times New Roman" w:hAnsi="Times New Roman" w:cs="Times New Roman"/>
@@ -1018,38 +1103,8 @@
               <w:rPr>
                 <w:rFonts w:ascii="Times New Roman" w:hAnsi="Times New Roman" w:cs="Times New Roman"/>
               </w:rPr>
-              <w:t>B11</w:t>
-            </w:r>
-          </w:p>
-        </w:tc>
-        <w:tc>
-          <w:tcPr>
-            <w:tcW w:w="6910" w:type="dxa"/>
-          </w:tcPr>
-          <w:p>
-            <w:pPr>
-              <w:rPr>
-                <w:rFonts w:ascii="Times New Roman" w:hAnsi="Times New Roman" w:cs="Times New Roman"/>
-              </w:rPr>
-            </w:pPr>
-            <w:r>
-              <w:rPr>
-                <w:rFonts w:ascii="Times New Roman" w:hAnsi="Times New Roman" w:cs="Times New Roman"/>
-              </w:rPr>
-              <w:t>Talk to 2 cybersecurity experts from the industry and find out their latest projects</w:t>
-            </w:r>
-          </w:p>
-        </w:tc>
-        <w:tc>
-          <w:tcPr>
-            <w:tcW w:w="941" w:type="dxa"/>
-          </w:tcPr>
-          <w:p>
-            <w:pPr>
-              <w:rPr>
-                <w:rFonts w:ascii="Times New Roman" w:hAnsi="Times New Roman" w:cs="Times New Roman"/>
-              </w:rPr>
-            </w:pPr>
+              <w:t>2</w:t>
+            </w:r>
           </w:p>
         </w:tc>
       </w:tr>
@@ -1060,43 +1115,45 @@
           </w:tcPr>
           <w:p>
             <w:pPr>
+              <w:jc w:val="both"/>
+              <w:rPr>
+                <w:rFonts w:ascii="Times New Roman" w:hAnsi="Times New Roman" w:cs="Times New Roman"/>
+              </w:rPr>
+            </w:pPr>
+            <w:r>
+              <w:rPr>
+                <w:rFonts w:ascii="Times New Roman" w:hAnsi="Times New Roman" w:cs="Times New Roman"/>
+              </w:rPr>
+              <w:t>B12</w:t>
+            </w:r>
+          </w:p>
+        </w:tc>
+        <w:tc>
+          <w:tcPr>
+            <w:tcW w:w="6910" w:type="dxa"/>
+          </w:tcPr>
+          <w:p>
+            <w:pPr>
+              <w:jc w:val="both"/>
+              <w:rPr>
+                <w:rFonts w:ascii="Times New Roman" w:hAnsi="Times New Roman" w:cs="Times New Roman"/>
+              </w:rPr>
+            </w:pPr>
+            <w:r>
+              <w:rPr>
+                <w:rFonts w:ascii="Times New Roman" w:hAnsi="Times New Roman" w:cs="Times New Roman"/>
+              </w:rPr>
+              <w:t>Discover two bias cases when using a generative AI system</w:t>
+            </w:r>
+          </w:p>
+        </w:tc>
+        <w:tc>
+          <w:tcPr>
+            <w:tcW w:w="941" w:type="dxa"/>
+          </w:tcPr>
+          <w:p>
+            <w:pPr>
               <w:jc w:val="center"/>
-              <w:rPr>
-                <w:rFonts w:ascii="Times New Roman" w:hAnsi="Times New Roman" w:cs="Times New Roman"/>
-              </w:rPr>
-            </w:pPr>
-            <w:r>
-              <w:rPr>
-                <w:rFonts w:ascii="Times New Roman" w:hAnsi="Times New Roman" w:cs="Times New Roman"/>
-              </w:rPr>
-              <w:t>B12</w:t>
-            </w:r>
-          </w:p>
-        </w:tc>
-        <w:tc>
-          <w:tcPr>
-            <w:tcW w:w="6910" w:type="dxa"/>
-          </w:tcPr>
-          <w:p>
-            <w:pPr>
-              <w:rPr>
-                <w:rFonts w:ascii="Times New Roman" w:hAnsi="Times New Roman" w:cs="Times New Roman"/>
-              </w:rPr>
-            </w:pPr>
-            <w:r>
-              <w:rPr>
-                <w:rFonts w:ascii="Times New Roman" w:hAnsi="Times New Roman" w:cs="Times New Roman"/>
-              </w:rPr>
-              <w:t>Discover two bias cases when using a generative AI system</w:t>
-            </w:r>
-          </w:p>
-        </w:tc>
-        <w:tc>
-          <w:tcPr>
-            <w:tcW w:w="941" w:type="dxa"/>
-          </w:tcPr>
-          <w:p>
-            <w:pPr>
               <w:rPr>
                 <w:rFonts w:ascii="Times New Roman" w:hAnsi="Times New Roman" w:cs="Times New Roman"/>
               </w:rPr>
@@ -1111,43 +1168,45 @@
           </w:tcPr>
           <w:p>
             <w:pPr>
+              <w:jc w:val="both"/>
+              <w:rPr>
+                <w:rFonts w:ascii="Times New Roman" w:hAnsi="Times New Roman" w:cs="Times New Roman"/>
+              </w:rPr>
+            </w:pPr>
+            <w:r>
+              <w:rPr>
+                <w:rFonts w:ascii="Times New Roman" w:hAnsi="Times New Roman" w:cs="Times New Roman"/>
+              </w:rPr>
+              <w:t>B13</w:t>
+            </w:r>
+          </w:p>
+        </w:tc>
+        <w:tc>
+          <w:tcPr>
+            <w:tcW w:w="6910" w:type="dxa"/>
+          </w:tcPr>
+          <w:p>
+            <w:pPr>
+              <w:jc w:val="both"/>
+              <w:rPr>
+                <w:rFonts w:ascii="Times New Roman" w:hAnsi="Times New Roman" w:cs="Times New Roman"/>
+              </w:rPr>
+            </w:pPr>
+            <w:r>
+              <w:rPr>
+                <w:rFonts w:ascii="Times New Roman" w:hAnsi="Times New Roman" w:cs="Times New Roman"/>
+              </w:rPr>
+              <w:t>Perform a jailbreak attack on a generative AI assistant (controlled test only)</w:t>
+            </w:r>
+          </w:p>
+        </w:tc>
+        <w:tc>
+          <w:tcPr>
+            <w:tcW w:w="941" w:type="dxa"/>
+          </w:tcPr>
+          <w:p>
+            <w:pPr>
               <w:jc w:val="center"/>
-              <w:rPr>
-                <w:rFonts w:ascii="Times New Roman" w:hAnsi="Times New Roman" w:cs="Times New Roman"/>
-              </w:rPr>
-            </w:pPr>
-            <w:r>
-              <w:rPr>
-                <w:rFonts w:ascii="Times New Roman" w:hAnsi="Times New Roman" w:cs="Times New Roman"/>
-              </w:rPr>
-              <w:t>B13</w:t>
-            </w:r>
-          </w:p>
-        </w:tc>
-        <w:tc>
-          <w:tcPr>
-            <w:tcW w:w="6910" w:type="dxa"/>
-          </w:tcPr>
-          <w:p>
-            <w:pPr>
-              <w:rPr>
-                <w:rFonts w:ascii="Times New Roman" w:hAnsi="Times New Roman" w:cs="Times New Roman"/>
-              </w:rPr>
-            </w:pPr>
-            <w:r>
-              <w:rPr>
-                <w:rFonts w:ascii="Times New Roman" w:hAnsi="Times New Roman" w:cs="Times New Roman"/>
-              </w:rPr>
-              <w:t>Perform a jailbreak attack on a generative AI assistant (controlled test only)</w:t>
-            </w:r>
-          </w:p>
-        </w:tc>
-        <w:tc>
-          <w:tcPr>
-            <w:tcW w:w="941" w:type="dxa"/>
-          </w:tcPr>
-          <w:p>
-            <w:pPr>
               <w:rPr>
                 <w:rFonts w:ascii="Times New Roman" w:hAnsi="Times New Roman" w:cs="Times New Roman"/>
               </w:rPr>
@@ -1162,6 +1221,44 @@
           </w:tcPr>
           <w:p>
             <w:pPr>
+              <w:jc w:val="both"/>
+              <w:rPr>
+                <w:rFonts w:ascii="Times New Roman" w:hAnsi="Times New Roman" w:cs="Times New Roman"/>
+              </w:rPr>
+            </w:pPr>
+            <w:r>
+              <w:rPr>
+                <w:rFonts w:ascii="Times New Roman" w:hAnsi="Times New Roman" w:cs="Times New Roman"/>
+              </w:rPr>
+              <w:t>B14</w:t>
+            </w:r>
+          </w:p>
+        </w:tc>
+        <w:tc>
+          <w:tcPr>
+            <w:tcW w:w="6910" w:type="dxa"/>
+          </w:tcPr>
+          <w:p>
+            <w:pPr>
+              <w:jc w:val="both"/>
+              <w:rPr>
+                <w:rFonts w:ascii="Times New Roman" w:hAnsi="Times New Roman" w:cs="Times New Roman"/>
+              </w:rPr>
+            </w:pPr>
+            <w:r>
+              <w:rPr>
+                <w:rFonts w:ascii="Times New Roman" w:hAnsi="Times New Roman" w:cs="Times New Roman"/>
+              </w:rPr>
+              <w:t>Teach your friends about cybersecurity topic of your choice</w:t>
+            </w:r>
+          </w:p>
+        </w:tc>
+        <w:tc>
+          <w:tcPr>
+            <w:tcW w:w="941" w:type="dxa"/>
+          </w:tcPr>
+          <w:p>
+            <w:pPr>
               <w:jc w:val="center"/>
               <w:rPr>
                 <w:rFonts w:ascii="Times New Roman" w:hAnsi="Times New Roman" w:cs="Times New Roman"/>
@@ -1171,38 +1268,8 @@
               <w:rPr>
                 <w:rFonts w:ascii="Times New Roman" w:hAnsi="Times New Roman" w:cs="Times New Roman"/>
               </w:rPr>
-              <w:t>B14</w:t>
-            </w:r>
-          </w:p>
-        </w:tc>
-        <w:tc>
-          <w:tcPr>
-            <w:tcW w:w="6910" w:type="dxa"/>
-          </w:tcPr>
-          <w:p>
-            <w:pPr>
-              <w:rPr>
-                <w:rFonts w:ascii="Times New Roman" w:hAnsi="Times New Roman" w:cs="Times New Roman"/>
-              </w:rPr>
-            </w:pPr>
-            <w:r>
-              <w:rPr>
-                <w:rFonts w:ascii="Times New Roman" w:hAnsi="Times New Roman" w:cs="Times New Roman"/>
-              </w:rPr>
-              <w:t>Teach your friends about cybersecurity topic of your choice</w:t>
-            </w:r>
-          </w:p>
-        </w:tc>
-        <w:tc>
-          <w:tcPr>
-            <w:tcW w:w="941" w:type="dxa"/>
-          </w:tcPr>
-          <w:p>
-            <w:pPr>
-              <w:rPr>
-                <w:rFonts w:ascii="Times New Roman" w:hAnsi="Times New Roman" w:cs="Times New Roman"/>
-              </w:rPr>
-            </w:pPr>
+              <w:t>In Prog.</w:t>
+            </w:r>
           </w:p>
         </w:tc>
       </w:tr>
@@ -1213,43 +1280,45 @@
           </w:tcPr>
           <w:p>
             <w:pPr>
+              <w:jc w:val="both"/>
+              <w:rPr>
+                <w:rFonts w:ascii="Times New Roman" w:hAnsi="Times New Roman" w:cs="Times New Roman"/>
+              </w:rPr>
+            </w:pPr>
+            <w:r>
+              <w:rPr>
+                <w:rFonts w:ascii="Times New Roman" w:hAnsi="Times New Roman" w:cs="Times New Roman"/>
+              </w:rPr>
+              <w:t>B15</w:t>
+            </w:r>
+          </w:p>
+        </w:tc>
+        <w:tc>
+          <w:tcPr>
+            <w:tcW w:w="6910" w:type="dxa"/>
+          </w:tcPr>
+          <w:p>
+            <w:pPr>
+              <w:jc w:val="both"/>
+              <w:rPr>
+                <w:rFonts w:ascii="Times New Roman" w:hAnsi="Times New Roman" w:cs="Times New Roman"/>
+              </w:rPr>
+            </w:pPr>
+            <w:r>
+              <w:rPr>
+                <w:rFonts w:ascii="Times New Roman" w:hAnsi="Times New Roman" w:cs="Times New Roman"/>
+              </w:rPr>
+              <w:t>Teach an elderly person about cybersecurity topic of your choice</w:t>
+            </w:r>
+          </w:p>
+        </w:tc>
+        <w:tc>
+          <w:tcPr>
+            <w:tcW w:w="941" w:type="dxa"/>
+          </w:tcPr>
+          <w:p>
+            <w:pPr>
               <w:jc w:val="center"/>
-              <w:rPr>
-                <w:rFonts w:ascii="Times New Roman" w:hAnsi="Times New Roman" w:cs="Times New Roman"/>
-              </w:rPr>
-            </w:pPr>
-            <w:r>
-              <w:rPr>
-                <w:rFonts w:ascii="Times New Roman" w:hAnsi="Times New Roman" w:cs="Times New Roman"/>
-              </w:rPr>
-              <w:t>B15</w:t>
-            </w:r>
-          </w:p>
-        </w:tc>
-        <w:tc>
-          <w:tcPr>
-            <w:tcW w:w="6910" w:type="dxa"/>
-          </w:tcPr>
-          <w:p>
-            <w:pPr>
-              <w:rPr>
-                <w:rFonts w:ascii="Times New Roman" w:hAnsi="Times New Roman" w:cs="Times New Roman"/>
-              </w:rPr>
-            </w:pPr>
-            <w:r>
-              <w:rPr>
-                <w:rFonts w:ascii="Times New Roman" w:hAnsi="Times New Roman" w:cs="Times New Roman"/>
-              </w:rPr>
-              <w:t>Teach an elderly person about cybersecurity topic of your choice</w:t>
-            </w:r>
-          </w:p>
-        </w:tc>
-        <w:tc>
-          <w:tcPr>
-            <w:tcW w:w="941" w:type="dxa"/>
-          </w:tcPr>
-          <w:p>
-            <w:pPr>
               <w:rPr>
                 <w:rFonts w:ascii="Times New Roman" w:hAnsi="Times New Roman" w:cs="Times New Roman"/>
               </w:rPr>
@@ -1264,43 +1333,45 @@
           </w:tcPr>
           <w:p>
             <w:pPr>
+              <w:jc w:val="both"/>
+              <w:rPr>
+                <w:rFonts w:ascii="Times New Roman" w:hAnsi="Times New Roman" w:cs="Times New Roman"/>
+              </w:rPr>
+            </w:pPr>
+            <w:r>
+              <w:rPr>
+                <w:rFonts w:ascii="Times New Roman" w:hAnsi="Times New Roman" w:cs="Times New Roman"/>
+              </w:rPr>
+              <w:t>B16</w:t>
+            </w:r>
+          </w:p>
+        </w:tc>
+        <w:tc>
+          <w:tcPr>
+            <w:tcW w:w="6910" w:type="dxa"/>
+          </w:tcPr>
+          <w:p>
+            <w:pPr>
+              <w:jc w:val="both"/>
+              <w:rPr>
+                <w:rFonts w:ascii="Times New Roman" w:hAnsi="Times New Roman" w:cs="Times New Roman"/>
+              </w:rPr>
+            </w:pPr>
+            <w:r>
+              <w:rPr>
+                <w:rFonts w:ascii="Times New Roman" w:hAnsi="Times New Roman" w:cs="Times New Roman"/>
+              </w:rPr>
+              <w:t>Survey the current state-of-the-art solutions in cybersecurity</w:t>
+            </w:r>
+          </w:p>
+        </w:tc>
+        <w:tc>
+          <w:tcPr>
+            <w:tcW w:w="941" w:type="dxa"/>
+          </w:tcPr>
+          <w:p>
+            <w:pPr>
               <w:jc w:val="center"/>
-              <w:rPr>
-                <w:rFonts w:ascii="Times New Roman" w:hAnsi="Times New Roman" w:cs="Times New Roman"/>
-              </w:rPr>
-            </w:pPr>
-            <w:r>
-              <w:rPr>
-                <w:rFonts w:ascii="Times New Roman" w:hAnsi="Times New Roman" w:cs="Times New Roman"/>
-              </w:rPr>
-              <w:t>B16</w:t>
-            </w:r>
-          </w:p>
-        </w:tc>
-        <w:tc>
-          <w:tcPr>
-            <w:tcW w:w="6910" w:type="dxa"/>
-          </w:tcPr>
-          <w:p>
-            <w:pPr>
-              <w:rPr>
-                <w:rFonts w:ascii="Times New Roman" w:hAnsi="Times New Roman" w:cs="Times New Roman"/>
-              </w:rPr>
-            </w:pPr>
-            <w:r>
-              <w:rPr>
-                <w:rFonts w:ascii="Times New Roman" w:hAnsi="Times New Roman" w:cs="Times New Roman"/>
-              </w:rPr>
-              <w:t>Survey the current state-of-the-art solutions in cybersecurity</w:t>
-            </w:r>
-          </w:p>
-        </w:tc>
-        <w:tc>
-          <w:tcPr>
-            <w:tcW w:w="941" w:type="dxa"/>
-          </w:tcPr>
-          <w:p>
-            <w:pPr>
               <w:rPr>
                 <w:rFonts w:ascii="Times New Roman" w:hAnsi="Times New Roman" w:cs="Times New Roman"/>
               </w:rPr>
@@ -1315,43 +1386,45 @@
           </w:tcPr>
           <w:p>
             <w:pPr>
+              <w:jc w:val="both"/>
+              <w:rPr>
+                <w:rFonts w:ascii="Times New Roman" w:hAnsi="Times New Roman" w:cs="Times New Roman"/>
+              </w:rPr>
+            </w:pPr>
+            <w:r>
+              <w:rPr>
+                <w:rFonts w:ascii="Times New Roman" w:hAnsi="Times New Roman" w:cs="Times New Roman"/>
+              </w:rPr>
+              <w:t>B17</w:t>
+            </w:r>
+          </w:p>
+        </w:tc>
+        <w:tc>
+          <w:tcPr>
+            <w:tcW w:w="6910" w:type="dxa"/>
+          </w:tcPr>
+          <w:p>
+            <w:pPr>
+              <w:jc w:val="both"/>
+              <w:rPr>
+                <w:rFonts w:ascii="Times New Roman" w:hAnsi="Times New Roman" w:cs="Times New Roman"/>
+              </w:rPr>
+            </w:pPr>
+            <w:r>
+              <w:rPr>
+                <w:rFonts w:ascii="Times New Roman" w:hAnsi="Times New Roman" w:cs="Times New Roman"/>
+              </w:rPr>
+              <w:t>Implement one of the current state-of-the-art solutions and evaluate it</w:t>
+            </w:r>
+          </w:p>
+        </w:tc>
+        <w:tc>
+          <w:tcPr>
+            <w:tcW w:w="941" w:type="dxa"/>
+          </w:tcPr>
+          <w:p>
+            <w:pPr>
               <w:jc w:val="center"/>
-              <w:rPr>
-                <w:rFonts w:ascii="Times New Roman" w:hAnsi="Times New Roman" w:cs="Times New Roman"/>
-              </w:rPr>
-            </w:pPr>
-            <w:r>
-              <w:rPr>
-                <w:rFonts w:ascii="Times New Roman" w:hAnsi="Times New Roman" w:cs="Times New Roman"/>
-              </w:rPr>
-              <w:t>B17</w:t>
-            </w:r>
-          </w:p>
-        </w:tc>
-        <w:tc>
-          <w:tcPr>
-            <w:tcW w:w="6910" w:type="dxa"/>
-          </w:tcPr>
-          <w:p>
-            <w:pPr>
-              <w:rPr>
-                <w:rFonts w:ascii="Times New Roman" w:hAnsi="Times New Roman" w:cs="Times New Roman"/>
-              </w:rPr>
-            </w:pPr>
-            <w:r>
-              <w:rPr>
-                <w:rFonts w:ascii="Times New Roman" w:hAnsi="Times New Roman" w:cs="Times New Roman"/>
-              </w:rPr>
-              <w:t>Implement one of the current state-of-the-art solutions and evaluate it</w:t>
-            </w:r>
-          </w:p>
-        </w:tc>
-        <w:tc>
-          <w:tcPr>
-            <w:tcW w:w="941" w:type="dxa"/>
-          </w:tcPr>
-          <w:p>
-            <w:pPr>
               <w:rPr>
                 <w:rFonts w:ascii="Times New Roman" w:hAnsi="Times New Roman" w:cs="Times New Roman"/>
               </w:rPr>
@@ -1366,43 +1439,45 @@
           </w:tcPr>
           <w:p>
             <w:pPr>
+              <w:jc w:val="both"/>
+              <w:rPr>
+                <w:rFonts w:ascii="Times New Roman" w:hAnsi="Times New Roman" w:cs="Times New Roman"/>
+              </w:rPr>
+            </w:pPr>
+            <w:r>
+              <w:rPr>
+                <w:rFonts w:ascii="Times New Roman" w:hAnsi="Times New Roman" w:cs="Times New Roman"/>
+              </w:rPr>
+              <w:t>B18</w:t>
+            </w:r>
+          </w:p>
+        </w:tc>
+        <w:tc>
+          <w:tcPr>
+            <w:tcW w:w="6910" w:type="dxa"/>
+          </w:tcPr>
+          <w:p>
+            <w:pPr>
+              <w:jc w:val="both"/>
+              <w:rPr>
+                <w:rFonts w:ascii="Times New Roman" w:hAnsi="Times New Roman" w:cs="Times New Roman"/>
+              </w:rPr>
+            </w:pPr>
+            <w:r>
+              <w:rPr>
+                <w:rFonts w:ascii="Times New Roman" w:hAnsi="Times New Roman" w:cs="Times New Roman"/>
+              </w:rPr>
+              <w:t>Contribute to an open-source project related to cybersecurity</w:t>
+            </w:r>
+          </w:p>
+        </w:tc>
+        <w:tc>
+          <w:tcPr>
+            <w:tcW w:w="941" w:type="dxa"/>
+          </w:tcPr>
+          <w:p>
+            <w:pPr>
               <w:jc w:val="center"/>
-              <w:rPr>
-                <w:rFonts w:ascii="Times New Roman" w:hAnsi="Times New Roman" w:cs="Times New Roman"/>
-              </w:rPr>
-            </w:pPr>
-            <w:r>
-              <w:rPr>
-                <w:rFonts w:ascii="Times New Roman" w:hAnsi="Times New Roman" w:cs="Times New Roman"/>
-              </w:rPr>
-              <w:t>B18</w:t>
-            </w:r>
-          </w:p>
-        </w:tc>
-        <w:tc>
-          <w:tcPr>
-            <w:tcW w:w="6910" w:type="dxa"/>
-          </w:tcPr>
-          <w:p>
-            <w:pPr>
-              <w:rPr>
-                <w:rFonts w:ascii="Times New Roman" w:hAnsi="Times New Roman" w:cs="Times New Roman"/>
-              </w:rPr>
-            </w:pPr>
-            <w:r>
-              <w:rPr>
-                <w:rFonts w:ascii="Times New Roman" w:hAnsi="Times New Roman" w:cs="Times New Roman"/>
-              </w:rPr>
-              <w:t>Contribute to an open-source project related to cybersecurity</w:t>
-            </w:r>
-          </w:p>
-        </w:tc>
-        <w:tc>
-          <w:tcPr>
-            <w:tcW w:w="941" w:type="dxa"/>
-          </w:tcPr>
-          <w:p>
-            <w:pPr>
               <w:rPr>
                 <w:rFonts w:ascii="Times New Roman" w:hAnsi="Times New Roman" w:cs="Times New Roman"/>
               </w:rPr>
@@ -1417,43 +1492,45 @@
           </w:tcPr>
           <w:p>
             <w:pPr>
+              <w:jc w:val="both"/>
+              <w:rPr>
+                <w:rFonts w:ascii="Times New Roman" w:hAnsi="Times New Roman" w:cs="Times New Roman"/>
+              </w:rPr>
+            </w:pPr>
+            <w:r>
+              <w:rPr>
+                <w:rFonts w:ascii="Times New Roman" w:hAnsi="Times New Roman" w:cs="Times New Roman"/>
+              </w:rPr>
+              <w:t>B19</w:t>
+            </w:r>
+          </w:p>
+        </w:tc>
+        <w:tc>
+          <w:tcPr>
+            <w:tcW w:w="6910" w:type="dxa"/>
+          </w:tcPr>
+          <w:p>
+            <w:pPr>
+              <w:jc w:val="both"/>
+              <w:rPr>
+                <w:rFonts w:ascii="Times New Roman" w:hAnsi="Times New Roman" w:cs="Times New Roman"/>
+              </w:rPr>
+            </w:pPr>
+            <w:r>
+              <w:rPr>
+                <w:rFonts w:ascii="Times New Roman" w:hAnsi="Times New Roman" w:cs="Times New Roman"/>
+              </w:rPr>
+              <w:t>Find and fix a vulnerability from a GitHub project</w:t>
+            </w:r>
+          </w:p>
+        </w:tc>
+        <w:tc>
+          <w:tcPr>
+            <w:tcW w:w="941" w:type="dxa"/>
+          </w:tcPr>
+          <w:p>
+            <w:pPr>
               <w:jc w:val="center"/>
-              <w:rPr>
-                <w:rFonts w:ascii="Times New Roman" w:hAnsi="Times New Roman" w:cs="Times New Roman"/>
-              </w:rPr>
-            </w:pPr>
-            <w:r>
-              <w:rPr>
-                <w:rFonts w:ascii="Times New Roman" w:hAnsi="Times New Roman" w:cs="Times New Roman"/>
-              </w:rPr>
-              <w:t>B19</w:t>
-            </w:r>
-          </w:p>
-        </w:tc>
-        <w:tc>
-          <w:tcPr>
-            <w:tcW w:w="6910" w:type="dxa"/>
-          </w:tcPr>
-          <w:p>
-            <w:pPr>
-              <w:rPr>
-                <w:rFonts w:ascii="Times New Roman" w:hAnsi="Times New Roman" w:cs="Times New Roman"/>
-              </w:rPr>
-            </w:pPr>
-            <w:r>
-              <w:rPr>
-                <w:rFonts w:ascii="Times New Roman" w:hAnsi="Times New Roman" w:cs="Times New Roman"/>
-              </w:rPr>
-              <w:t>Find and fix a vulnerability from a GitHub project</w:t>
-            </w:r>
-          </w:p>
-        </w:tc>
-        <w:tc>
-          <w:tcPr>
-            <w:tcW w:w="941" w:type="dxa"/>
-          </w:tcPr>
-          <w:p>
-            <w:pPr>
               <w:rPr>
                 <w:rFonts w:ascii="Times New Roman" w:hAnsi="Times New Roman" w:cs="Times New Roman"/>
               </w:rPr>
@@ -1468,43 +1545,45 @@
           </w:tcPr>
           <w:p>
             <w:pPr>
+              <w:jc w:val="both"/>
+              <w:rPr>
+                <w:rFonts w:ascii="Times New Roman" w:hAnsi="Times New Roman" w:cs="Times New Roman"/>
+              </w:rPr>
+            </w:pPr>
+            <w:r>
+              <w:rPr>
+                <w:rFonts w:ascii="Times New Roman" w:hAnsi="Times New Roman" w:cs="Times New Roman"/>
+              </w:rPr>
+              <w:t>B20</w:t>
+            </w:r>
+          </w:p>
+        </w:tc>
+        <w:tc>
+          <w:tcPr>
+            <w:tcW w:w="6910" w:type="dxa"/>
+          </w:tcPr>
+          <w:p>
+            <w:pPr>
+              <w:jc w:val="both"/>
+              <w:rPr>
+                <w:rFonts w:ascii="Times New Roman" w:hAnsi="Times New Roman" w:cs="Times New Roman"/>
+              </w:rPr>
+            </w:pPr>
+            <w:r>
+              <w:rPr>
+                <w:rFonts w:ascii="Times New Roman" w:hAnsi="Times New Roman" w:cs="Times New Roman"/>
+              </w:rPr>
+              <w:t>Enhance the security of a GitHub project</w:t>
+            </w:r>
+          </w:p>
+        </w:tc>
+        <w:tc>
+          <w:tcPr>
+            <w:tcW w:w="941" w:type="dxa"/>
+          </w:tcPr>
+          <w:p>
+            <w:pPr>
               <w:jc w:val="center"/>
-              <w:rPr>
-                <w:rFonts w:ascii="Times New Roman" w:hAnsi="Times New Roman" w:cs="Times New Roman"/>
-              </w:rPr>
-            </w:pPr>
-            <w:r>
-              <w:rPr>
-                <w:rFonts w:ascii="Times New Roman" w:hAnsi="Times New Roman" w:cs="Times New Roman"/>
-              </w:rPr>
-              <w:t>B20</w:t>
-            </w:r>
-          </w:p>
-        </w:tc>
-        <w:tc>
-          <w:tcPr>
-            <w:tcW w:w="6910" w:type="dxa"/>
-          </w:tcPr>
-          <w:p>
-            <w:pPr>
-              <w:rPr>
-                <w:rFonts w:ascii="Times New Roman" w:hAnsi="Times New Roman" w:cs="Times New Roman"/>
-              </w:rPr>
-            </w:pPr>
-            <w:r>
-              <w:rPr>
-                <w:rFonts w:ascii="Times New Roman" w:hAnsi="Times New Roman" w:cs="Times New Roman"/>
-              </w:rPr>
-              <w:t>Enhance the security of a GitHub project</w:t>
-            </w:r>
-          </w:p>
-        </w:tc>
-        <w:tc>
-          <w:tcPr>
-            <w:tcW w:w="941" w:type="dxa"/>
-          </w:tcPr>
-          <w:p>
-            <w:pPr>
               <w:rPr>
                 <w:rFonts w:ascii="Times New Roman" w:hAnsi="Times New Roman" w:cs="Times New Roman"/>
               </w:rPr>
@@ -1519,43 +1598,45 @@
           </w:tcPr>
           <w:p>
             <w:pPr>
+              <w:jc w:val="both"/>
+              <w:rPr>
+                <w:rFonts w:ascii="Times New Roman" w:hAnsi="Times New Roman" w:cs="Times New Roman"/>
+              </w:rPr>
+            </w:pPr>
+            <w:r>
+              <w:rPr>
+                <w:rFonts w:ascii="Times New Roman" w:hAnsi="Times New Roman" w:cs="Times New Roman"/>
+              </w:rPr>
+              <w:t>B21</w:t>
+            </w:r>
+          </w:p>
+        </w:tc>
+        <w:tc>
+          <w:tcPr>
+            <w:tcW w:w="6910" w:type="dxa"/>
+          </w:tcPr>
+          <w:p>
+            <w:pPr>
+              <w:jc w:val="both"/>
+              <w:rPr>
+                <w:rFonts w:ascii="Times New Roman" w:hAnsi="Times New Roman" w:cs="Times New Roman"/>
+              </w:rPr>
+            </w:pPr>
+            <w:r>
+              <w:rPr>
+                <w:rFonts w:ascii="Times New Roman" w:hAnsi="Times New Roman" w:cs="Times New Roman"/>
+              </w:rPr>
+              <w:t>Design and implement a cybersecurity learning activity</w:t>
+            </w:r>
+          </w:p>
+        </w:tc>
+        <w:tc>
+          <w:tcPr>
+            <w:tcW w:w="941" w:type="dxa"/>
+          </w:tcPr>
+          <w:p>
+            <w:pPr>
               <w:jc w:val="center"/>
-              <w:rPr>
-                <w:rFonts w:ascii="Times New Roman" w:hAnsi="Times New Roman" w:cs="Times New Roman"/>
-              </w:rPr>
-            </w:pPr>
-            <w:r>
-              <w:rPr>
-                <w:rFonts w:ascii="Times New Roman" w:hAnsi="Times New Roman" w:cs="Times New Roman"/>
-              </w:rPr>
-              <w:t>B21</w:t>
-            </w:r>
-          </w:p>
-        </w:tc>
-        <w:tc>
-          <w:tcPr>
-            <w:tcW w:w="6910" w:type="dxa"/>
-          </w:tcPr>
-          <w:p>
-            <w:pPr>
-              <w:rPr>
-                <w:rFonts w:ascii="Times New Roman" w:hAnsi="Times New Roman" w:cs="Times New Roman"/>
-              </w:rPr>
-            </w:pPr>
-            <w:r>
-              <w:rPr>
-                <w:rFonts w:ascii="Times New Roman" w:hAnsi="Times New Roman" w:cs="Times New Roman"/>
-              </w:rPr>
-              <w:t>Design and implement a cybersecurity learning activity</w:t>
-            </w:r>
-          </w:p>
-        </w:tc>
-        <w:tc>
-          <w:tcPr>
-            <w:tcW w:w="941" w:type="dxa"/>
-          </w:tcPr>
-          <w:p>
-            <w:pPr>
               <w:rPr>
                 <w:rFonts w:ascii="Times New Roman" w:hAnsi="Times New Roman" w:cs="Times New Roman"/>
               </w:rPr>
@@ -1570,43 +1651,45 @@
           </w:tcPr>
           <w:p>
             <w:pPr>
+              <w:jc w:val="both"/>
+              <w:rPr>
+                <w:rFonts w:ascii="Times New Roman" w:hAnsi="Times New Roman" w:cs="Times New Roman"/>
+              </w:rPr>
+            </w:pPr>
+            <w:r>
+              <w:rPr>
+                <w:rFonts w:ascii="Times New Roman" w:hAnsi="Times New Roman" w:cs="Times New Roman"/>
+              </w:rPr>
+              <w:t>B22</w:t>
+            </w:r>
+          </w:p>
+        </w:tc>
+        <w:tc>
+          <w:tcPr>
+            <w:tcW w:w="6910" w:type="dxa"/>
+          </w:tcPr>
+          <w:p>
+            <w:pPr>
+              <w:jc w:val="both"/>
+              <w:rPr>
+                <w:rFonts w:ascii="Times New Roman" w:hAnsi="Times New Roman" w:cs="Times New Roman"/>
+              </w:rPr>
+            </w:pPr>
+            <w:r>
+              <w:rPr>
+                <w:rFonts w:ascii="Times New Roman" w:hAnsi="Times New Roman" w:cs="Times New Roman"/>
+              </w:rPr>
+              <w:t>Enhance the cybersecurity of a website from your community</w:t>
+            </w:r>
+          </w:p>
+        </w:tc>
+        <w:tc>
+          <w:tcPr>
+            <w:tcW w:w="941" w:type="dxa"/>
+          </w:tcPr>
+          <w:p>
+            <w:pPr>
               <w:jc w:val="center"/>
-              <w:rPr>
-                <w:rFonts w:ascii="Times New Roman" w:hAnsi="Times New Roman" w:cs="Times New Roman"/>
-              </w:rPr>
-            </w:pPr>
-            <w:r>
-              <w:rPr>
-                <w:rFonts w:ascii="Times New Roman" w:hAnsi="Times New Roman" w:cs="Times New Roman"/>
-              </w:rPr>
-              <w:t>B22</w:t>
-            </w:r>
-          </w:p>
-        </w:tc>
-        <w:tc>
-          <w:tcPr>
-            <w:tcW w:w="6910" w:type="dxa"/>
-          </w:tcPr>
-          <w:p>
-            <w:pPr>
-              <w:rPr>
-                <w:rFonts w:ascii="Times New Roman" w:hAnsi="Times New Roman" w:cs="Times New Roman"/>
-              </w:rPr>
-            </w:pPr>
-            <w:r>
-              <w:rPr>
-                <w:rFonts w:ascii="Times New Roman" w:hAnsi="Times New Roman" w:cs="Times New Roman"/>
-              </w:rPr>
-              <w:t>Enhance the cybersecurity of a website from your community</w:t>
-            </w:r>
-          </w:p>
-        </w:tc>
-        <w:tc>
-          <w:tcPr>
-            <w:tcW w:w="941" w:type="dxa"/>
-          </w:tcPr>
-          <w:p>
-            <w:pPr>
               <w:rPr>
                 <w:rFonts w:ascii="Times New Roman" w:hAnsi="Times New Roman" w:cs="Times New Roman"/>
               </w:rPr>
@@ -1621,43 +1704,45 @@
           </w:tcPr>
           <w:p>
             <w:pPr>
+              <w:jc w:val="both"/>
+              <w:rPr>
+                <w:rFonts w:ascii="Times New Roman" w:hAnsi="Times New Roman" w:cs="Times New Roman"/>
+              </w:rPr>
+            </w:pPr>
+            <w:r>
+              <w:rPr>
+                <w:rFonts w:ascii="Times New Roman" w:hAnsi="Times New Roman" w:cs="Times New Roman"/>
+              </w:rPr>
+              <w:t>B23</w:t>
+            </w:r>
+          </w:p>
+        </w:tc>
+        <w:tc>
+          <w:tcPr>
+            <w:tcW w:w="6910" w:type="dxa"/>
+          </w:tcPr>
+          <w:p>
+            <w:pPr>
+              <w:jc w:val="both"/>
+              <w:rPr>
+                <w:rFonts w:ascii="Times New Roman" w:hAnsi="Times New Roman" w:cs="Times New Roman"/>
+              </w:rPr>
+            </w:pPr>
+            <w:r>
+              <w:rPr>
+                <w:rFonts w:ascii="Times New Roman" w:hAnsi="Times New Roman" w:cs="Times New Roman"/>
+              </w:rPr>
+              <w:t>Test an intrusion detection system and discuss its effectiveness</w:t>
+            </w:r>
+          </w:p>
+        </w:tc>
+        <w:tc>
+          <w:tcPr>
+            <w:tcW w:w="941" w:type="dxa"/>
+          </w:tcPr>
+          <w:p>
+            <w:pPr>
               <w:jc w:val="center"/>
-              <w:rPr>
-                <w:rFonts w:ascii="Times New Roman" w:hAnsi="Times New Roman" w:cs="Times New Roman"/>
-              </w:rPr>
-            </w:pPr>
-            <w:r>
-              <w:rPr>
-                <w:rFonts w:ascii="Times New Roman" w:hAnsi="Times New Roman" w:cs="Times New Roman"/>
-              </w:rPr>
-              <w:t>B23</w:t>
-            </w:r>
-          </w:p>
-        </w:tc>
-        <w:tc>
-          <w:tcPr>
-            <w:tcW w:w="6910" w:type="dxa"/>
-          </w:tcPr>
-          <w:p>
-            <w:pPr>
-              <w:rPr>
-                <w:rFonts w:ascii="Times New Roman" w:hAnsi="Times New Roman" w:cs="Times New Roman"/>
-              </w:rPr>
-            </w:pPr>
-            <w:r>
-              <w:rPr>
-                <w:rFonts w:ascii="Times New Roman" w:hAnsi="Times New Roman" w:cs="Times New Roman"/>
-              </w:rPr>
-              <w:t>Test an intrusion detection system and discuss its effectiveness</w:t>
-            </w:r>
-          </w:p>
-        </w:tc>
-        <w:tc>
-          <w:tcPr>
-            <w:tcW w:w="941" w:type="dxa"/>
-          </w:tcPr>
-          <w:p>
-            <w:pPr>
               <w:rPr>
                 <w:rFonts w:ascii="Times New Roman" w:hAnsi="Times New Roman" w:cs="Times New Roman"/>
               </w:rPr>
@@ -1672,43 +1757,45 @@
           </w:tcPr>
           <w:p>
             <w:pPr>
+              <w:jc w:val="both"/>
+              <w:rPr>
+                <w:rFonts w:ascii="Times New Roman" w:hAnsi="Times New Roman" w:cs="Times New Roman"/>
+              </w:rPr>
+            </w:pPr>
+            <w:r>
+              <w:rPr>
+                <w:rFonts w:ascii="Times New Roman" w:hAnsi="Times New Roman" w:cs="Times New Roman"/>
+              </w:rPr>
+              <w:t>B24</w:t>
+            </w:r>
+          </w:p>
+        </w:tc>
+        <w:tc>
+          <w:tcPr>
+            <w:tcW w:w="6910" w:type="dxa"/>
+          </w:tcPr>
+          <w:p>
+            <w:pPr>
+              <w:jc w:val="both"/>
+              <w:rPr>
+                <w:rFonts w:ascii="Times New Roman" w:hAnsi="Times New Roman" w:cs="Times New Roman"/>
+              </w:rPr>
+            </w:pPr>
+            <w:r>
+              <w:rPr>
+                <w:rFonts w:ascii="Times New Roman" w:hAnsi="Times New Roman" w:cs="Times New Roman"/>
+              </w:rPr>
+              <w:t>Design and implement access control of your choice</w:t>
+            </w:r>
+          </w:p>
+        </w:tc>
+        <w:tc>
+          <w:tcPr>
+            <w:tcW w:w="941" w:type="dxa"/>
+          </w:tcPr>
+          <w:p>
+            <w:pPr>
               <w:jc w:val="center"/>
-              <w:rPr>
-                <w:rFonts w:ascii="Times New Roman" w:hAnsi="Times New Roman" w:cs="Times New Roman"/>
-              </w:rPr>
-            </w:pPr>
-            <w:r>
-              <w:rPr>
-                <w:rFonts w:ascii="Times New Roman" w:hAnsi="Times New Roman" w:cs="Times New Roman"/>
-              </w:rPr>
-              <w:t>B24</w:t>
-            </w:r>
-          </w:p>
-        </w:tc>
-        <w:tc>
-          <w:tcPr>
-            <w:tcW w:w="6910" w:type="dxa"/>
-          </w:tcPr>
-          <w:p>
-            <w:pPr>
-              <w:rPr>
-                <w:rFonts w:ascii="Times New Roman" w:hAnsi="Times New Roman" w:cs="Times New Roman"/>
-              </w:rPr>
-            </w:pPr>
-            <w:r>
-              <w:rPr>
-                <w:rFonts w:ascii="Times New Roman" w:hAnsi="Times New Roman" w:cs="Times New Roman"/>
-              </w:rPr>
-              <w:t>Design and implement access control of your choice</w:t>
-            </w:r>
-          </w:p>
-        </w:tc>
-        <w:tc>
-          <w:tcPr>
-            <w:tcW w:w="941" w:type="dxa"/>
-          </w:tcPr>
-          <w:p>
-            <w:pPr>
               <w:rPr>
                 <w:rFonts w:ascii="Times New Roman" w:hAnsi="Times New Roman" w:cs="Times New Roman"/>
               </w:rPr>
@@ -1723,43 +1810,45 @@
           </w:tcPr>
           <w:p>
             <w:pPr>
+              <w:jc w:val="both"/>
+              <w:rPr>
+                <w:rFonts w:ascii="Times New Roman" w:hAnsi="Times New Roman" w:cs="Times New Roman"/>
+              </w:rPr>
+            </w:pPr>
+            <w:r>
+              <w:rPr>
+                <w:rFonts w:ascii="Times New Roman" w:hAnsi="Times New Roman" w:cs="Times New Roman"/>
+              </w:rPr>
+              <w:t>B25</w:t>
+            </w:r>
+          </w:p>
+        </w:tc>
+        <w:tc>
+          <w:tcPr>
+            <w:tcW w:w="6910" w:type="dxa"/>
+          </w:tcPr>
+          <w:p>
+            <w:pPr>
+              <w:jc w:val="both"/>
+              <w:rPr>
+                <w:rFonts w:ascii="Times New Roman" w:hAnsi="Times New Roman" w:cs="Times New Roman"/>
+              </w:rPr>
+            </w:pPr>
+            <w:r>
+              <w:rPr>
+                <w:rFonts w:ascii="Times New Roman" w:hAnsi="Times New Roman" w:cs="Times New Roman"/>
+              </w:rPr>
+              <w:t>Design and implement a threat intelligence module of your choice</w:t>
+            </w:r>
+          </w:p>
+        </w:tc>
+        <w:tc>
+          <w:tcPr>
+            <w:tcW w:w="941" w:type="dxa"/>
+          </w:tcPr>
+          <w:p>
+            <w:pPr>
               <w:jc w:val="center"/>
-              <w:rPr>
-                <w:rFonts w:ascii="Times New Roman" w:hAnsi="Times New Roman" w:cs="Times New Roman"/>
-              </w:rPr>
-            </w:pPr>
-            <w:r>
-              <w:rPr>
-                <w:rFonts w:ascii="Times New Roman" w:hAnsi="Times New Roman" w:cs="Times New Roman"/>
-              </w:rPr>
-              <w:t>B25</w:t>
-            </w:r>
-          </w:p>
-        </w:tc>
-        <w:tc>
-          <w:tcPr>
-            <w:tcW w:w="6910" w:type="dxa"/>
-          </w:tcPr>
-          <w:p>
-            <w:pPr>
-              <w:rPr>
-                <w:rFonts w:ascii="Times New Roman" w:hAnsi="Times New Roman" w:cs="Times New Roman"/>
-              </w:rPr>
-            </w:pPr>
-            <w:r>
-              <w:rPr>
-                <w:rFonts w:ascii="Times New Roman" w:hAnsi="Times New Roman" w:cs="Times New Roman"/>
-              </w:rPr>
-              <w:t>Design and implement a threat intelligence module of your choice</w:t>
-            </w:r>
-          </w:p>
-        </w:tc>
-        <w:tc>
-          <w:tcPr>
-            <w:tcW w:w="941" w:type="dxa"/>
-          </w:tcPr>
-          <w:p>
-            <w:pPr>
               <w:rPr>
                 <w:rFonts w:ascii="Times New Roman" w:hAnsi="Times New Roman" w:cs="Times New Roman"/>
               </w:rPr>
@@ -1774,6 +1863,44 @@
           </w:tcPr>
           <w:p>
             <w:pPr>
+              <w:jc w:val="both"/>
+              <w:rPr>
+                <w:rFonts w:ascii="Times New Roman" w:hAnsi="Times New Roman" w:cs="Times New Roman"/>
+              </w:rPr>
+            </w:pPr>
+            <w:r>
+              <w:rPr>
+                <w:rFonts w:ascii="Times New Roman" w:hAnsi="Times New Roman" w:cs="Times New Roman"/>
+              </w:rPr>
+              <w:t>B26</w:t>
+            </w:r>
+          </w:p>
+        </w:tc>
+        <w:tc>
+          <w:tcPr>
+            <w:tcW w:w="6910" w:type="dxa"/>
+          </w:tcPr>
+          <w:p>
+            <w:pPr>
+              <w:jc w:val="both"/>
+              <w:rPr>
+                <w:rFonts w:ascii="Times New Roman" w:hAnsi="Times New Roman" w:cs="Times New Roman"/>
+              </w:rPr>
+            </w:pPr>
+            <w:r>
+              <w:rPr>
+                <w:rFonts w:ascii="Times New Roman" w:hAnsi="Times New Roman" w:cs="Times New Roman"/>
+              </w:rPr>
+              <w:t>Help another student in this unit struggling to understand/learn a cybersecurity concept</w:t>
+            </w:r>
+          </w:p>
+        </w:tc>
+        <w:tc>
+          <w:tcPr>
+            <w:tcW w:w="941" w:type="dxa"/>
+          </w:tcPr>
+          <w:p>
+            <w:pPr>
               <w:jc w:val="center"/>
               <w:rPr>
                 <w:rFonts w:ascii="Times New Roman" w:hAnsi="Times New Roman" w:cs="Times New Roman"/>
@@ -1783,38 +1910,8 @@
               <w:rPr>
                 <w:rFonts w:ascii="Times New Roman" w:hAnsi="Times New Roman" w:cs="Times New Roman"/>
               </w:rPr>
-              <w:t>B26</w:t>
-            </w:r>
-          </w:p>
-        </w:tc>
-        <w:tc>
-          <w:tcPr>
-            <w:tcW w:w="6910" w:type="dxa"/>
-          </w:tcPr>
-          <w:p>
-            <w:pPr>
-              <w:rPr>
-                <w:rFonts w:ascii="Times New Roman" w:hAnsi="Times New Roman" w:cs="Times New Roman"/>
-              </w:rPr>
-            </w:pPr>
-            <w:r>
-              <w:rPr>
-                <w:rFonts w:ascii="Times New Roman" w:hAnsi="Times New Roman" w:cs="Times New Roman"/>
-              </w:rPr>
-              <w:t>Help another student in this unit struggling to understand/learn a cybersecurity concept</w:t>
-            </w:r>
-          </w:p>
-        </w:tc>
-        <w:tc>
-          <w:tcPr>
-            <w:tcW w:w="941" w:type="dxa"/>
-          </w:tcPr>
-          <w:p>
-            <w:pPr>
-              <w:rPr>
-                <w:rFonts w:ascii="Times New Roman" w:hAnsi="Times New Roman" w:cs="Times New Roman"/>
-              </w:rPr>
-            </w:pPr>
+              <w:t>2</w:t>
+            </w:r>
           </w:p>
         </w:tc>
       </w:tr>
@@ -1825,43 +1922,45 @@
           </w:tcPr>
           <w:p>
             <w:pPr>
+              <w:jc w:val="both"/>
+              <w:rPr>
+                <w:rFonts w:ascii="Times New Roman" w:hAnsi="Times New Roman" w:cs="Times New Roman"/>
+              </w:rPr>
+            </w:pPr>
+            <w:r>
+              <w:rPr>
+                <w:rFonts w:ascii="Times New Roman" w:hAnsi="Times New Roman" w:cs="Times New Roman"/>
+              </w:rPr>
+              <w:t>B27</w:t>
+            </w:r>
+          </w:p>
+        </w:tc>
+        <w:tc>
+          <w:tcPr>
+            <w:tcW w:w="6910" w:type="dxa"/>
+          </w:tcPr>
+          <w:p>
+            <w:pPr>
+              <w:jc w:val="both"/>
+              <w:rPr>
+                <w:rFonts w:ascii="Times New Roman" w:hAnsi="Times New Roman" w:cs="Times New Roman"/>
+              </w:rPr>
+            </w:pPr>
+            <w:r>
+              <w:rPr>
+                <w:rFonts w:ascii="Times New Roman" w:hAnsi="Times New Roman" w:cs="Times New Roman"/>
+              </w:rPr>
+              <w:t>Apply a learned concept in this unit to a real-world application/problem/environment</w:t>
+            </w:r>
+          </w:p>
+        </w:tc>
+        <w:tc>
+          <w:tcPr>
+            <w:tcW w:w="941" w:type="dxa"/>
+          </w:tcPr>
+          <w:p>
+            <w:pPr>
               <w:jc w:val="center"/>
-              <w:rPr>
-                <w:rFonts w:ascii="Times New Roman" w:hAnsi="Times New Roman" w:cs="Times New Roman"/>
-              </w:rPr>
-            </w:pPr>
-            <w:r>
-              <w:rPr>
-                <w:rFonts w:ascii="Times New Roman" w:hAnsi="Times New Roman" w:cs="Times New Roman"/>
-              </w:rPr>
-              <w:t>B27</w:t>
-            </w:r>
-          </w:p>
-        </w:tc>
-        <w:tc>
-          <w:tcPr>
-            <w:tcW w:w="6910" w:type="dxa"/>
-          </w:tcPr>
-          <w:p>
-            <w:pPr>
-              <w:rPr>
-                <w:rFonts w:ascii="Times New Roman" w:hAnsi="Times New Roman" w:cs="Times New Roman"/>
-              </w:rPr>
-            </w:pPr>
-            <w:r>
-              <w:rPr>
-                <w:rFonts w:ascii="Times New Roman" w:hAnsi="Times New Roman" w:cs="Times New Roman"/>
-              </w:rPr>
-              <w:t>Apply a learned concept in this unit to a real-world application/problem/environment</w:t>
-            </w:r>
-          </w:p>
-        </w:tc>
-        <w:tc>
-          <w:tcPr>
-            <w:tcW w:w="941" w:type="dxa"/>
-          </w:tcPr>
-          <w:p>
-            <w:pPr>
               <w:rPr>
                 <w:rFonts w:ascii="Times New Roman" w:hAnsi="Times New Roman" w:cs="Times New Roman"/>
               </w:rPr>
@@ -1876,43 +1975,45 @@
           </w:tcPr>
           <w:p>
             <w:pPr>
+              <w:jc w:val="both"/>
+              <w:rPr>
+                <w:rFonts w:ascii="Times New Roman" w:hAnsi="Times New Roman" w:cs="Times New Roman"/>
+              </w:rPr>
+            </w:pPr>
+            <w:r>
+              <w:rPr>
+                <w:rFonts w:ascii="Times New Roman" w:hAnsi="Times New Roman" w:cs="Times New Roman"/>
+              </w:rPr>
+              <w:t>B28</w:t>
+            </w:r>
+          </w:p>
+        </w:tc>
+        <w:tc>
+          <w:tcPr>
+            <w:tcW w:w="6910" w:type="dxa"/>
+          </w:tcPr>
+          <w:p>
+            <w:pPr>
+              <w:jc w:val="both"/>
+              <w:rPr>
+                <w:rFonts w:ascii="Times New Roman" w:hAnsi="Times New Roman" w:cs="Times New Roman"/>
+              </w:rPr>
+            </w:pPr>
+            <w:r>
+              <w:rPr>
+                <w:rFonts w:ascii="Times New Roman" w:hAnsi="Times New Roman" w:cs="Times New Roman"/>
+              </w:rPr>
+              <w:t>Produce a cyber safety flyer for (choose 1): elders, high school students, CEOs, Uni students</w:t>
+            </w:r>
+          </w:p>
+        </w:tc>
+        <w:tc>
+          <w:tcPr>
+            <w:tcW w:w="941" w:type="dxa"/>
+          </w:tcPr>
+          <w:p>
+            <w:pPr>
               <w:jc w:val="center"/>
-              <w:rPr>
-                <w:rFonts w:ascii="Times New Roman" w:hAnsi="Times New Roman" w:cs="Times New Roman"/>
-              </w:rPr>
-            </w:pPr>
-            <w:r>
-              <w:rPr>
-                <w:rFonts w:ascii="Times New Roman" w:hAnsi="Times New Roman" w:cs="Times New Roman"/>
-              </w:rPr>
-              <w:t>B28</w:t>
-            </w:r>
-          </w:p>
-        </w:tc>
-        <w:tc>
-          <w:tcPr>
-            <w:tcW w:w="6910" w:type="dxa"/>
-          </w:tcPr>
-          <w:p>
-            <w:pPr>
-              <w:rPr>
-                <w:rFonts w:ascii="Times New Roman" w:hAnsi="Times New Roman" w:cs="Times New Roman"/>
-              </w:rPr>
-            </w:pPr>
-            <w:r>
-              <w:rPr>
-                <w:rFonts w:ascii="Times New Roman" w:hAnsi="Times New Roman" w:cs="Times New Roman"/>
-              </w:rPr>
-              <w:t>Produce a cyber safety flyer for (choose 1): elders, high school students, CEOs, Uni students</w:t>
-            </w:r>
-          </w:p>
-        </w:tc>
-        <w:tc>
-          <w:tcPr>
-            <w:tcW w:w="941" w:type="dxa"/>
-          </w:tcPr>
-          <w:p>
-            <w:pPr>
               <w:rPr>
                 <w:rFonts w:ascii="Times New Roman" w:hAnsi="Times New Roman" w:cs="Times New Roman"/>
               </w:rPr>
@@ -1927,55 +2028,57 @@
           </w:tcPr>
           <w:p>
             <w:pPr>
+              <w:jc w:val="both"/>
+              <w:rPr>
+                <w:rFonts w:ascii="Times New Roman" w:hAnsi="Times New Roman" w:cs="Times New Roman"/>
+              </w:rPr>
+            </w:pPr>
+            <w:r>
+              <w:rPr>
+                <w:rFonts w:ascii="Times New Roman" w:hAnsi="Times New Roman" w:cs="Times New Roman"/>
+              </w:rPr>
+              <w:t>B29</w:t>
+            </w:r>
+          </w:p>
+        </w:tc>
+        <w:tc>
+          <w:tcPr>
+            <w:tcW w:w="6910" w:type="dxa"/>
+          </w:tcPr>
+          <w:p>
+            <w:pPr>
+              <w:jc w:val="both"/>
+              <w:rPr>
+                <w:rFonts w:ascii="Times New Roman" w:hAnsi="Times New Roman" w:cs="Times New Roman"/>
+              </w:rPr>
+            </w:pPr>
+            <w:r>
+              <w:rPr>
+                <w:rFonts w:ascii="Times New Roman" w:hAnsi="Times New Roman" w:cs="Times New Roman"/>
+              </w:rPr>
+              <w:t>Find a CVE in this year and fix it using three different generative AI systems (e</w:t>
+            </w:r>
+            <w:r>
+              <w:rPr>
+                <w:rFonts w:ascii="Times New Roman" w:hAnsi="Times New Roman" w:cs="Times New Roman"/>
+              </w:rPr>
+              <w:t>.g.</w:t>
+            </w:r>
+            <w:r>
+              <w:rPr>
+                <w:rFonts w:ascii="Times New Roman" w:hAnsi="Times New Roman" w:cs="Times New Roman"/>
+              </w:rPr>
+              <w:t xml:space="preserve"> ChatGPT, Gemini), comparing the consistency</w:t>
+            </w:r>
+          </w:p>
+        </w:tc>
+        <w:tc>
+          <w:tcPr>
+            <w:tcW w:w="941" w:type="dxa"/>
+          </w:tcPr>
+          <w:p>
+            <w:pPr>
               <w:jc w:val="center"/>
-              <w:rPr>
-                <w:rFonts w:ascii="Times New Roman" w:hAnsi="Times New Roman" w:cs="Times New Roman"/>
-              </w:rPr>
-            </w:pPr>
-            <w:r>
-              <w:rPr>
-                <w:rFonts w:ascii="Times New Roman" w:hAnsi="Times New Roman" w:cs="Times New Roman"/>
-              </w:rPr>
-              <w:t>B29</w:t>
-            </w:r>
-          </w:p>
-        </w:tc>
-        <w:tc>
-          <w:tcPr>
-            <w:tcW w:w="6910" w:type="dxa"/>
-          </w:tcPr>
-          <w:p>
-            <w:pPr>
-              <w:rPr>
-                <w:rFonts w:ascii="Times New Roman" w:hAnsi="Times New Roman" w:cs="Times New Roman"/>
-              </w:rPr>
-            </w:pPr>
-            <w:r>
-              <w:rPr>
-                <w:rFonts w:ascii="Times New Roman" w:hAnsi="Times New Roman" w:cs="Times New Roman"/>
-              </w:rPr>
-              <w:t>Find a CVE in this year and fix it using three different generative AI systems (e</w:t>
-            </w:r>
-            <w:r>
-              <w:rPr>
-                <w:rFonts w:ascii="Times New Roman" w:hAnsi="Times New Roman" w:cs="Times New Roman"/>
-              </w:rPr>
-              <w:t>.g.</w:t>
-            </w:r>
-            <w:r>
-              <w:rPr>
-                <w:rFonts w:ascii="Times New Roman" w:hAnsi="Times New Roman" w:cs="Times New Roman"/>
-              </w:rPr>
-              <w:t xml:space="preserve"> ChatGPT, Gemini), comparing the consistency</w:t>
-            </w:r>
-          </w:p>
-        </w:tc>
-        <w:tc>
-          <w:tcPr>
-            <w:tcW w:w="941" w:type="dxa"/>
-          </w:tcPr>
-          <w:p>
-            <w:pPr>
               <w:rPr>
                 <w:rFonts w:ascii="Times New Roman" w:hAnsi="Times New Roman" w:cs="Times New Roman"/>
               </w:rPr>
@@ -1990,43 +2093,45 @@
           </w:tcPr>
           <w:p>
             <w:pPr>
+              <w:jc w:val="both"/>
+              <w:rPr>
+                <w:rFonts w:ascii="Times New Roman" w:hAnsi="Times New Roman" w:cs="Times New Roman"/>
+              </w:rPr>
+            </w:pPr>
+            <w:r>
+              <w:rPr>
+                <w:rFonts w:ascii="Times New Roman" w:hAnsi="Times New Roman" w:cs="Times New Roman"/>
+              </w:rPr>
+              <w:t>B30</w:t>
+            </w:r>
+          </w:p>
+        </w:tc>
+        <w:tc>
+          <w:tcPr>
+            <w:tcW w:w="6910" w:type="dxa"/>
+          </w:tcPr>
+          <w:p>
+            <w:pPr>
+              <w:jc w:val="both"/>
+              <w:rPr>
+                <w:rFonts w:ascii="Times New Roman" w:hAnsi="Times New Roman" w:cs="Times New Roman"/>
+              </w:rPr>
+            </w:pPr>
+            <w:r>
+              <w:rPr>
+                <w:rFonts w:ascii="Times New Roman" w:hAnsi="Times New Roman" w:cs="Times New Roman"/>
+              </w:rPr>
+              <w:t>Generate an AI-created image, applying an imperceptible watermark on it and then perform an image-to-image regeneration or editing process to make sure the watermark is detectable---the watermark survives</w:t>
+            </w:r>
+          </w:p>
+        </w:tc>
+        <w:tc>
+          <w:tcPr>
+            <w:tcW w:w="941" w:type="dxa"/>
+          </w:tcPr>
+          <w:p>
+            <w:pPr>
               <w:jc w:val="center"/>
-              <w:rPr>
-                <w:rFonts w:ascii="Times New Roman" w:hAnsi="Times New Roman" w:cs="Times New Roman"/>
-              </w:rPr>
-            </w:pPr>
-            <w:r>
-              <w:rPr>
-                <w:rFonts w:ascii="Times New Roman" w:hAnsi="Times New Roman" w:cs="Times New Roman"/>
-              </w:rPr>
-              <w:t>B30</w:t>
-            </w:r>
-          </w:p>
-        </w:tc>
-        <w:tc>
-          <w:tcPr>
-            <w:tcW w:w="6910" w:type="dxa"/>
-          </w:tcPr>
-          <w:p>
-            <w:pPr>
-              <w:rPr>
-                <w:rFonts w:ascii="Times New Roman" w:hAnsi="Times New Roman" w:cs="Times New Roman"/>
-              </w:rPr>
-            </w:pPr>
-            <w:r>
-              <w:rPr>
-                <w:rFonts w:ascii="Times New Roman" w:hAnsi="Times New Roman" w:cs="Times New Roman"/>
-              </w:rPr>
-              <w:t>Generate an AI-created image, applying an imperceptible watermark on it and then perform an image-to-image regeneration or editing process to make sure the watermark is detectable---the watermark survives</w:t>
-            </w:r>
-          </w:p>
-        </w:tc>
-        <w:tc>
-          <w:tcPr>
-            <w:tcW w:w="941" w:type="dxa"/>
-          </w:tcPr>
-          <w:p>
-            <w:pPr>
               <w:rPr>
                 <w:rFonts w:ascii="Times New Roman" w:hAnsi="Times New Roman" w:cs="Times New Roman"/>
               </w:rPr>
@@ -2037,17 +2142,49 @@
     </w:tbl>
     <w:p>
       <w:pPr>
-        <w:rPr>
-          <w:rFonts w:ascii="Times New Roman" w:hAnsi="Times New Roman" w:cs="Times New Roman"/>
-          <w:b/>
-          <w:bCs/>
-          <w:sz w:val="40"/>
-          <w:szCs w:val="40"/>
-        </w:rPr>
-      </w:pPr>
-    </w:p>
-    <w:p>
-      <w:pPr>
+        <w:jc w:val="both"/>
+        <w:rPr>
+          <w:rFonts w:ascii="Times New Roman" w:hAnsi="Times New Roman" w:cs="Times New Roman"/>
+        </w:rPr>
+      </w:pPr>
+      <w:r>
+        <w:rPr>
+          <w:rFonts w:ascii="Times New Roman" w:hAnsi="Times New Roman" w:cs="Times New Roman"/>
+        </w:rPr>
+        <w:t xml:space="preserve">Done: 2/25 </w:t>
+      </w:r>
+    </w:p>
+    <w:p>
+      <w:pPr>
+        <w:jc w:val="both"/>
+        <w:rPr>
+          <w:rFonts w:ascii="Times New Roman" w:hAnsi="Times New Roman" w:cs="Times New Roman"/>
+        </w:rPr>
+      </w:pPr>
+      <w:r>
+        <w:rPr>
+          <w:rFonts w:ascii="Times New Roman" w:hAnsi="Times New Roman" w:cs="Times New Roman"/>
+        </w:rPr>
+        <w:t>In Progress:</w:t>
+      </w:r>
+      <w:r>
+        <w:rPr>
+          <w:rFonts w:ascii="Times New Roman" w:hAnsi="Times New Roman" w:cs="Times New Roman"/>
+        </w:rPr>
+        <w:t xml:space="preserve"> 4</w:t>
+      </w:r>
+    </w:p>
+    <w:p>
+      <w:pPr>
+        <w:jc w:val="both"/>
+        <w:rPr>
+          <w:rFonts w:ascii="Times New Roman" w:hAnsi="Times New Roman" w:cs="Times New Roman"/>
+        </w:rPr>
+      </w:pPr>
+    </w:p>
+    <w:p>
+      <w:pPr>
+        <w:jc w:val="both"/>
         <w:rPr>
           <w:rFonts w:ascii="Times New Roman" w:hAnsi="Times New Roman" w:cs="Times New Roman"/>
           <w:b/>
@@ -2090,6 +2227,7 @@
     </w:p>
     <w:p>
       <w:pPr>
+        <w:jc w:val="both"/>
         <w:rPr>
           <w:rFonts w:ascii="Times New Roman" w:hAnsi="Times New Roman" w:cs="Times New Roman"/>
           <w:b/>
@@ -2151,6 +2289,7 @@
     </w:p>
     <w:p>
       <w:pPr>
+        <w:jc w:val="both"/>
         <w:rPr>
           <w:rFonts w:ascii="Times New Roman" w:hAnsi="Times New Roman" w:cs="Times New Roman"/>
         </w:rPr>
@@ -2176,6 +2315,7 @@
     </w:p>
     <w:p>
       <w:pPr>
+        <w:jc w:val="both"/>
         <w:rPr>
           <w:rFonts w:ascii="Times New Roman" w:hAnsi="Times New Roman" w:cs="Times New Roman"/>
         </w:rPr>
@@ -2189,63 +2329,96 @@
     </w:p>
     <w:p>
       <w:pPr>
-        <w:rPr>
-          <w:rFonts w:ascii="Times New Roman" w:hAnsi="Times New Roman" w:cs="Times New Roman"/>
-        </w:rPr>
-      </w:pPr>
-    </w:p>
-    <w:p>
-      <w:pPr>
-        <w:rPr>
-          <w:rFonts w:ascii="Times New Roman" w:hAnsi="Times New Roman" w:cs="Times New Roman"/>
-        </w:rPr>
-      </w:pPr>
-      <w:r>
-        <w:rPr>
-          <w:rFonts w:ascii="Times New Roman" w:hAnsi="Times New Roman" w:cs="Times New Roman"/>
+        <w:jc w:val="both"/>
+        <w:rPr>
+          <w:rFonts w:ascii="Times New Roman" w:hAnsi="Times New Roman" w:cs="Times New Roman"/>
+        </w:rPr>
+      </w:pPr>
+    </w:p>
+    <w:p>
+      <w:pPr>
+        <w:jc w:val="both"/>
+        <w:rPr>
+          <w:rFonts w:ascii="Times New Roman" w:hAnsi="Times New Roman" w:cs="Times New Roman"/>
+          <w:b/>
+          <w:bCs/>
+          <w:sz w:val="40"/>
+          <w:szCs w:val="40"/>
+        </w:rPr>
+      </w:pPr>
+      <w:r>
+        <w:rPr>
+          <w:rFonts w:ascii="Times New Roman" w:hAnsi="Times New Roman" w:cs="Times New Roman"/>
+          <w:b/>
+          <w:bCs/>
+          <w:sz w:val="40"/>
+          <w:szCs w:val="40"/>
         </w:rPr>
         <w:t>B1. Discover 5 unique weak/vulnerable security implementations.</w:t>
       </w:r>
     </w:p>
     <w:p>
       <w:pPr>
-        <w:rPr>
-          <w:rFonts w:ascii="Times New Roman" w:hAnsi="Times New Roman" w:cs="Times New Roman"/>
-        </w:rPr>
-      </w:pPr>
-      <w:r>
-        <w:rPr>
-          <w:rFonts w:ascii="Times New Roman" w:hAnsi="Times New Roman" w:cs="Times New Roman"/>
+        <w:jc w:val="both"/>
+        <w:rPr>
+          <w:rFonts w:ascii="Times New Roman" w:hAnsi="Times New Roman" w:cs="Times New Roman"/>
+          <w:b/>
+          <w:bCs/>
+          <w:sz w:val="40"/>
+          <w:szCs w:val="40"/>
+        </w:rPr>
+      </w:pPr>
+      <w:r>
+        <w:rPr>
+          <w:rFonts w:ascii="Times New Roman" w:hAnsi="Times New Roman" w:cs="Times New Roman"/>
+          <w:b/>
+          <w:bCs/>
+          <w:sz w:val="40"/>
+          <w:szCs w:val="40"/>
         </w:rPr>
         <w:t>B2. Discover 5 unique strong security implementations.</w:t>
       </w:r>
     </w:p>
     <w:p>
       <w:pPr>
-        <w:rPr>
-          <w:rFonts w:ascii="Times New Roman" w:hAnsi="Times New Roman" w:cs="Times New Roman"/>
-        </w:rPr>
-      </w:pPr>
-      <w:r>
-        <w:rPr>
-          <w:rFonts w:ascii="Times New Roman" w:hAnsi="Times New Roman" w:cs="Times New Roman"/>
+        <w:jc w:val="both"/>
+        <w:rPr>
+          <w:rFonts w:ascii="Times New Roman" w:hAnsi="Times New Roman" w:cs="Times New Roman"/>
+          <w:b/>
+          <w:bCs/>
+          <w:sz w:val="40"/>
+          <w:szCs w:val="40"/>
+        </w:rPr>
+      </w:pPr>
+      <w:r>
+        <w:rPr>
+          <w:rFonts w:ascii="Times New Roman" w:hAnsi="Times New Roman" w:cs="Times New Roman"/>
+          <w:b/>
+          <w:bCs/>
+          <w:sz w:val="40"/>
+          <w:szCs w:val="40"/>
         </w:rPr>
         <w:t>B3. Discover 3 proactive security implementations in practice.</w:t>
       </w:r>
     </w:p>
     <w:p>
       <w:pPr>
-        <w:rPr>
-          <w:rFonts w:ascii="Times New Roman" w:hAnsi="Times New Roman" w:cs="Times New Roman"/>
-          <w:b/>
-          <w:bCs/>
-        </w:rPr>
-      </w:pPr>
-      <w:r>
-        <w:rPr>
-          <w:rFonts w:ascii="Times New Roman" w:hAnsi="Times New Roman" w:cs="Times New Roman"/>
-          <w:b/>
-          <w:bCs/>
+        <w:jc w:val="both"/>
+        <w:rPr>
+          <w:rFonts w:ascii="Times New Roman" w:hAnsi="Times New Roman" w:cs="Times New Roman"/>
+          <w:b/>
+          <w:bCs/>
+          <w:sz w:val="40"/>
+          <w:szCs w:val="40"/>
+        </w:rPr>
+      </w:pPr>
+      <w:r>
+        <w:rPr>
+          <w:rFonts w:ascii="Times New Roman" w:hAnsi="Times New Roman" w:cs="Times New Roman"/>
+          <w:b/>
+          <w:bCs/>
+          <w:sz w:val="40"/>
+          <w:szCs w:val="40"/>
         </w:rPr>
         <w:t xml:space="preserve">B4. </w:t>
       </w:r>
@@ -2254,12 +2427,15 @@
           <w:rFonts w:ascii="Times New Roman" w:hAnsi="Times New Roman" w:cs="Times New Roman"/>
           <w:b/>
           <w:bCs/>
+          <w:sz w:val="40"/>
+          <w:szCs w:val="40"/>
         </w:rPr>
         <w:t>Participate in 3 in-class activities in labs (facilitators will administer such activities).</w:t>
       </w:r>
     </w:p>
     <w:p>
       <w:pPr>
+        <w:jc w:val="both"/>
         <w:rPr>
           <w:rFonts w:ascii="Times New Roman" w:hAnsi="Times New Roman" w:cs="Times New Roman"/>
           <w:u w:val="single"/>
@@ -2282,6 +2458,7 @@
     </w:p>
     <w:p>
       <w:pPr>
+        <w:jc w:val="both"/>
         <w:rPr>
           <w:rFonts w:ascii="Times New Roman" w:hAnsi="Times New Roman" w:cs="Times New Roman"/>
         </w:rPr>
@@ -2319,6 +2496,7 @@
     </w:p>
     <w:p>
       <w:pPr>
+        <w:jc w:val="both"/>
         <w:rPr>
           <w:rFonts w:ascii="Times New Roman" w:hAnsi="Times New Roman" w:cs="Times New Roman"/>
         </w:rPr>
@@ -2338,6 +2516,7 @@
     </w:p>
     <w:p>
       <w:pPr>
+        <w:jc w:val="both"/>
         <w:rPr>
           <w:rFonts w:ascii="Times New Roman" w:hAnsi="Times New Roman" w:cs="Times New Roman"/>
         </w:rPr>
@@ -2399,6 +2578,7 @@
     </w:p>
     <w:p>
       <w:pPr>
+        <w:jc w:val="both"/>
         <w:rPr>
           <w:rFonts w:ascii="Times New Roman" w:hAnsi="Times New Roman" w:cs="Times New Roman"/>
           <w:u w:val="single"/>
@@ -2414,134 +2594,527 @@
     </w:p>
     <w:p>
       <w:pPr>
-        <w:rPr>
-          <w:rFonts w:ascii="Times New Roman" w:hAnsi="Times New Roman" w:cs="Times New Roman"/>
-        </w:rPr>
-      </w:pPr>
-      <w:r>
-        <w:rPr>
-          <w:rFonts w:ascii="Times New Roman" w:hAnsi="Times New Roman" w:cs="Times New Roman"/>
+        <w:jc w:val="both"/>
+        <w:rPr>
+          <w:rFonts w:ascii="Times New Roman" w:hAnsi="Times New Roman" w:cs="Times New Roman"/>
+          <w:u w:val="single"/>
+        </w:rPr>
+      </w:pPr>
+      <w:r>
+        <w:rPr>
+          <w:rFonts w:ascii="Times New Roman" w:hAnsi="Times New Roman" w:cs="Times New Roman"/>
+          <w:u w:val="single"/>
+        </w:rPr>
+        <w:t>In-Class Lab Activity 3 (Monday, 16 March 2026)</w:t>
+      </w:r>
+    </w:p>
+    <w:p>
+      <w:pPr>
+        <w:jc w:val="both"/>
+        <w:rPr>
+          <w:rFonts w:ascii="Times New Roman" w:hAnsi="Times New Roman" w:cs="Times New Roman"/>
+          <w:b/>
+          <w:bCs/>
+          <w:sz w:val="40"/>
+          <w:szCs w:val="40"/>
+        </w:rPr>
+      </w:pPr>
+      <w:r>
+        <w:rPr>
+          <w:rFonts w:ascii="Times New Roman" w:hAnsi="Times New Roman" w:cs="Times New Roman"/>
+          <w:b/>
+          <w:bCs/>
+          <w:sz w:val="40"/>
+          <w:szCs w:val="40"/>
         </w:rPr>
         <w:t>B5. Attend 2 cybersecurity related talks/seminars.</w:t>
       </w:r>
     </w:p>
     <w:p>
       <w:pPr>
-        <w:rPr>
-          <w:rFonts w:ascii="Times New Roman" w:hAnsi="Times New Roman" w:cs="Times New Roman"/>
-        </w:rPr>
-      </w:pPr>
-      <w:r>
-        <w:rPr>
-          <w:rFonts w:ascii="Times New Roman" w:hAnsi="Times New Roman" w:cs="Times New Roman"/>
-        </w:rPr>
+        <w:jc w:val="both"/>
+        <w:rPr>
+          <w:rFonts w:ascii="Times New Roman" w:hAnsi="Times New Roman" w:cs="Times New Roman"/>
+        </w:rPr>
+      </w:pPr>
+      <w:r>
+        <w:rPr>
+          <w:rFonts w:ascii="Times New Roman" w:hAnsi="Times New Roman" w:cs="Times New Roman"/>
+        </w:rPr>
+        <w:t>-Does Vannessa’s talk from CyberThrive x CyberQueens event count as a separate talk</w:t>
+      </w:r>
+    </w:p>
+    <w:p>
+      <w:pPr>
+        <w:jc w:val="both"/>
+        <w:rPr>
+          <w:rFonts w:ascii="Times New Roman" w:hAnsi="Times New Roman" w:cs="Times New Roman"/>
+          <w:b/>
+          <w:bCs/>
+          <w:sz w:val="40"/>
+          <w:szCs w:val="40"/>
+        </w:rPr>
+      </w:pPr>
+      <w:r>
+        <w:rPr>
+          <w:rFonts w:ascii="Times New Roman" w:hAnsi="Times New Roman" w:cs="Times New Roman"/>
+          <w:b/>
+          <w:bCs/>
+          <w:sz w:val="40"/>
+          <w:szCs w:val="40"/>
+        </w:rPr>
+        <w:lastRenderedPageBreak/>
         <w:t>B6. Attend 2 cyber ethics/law related talks/seminars.</w:t>
       </w:r>
     </w:p>
     <w:p>
       <w:pPr>
-        <w:rPr>
-          <w:rFonts w:ascii="Times New Roman" w:hAnsi="Times New Roman" w:cs="Times New Roman"/>
-        </w:rPr>
-      </w:pPr>
-      <w:r>
-        <w:rPr>
-          <w:rFonts w:ascii="Times New Roman" w:hAnsi="Times New Roman" w:cs="Times New Roman"/>
+        <w:jc w:val="both"/>
+        <w:rPr>
+          <w:rFonts w:ascii="Times New Roman" w:hAnsi="Times New Roman" w:cs="Times New Roman"/>
+          <w:b/>
+          <w:bCs/>
+          <w:sz w:val="40"/>
+          <w:szCs w:val="40"/>
+        </w:rPr>
+      </w:pPr>
+      <w:r>
+        <w:rPr>
+          <w:rFonts w:ascii="Times New Roman" w:hAnsi="Times New Roman" w:cs="Times New Roman"/>
+          <w:b/>
+          <w:bCs/>
+          <w:sz w:val="40"/>
+          <w:szCs w:val="40"/>
         </w:rPr>
         <w:t>B7. Participate in CS/DS/cybersecurity clubs’ activity.</w:t>
       </w:r>
     </w:p>
     <w:p>
       <w:pPr>
-        <w:rPr>
-          <w:rFonts w:ascii="Times New Roman" w:hAnsi="Times New Roman" w:cs="Times New Roman"/>
-        </w:rPr>
-      </w:pPr>
-      <w:r>
-        <w:rPr>
-          <w:rFonts w:ascii="Times New Roman" w:hAnsi="Times New Roman" w:cs="Times New Roman"/>
+        <w:jc w:val="both"/>
+        <w:rPr>
+          <w:rFonts w:ascii="Times New Roman" w:hAnsi="Times New Roman" w:cs="Times New Roman"/>
+          <w:b/>
+          <w:bCs/>
+          <w:sz w:val="40"/>
+          <w:szCs w:val="40"/>
+        </w:rPr>
+      </w:pPr>
+      <w:r>
+        <w:rPr>
+          <w:rFonts w:ascii="Times New Roman" w:hAnsi="Times New Roman" w:cs="Times New Roman"/>
+          <w:b/>
+          <w:bCs/>
+          <w:sz w:val="40"/>
+          <w:szCs w:val="40"/>
         </w:rPr>
         <w:t>B8. Participate in a hackathon.</w:t>
       </w:r>
     </w:p>
     <w:p>
       <w:pPr>
-        <w:rPr>
-          <w:rFonts w:ascii="Times New Roman" w:hAnsi="Times New Roman" w:cs="Times New Roman"/>
-        </w:rPr>
-      </w:pPr>
-      <w:r>
-        <w:rPr>
-          <w:rFonts w:ascii="Times New Roman" w:hAnsi="Times New Roman" w:cs="Times New Roman"/>
+        <w:jc w:val="both"/>
+        <w:rPr>
+          <w:rFonts w:ascii="Times New Roman" w:hAnsi="Times New Roman" w:cs="Times New Roman"/>
+          <w:b/>
+          <w:bCs/>
+          <w:sz w:val="40"/>
+          <w:szCs w:val="40"/>
+        </w:rPr>
+      </w:pPr>
+      <w:r>
+        <w:rPr>
+          <w:rFonts w:ascii="Times New Roman" w:hAnsi="Times New Roman" w:cs="Times New Roman"/>
+          <w:b/>
+          <w:bCs/>
+          <w:sz w:val="40"/>
+          <w:szCs w:val="40"/>
         </w:rPr>
         <w:t>B9. Participate in an industry-related cybersecurity event.</w:t>
       </w:r>
     </w:p>
     <w:p>
       <w:pPr>
-        <w:rPr>
-          <w:rFonts w:ascii="Times New Roman" w:hAnsi="Times New Roman" w:cs="Times New Roman"/>
+        <w:pStyle w:val="ListParagraph"/>
+        <w:numPr>
+          <w:ilvl w:val="0"/>
+          <w:numId w:val="4"/>
+        </w:numPr>
+        <w:jc w:val="both"/>
+        <w:rPr>
+          <w:rFonts w:ascii="Times New Roman" w:hAnsi="Times New Roman" w:cs="Times New Roman"/>
+        </w:rPr>
+      </w:pPr>
+      <w:r>
+        <w:rPr>
+          <w:rFonts w:ascii="Times New Roman" w:hAnsi="Times New Roman" w:cs="Times New Roman"/>
+        </w:rPr>
+        <w:t>CyberThrive x CyberQueens</w:t>
+      </w:r>
+    </w:p>
+    <w:p>
+      <w:pPr>
+        <w:jc w:val="both"/>
+        <w:rPr>
+          <w:rFonts w:ascii="Times New Roman" w:hAnsi="Times New Roman" w:cs="Times New Roman"/>
+          <w:b/>
+          <w:bCs/>
           <w:strike/>
-        </w:rPr>
-      </w:pPr>
-      <w:r>
-        <w:rPr>
-          <w:rFonts w:ascii="Times New Roman" w:hAnsi="Times New Roman" w:cs="Times New Roman"/>
+          <w:sz w:val="40"/>
+          <w:szCs w:val="40"/>
+        </w:rPr>
+      </w:pPr>
+      <w:r>
+        <w:rPr>
+          <w:rFonts w:ascii="Times New Roman" w:hAnsi="Times New Roman" w:cs="Times New Roman"/>
+          <w:b/>
+          <w:bCs/>
           <w:strike/>
+          <w:sz w:val="40"/>
+          <w:szCs w:val="40"/>
         </w:rPr>
         <w:t>B10. Participate in a cybersecurity activity as part of job/internship/volunteering etc.</w:t>
       </w:r>
     </w:p>
     <w:p>
       <w:pPr>
-        <w:rPr>
-          <w:rFonts w:ascii="Times New Roman" w:hAnsi="Times New Roman" w:cs="Times New Roman"/>
-        </w:rPr>
-      </w:pPr>
-      <w:r>
-        <w:rPr>
-          <w:rFonts w:ascii="Times New Roman" w:hAnsi="Times New Roman" w:cs="Times New Roman"/>
+        <w:jc w:val="both"/>
+        <w:rPr>
+          <w:rFonts w:ascii="Times New Roman" w:hAnsi="Times New Roman" w:cs="Times New Roman"/>
+          <w:b/>
+          <w:bCs/>
+          <w:sz w:val="40"/>
+          <w:szCs w:val="40"/>
+        </w:rPr>
+      </w:pPr>
+      <w:r>
+        <w:rPr>
+          <w:rFonts w:ascii="Times New Roman" w:hAnsi="Times New Roman" w:cs="Times New Roman"/>
+          <w:b/>
+          <w:bCs/>
+          <w:sz w:val="40"/>
+          <w:szCs w:val="40"/>
         </w:rPr>
         <w:t>B11. Talk to 2 cybersecurity experts from the industry and find out their latest projects.</w:t>
       </w:r>
     </w:p>
     <w:p>
       <w:pPr>
-        <w:rPr>
-          <w:rFonts w:ascii="Times New Roman" w:hAnsi="Times New Roman" w:cs="Times New Roman"/>
-        </w:rPr>
-      </w:pPr>
-      <w:r>
-        <w:rPr>
-          <w:rFonts w:ascii="Times New Roman" w:hAnsi="Times New Roman" w:cs="Times New Roman"/>
+        <w:jc w:val="both"/>
+        <w:rPr>
+          <w:rFonts w:ascii="Times New Roman" w:hAnsi="Times New Roman" w:cs="Times New Roman"/>
+        </w:rPr>
+      </w:pPr>
+      <w:r>
+        <w:rPr>
+          <w:rFonts w:ascii="Times New Roman" w:hAnsi="Times New Roman" w:cs="Times New Roman"/>
+        </w:rPr>
+        <w:t>I met these two cybersecurity experts during the CyberThrive x CyberQueens event. All evidence of this (including a picture</w:t>
+      </w:r>
+      <w:r>
+        <w:rPr>
+          <w:rFonts w:ascii="Times New Roman" w:hAnsi="Times New Roman" w:cs="Times New Roman"/>
+        </w:rPr>
+        <w:t xml:space="preserve"> with them</w:t>
+      </w:r>
+      <w:r>
+        <w:rPr>
+          <w:rFonts w:ascii="Times New Roman" w:hAnsi="Times New Roman" w:cs="Times New Roman"/>
+        </w:rPr>
+        <w:t>!) can be found under the directory /Evidences/B11.</w:t>
+      </w:r>
+    </w:p>
+    <w:p>
+      <w:pPr>
+        <w:jc w:val="both"/>
+        <w:rPr>
+          <w:rFonts w:ascii="Times New Roman" w:hAnsi="Times New Roman" w:cs="Times New Roman"/>
+          <w:b/>
+          <w:bCs/>
+        </w:rPr>
+      </w:pPr>
+      <w:r>
+        <w:rPr>
+          <w:rFonts w:ascii="Times New Roman" w:hAnsi="Times New Roman" w:cs="Times New Roman"/>
+          <w:b/>
+          <w:bCs/>
+        </w:rPr>
+        <w:t>Caitriona Forde (</w:t>
+      </w:r>
+      <w:r>
+        <w:rPr>
+          <w:rFonts w:ascii="Times New Roman" w:hAnsi="Times New Roman" w:cs="Times New Roman"/>
+          <w:b/>
+          <w:bCs/>
+        </w:rPr>
+        <w:t>Cyber Safety &amp; Human Factors Expert</w:t>
+      </w:r>
+      <w:r>
+        <w:rPr>
+          <w:rFonts w:ascii="Times New Roman" w:hAnsi="Times New Roman" w:cs="Times New Roman"/>
+          <w:b/>
+          <w:bCs/>
+        </w:rPr>
+        <w:t>):</w:t>
+      </w:r>
+    </w:p>
+    <w:p>
+      <w:pPr>
+        <w:jc w:val="both"/>
+        <w:rPr>
+          <w:rFonts w:ascii="Times New Roman" w:hAnsi="Times New Roman" w:cs="Times New Roman"/>
+        </w:rPr>
+      </w:pPr>
+      <w:r>
+        <w:rPr>
+          <w:rFonts w:ascii="Times New Roman" w:hAnsi="Times New Roman" w:cs="Times New Roman"/>
+        </w:rPr>
+        <w:t xml:space="preserve">Forde’s latest project has to do with her PhD research into Human Factors in Cyber Safety and how we can bridge the gap between knowing the right thing and actually doing it. </w:t>
+      </w:r>
+      <w:r>
+        <w:rPr>
+          <w:rFonts w:ascii="Times New Roman" w:hAnsi="Times New Roman" w:cs="Times New Roman"/>
+        </w:rPr>
+        <w:t>For example, we might know that changing passwords regularly, using a password manager, and setting up MFA</w:t>
+      </w:r>
+      <w:r>
+        <w:rPr>
+          <w:rFonts w:ascii="Times New Roman" w:hAnsi="Times New Roman" w:cs="Times New Roman"/>
+        </w:rPr>
+        <w:t>s</w:t>
+      </w:r>
+      <w:r>
+        <w:rPr>
+          <w:rFonts w:ascii="Times New Roman" w:hAnsi="Times New Roman" w:cs="Times New Roman"/>
+        </w:rPr>
+        <w:t xml:space="preserve"> are very important things to do in </w:t>
+      </w:r>
+      <w:r>
+        <w:rPr>
+          <w:rFonts w:ascii="Times New Roman" w:hAnsi="Times New Roman" w:cs="Times New Roman"/>
+        </w:rPr>
+        <w:t xml:space="preserve">securing </w:t>
+      </w:r>
+      <w:r>
+        <w:rPr>
+          <w:rFonts w:ascii="Times New Roman" w:hAnsi="Times New Roman" w:cs="Times New Roman"/>
+        </w:rPr>
+        <w:t>our privac</w:t>
+      </w:r>
+      <w:r>
+        <w:rPr>
+          <w:rFonts w:ascii="Times New Roman" w:hAnsi="Times New Roman" w:cs="Times New Roman"/>
+        </w:rPr>
+        <w:t>y</w:t>
+      </w:r>
+      <w:r>
+        <w:rPr>
+          <w:rFonts w:ascii="Times New Roman" w:hAnsi="Times New Roman" w:cs="Times New Roman"/>
+        </w:rPr>
+        <w:t>, but people tend to not do it despite knowing this.</w:t>
+      </w:r>
+    </w:p>
+    <w:p>
+      <w:pPr>
+        <w:jc w:val="both"/>
+        <w:rPr>
+          <w:rFonts w:ascii="Times New Roman" w:hAnsi="Times New Roman" w:cs="Times New Roman"/>
+        </w:rPr>
+      </w:pPr>
+      <w:r>
+        <w:rPr>
+          <w:rFonts w:ascii="Times New Roman" w:hAnsi="Times New Roman" w:cs="Times New Roman"/>
+        </w:rPr>
+        <w:t xml:space="preserve">Most cybersecurity incidents come from human error, and instead of allocating their budget to </w:t>
+      </w:r>
+      <w:r>
+        <w:rPr>
+          <w:rFonts w:ascii="Times New Roman" w:hAnsi="Times New Roman" w:cs="Times New Roman"/>
+        </w:rPr>
+        <w:t>fix this human risk, major companies are spending their money on their own technology.</w:t>
+      </w:r>
+      <w:r>
+        <w:rPr>
+          <w:rFonts w:ascii="Times New Roman" w:hAnsi="Times New Roman" w:cs="Times New Roman"/>
+        </w:rPr>
+        <w:t xml:space="preserve"> </w:t>
+      </w:r>
+    </w:p>
+    <w:p>
+      <w:pPr>
+        <w:jc w:val="both"/>
+        <w:rPr>
+          <w:rFonts w:ascii="Times New Roman" w:hAnsi="Times New Roman" w:cs="Times New Roman"/>
+        </w:rPr>
+      </w:pPr>
+      <w:r>
+        <w:rPr>
+          <w:rFonts w:ascii="Times New Roman" w:hAnsi="Times New Roman" w:cs="Times New Roman"/>
+        </w:rPr>
+        <w:t xml:space="preserve">Some tests that were conducted </w:t>
+      </w:r>
+      <w:r>
+        <w:rPr>
+          <w:rFonts w:ascii="Times New Roman" w:hAnsi="Times New Roman" w:cs="Times New Roman"/>
+        </w:rPr>
+        <w:t>would be sending fake or test emails to employees and see which person will check on them.</w:t>
+      </w:r>
+      <w:r>
+        <w:rPr>
+          <w:rFonts w:ascii="Times New Roman" w:hAnsi="Times New Roman" w:cs="Times New Roman"/>
+        </w:rPr>
+        <w:t xml:space="preserve"> If they do check on them, then they might need some training in cyber safety awareness.</w:t>
+      </w:r>
+    </w:p>
+    <w:p>
+      <w:pPr>
+        <w:jc w:val="both"/>
+        <w:rPr>
+          <w:rFonts w:ascii="Times New Roman" w:hAnsi="Times New Roman" w:cs="Times New Roman"/>
+          <w:b/>
+          <w:bCs/>
+        </w:rPr>
+      </w:pPr>
+      <w:r>
+        <w:rPr>
+          <w:rFonts w:ascii="Times New Roman" w:hAnsi="Times New Roman" w:cs="Times New Roman"/>
+          <w:b/>
+          <w:bCs/>
+        </w:rPr>
+        <w:t>Biljana R. (Experienced Cyber Governance, Risk &amp; Compliance (GRC) Professional):</w:t>
+      </w:r>
+    </w:p>
+    <w:p>
+      <w:pPr>
+        <w:jc w:val="both"/>
+        <w:rPr>
+          <w:rFonts w:ascii="Times New Roman" w:hAnsi="Times New Roman" w:cs="Times New Roman"/>
+        </w:rPr>
+      </w:pPr>
+      <w:r>
+        <w:rPr>
+          <w:rFonts w:ascii="Times New Roman" w:hAnsi="Times New Roman" w:cs="Times New Roman"/>
+        </w:rPr>
+        <w:t>Biljana has stated that she works in Governance, Risk &amp; Compliance and critical infrastructure, so most of her projects are confidential. However, what she can share is that when a business wants to use a new vendor, then said business will come to her company to assess the risk of that vendor.</w:t>
+      </w:r>
+      <w:r>
+        <w:rPr>
+          <w:rFonts w:ascii="Times New Roman" w:hAnsi="Times New Roman" w:cs="Times New Roman"/>
+        </w:rPr>
+        <w:t xml:space="preserve"> This involves various things, such as how to connect the business to the system, where does the data go, and creating a risk profile of the vendor.</w:t>
+      </w:r>
+      <w:r>
+        <w:rPr>
+          <w:rFonts w:ascii="Times New Roman" w:hAnsi="Times New Roman" w:cs="Times New Roman"/>
+        </w:rPr>
+        <w:t xml:space="preserve"> Hence, they inform businesses whether or not they can use the vendors after a risk assessment process.</w:t>
+      </w:r>
+    </w:p>
+    <w:p>
+      <w:pPr>
+        <w:jc w:val="both"/>
+        <w:rPr>
+          <w:rFonts w:ascii="Times New Roman" w:hAnsi="Times New Roman" w:cs="Times New Roman"/>
+        </w:rPr>
+      </w:pPr>
+      <w:r>
+        <w:rPr>
+          <w:rFonts w:ascii="Times New Roman" w:hAnsi="Times New Roman" w:cs="Times New Roman"/>
+        </w:rPr>
+        <w:lastRenderedPageBreak/>
+        <w:t xml:space="preserve">She also mentioned operational technology, which is a physical industrial control system (or according to </w:t>
+      </w:r>
+      <w:hyperlink r:id="rId6" w:history="1">
+        <w:r>
+          <w:rPr>
+            <w:rStyle w:val="Hyperlink"/>
+            <w:rFonts w:ascii="Times New Roman" w:hAnsi="Times New Roman" w:cs="Times New Roman"/>
+          </w:rPr>
+          <w:t>IBM</w:t>
+        </w:r>
+      </w:hyperlink>
+      <w:r>
+        <w:rPr>
+          <w:rFonts w:ascii="Times New Roman" w:hAnsi="Times New Roman" w:cs="Times New Roman"/>
+        </w:rPr>
+        <w:t>: the hardware and software that directly monitors, controls, and automates physical processes and infrastructure in industrial settings), and how those systems must be available at all times (one of the CIA triads)</w:t>
+      </w:r>
+      <w:r>
+        <w:rPr>
+          <w:rFonts w:ascii="Times New Roman" w:hAnsi="Times New Roman" w:cs="Times New Roman"/>
+        </w:rPr>
+        <w:t xml:space="preserve"> as a shutdown of these industrial systems (a hacker getting hold of these systems) can cause safety issues for people.</w:t>
+      </w:r>
+      <w:r>
+        <w:rPr>
+          <w:rFonts w:ascii="Times New Roman" w:hAnsi="Times New Roman" w:cs="Times New Roman"/>
+        </w:rPr>
+        <w:t xml:space="preserve"> Thus, they have to find ways to ensure that the system keeps running.</w:t>
+      </w:r>
+    </w:p>
+    <w:p>
+      <w:pPr>
+        <w:jc w:val="both"/>
+        <w:rPr>
+          <w:rFonts w:ascii="Times New Roman" w:hAnsi="Times New Roman" w:cs="Times New Roman"/>
+          <w:b/>
+          <w:bCs/>
+          <w:sz w:val="40"/>
+          <w:szCs w:val="40"/>
+        </w:rPr>
+      </w:pPr>
+      <w:r>
+        <w:rPr>
+          <w:rFonts w:ascii="Times New Roman" w:hAnsi="Times New Roman" w:cs="Times New Roman"/>
+          <w:b/>
+          <w:bCs/>
+          <w:sz w:val="40"/>
+          <w:szCs w:val="40"/>
         </w:rPr>
         <w:t>B12. Discover two bias cases when using a generative AI system.</w:t>
       </w:r>
     </w:p>
     <w:p>
       <w:pPr>
-        <w:rPr>
-          <w:rFonts w:ascii="Times New Roman" w:hAnsi="Times New Roman" w:cs="Times New Roman"/>
-        </w:rPr>
-      </w:pPr>
-      <w:r>
-        <w:rPr>
-          <w:rFonts w:ascii="Times New Roman" w:hAnsi="Times New Roman" w:cs="Times New Roman"/>
+        <w:jc w:val="both"/>
+        <w:rPr>
+          <w:rFonts w:ascii="Times New Roman" w:hAnsi="Times New Roman" w:cs="Times New Roman"/>
+          <w:b/>
+          <w:bCs/>
+          <w:sz w:val="40"/>
+          <w:szCs w:val="40"/>
+        </w:rPr>
+      </w:pPr>
+      <w:r>
+        <w:rPr>
+          <w:rFonts w:ascii="Times New Roman" w:hAnsi="Times New Roman" w:cs="Times New Roman"/>
+          <w:b/>
+          <w:bCs/>
+          <w:sz w:val="40"/>
+          <w:szCs w:val="40"/>
         </w:rPr>
         <w:t>B13. Perform a jailbreak attack on a generative AI assistant (controlled test only).</w:t>
       </w:r>
     </w:p>
     <w:p>
       <w:pPr>
-        <w:rPr>
-          <w:rFonts w:ascii="Times New Roman" w:hAnsi="Times New Roman" w:cs="Times New Roman"/>
-        </w:rPr>
-      </w:pPr>
-      <w:r>
-        <w:rPr>
-          <w:rFonts w:ascii="Times New Roman" w:hAnsi="Times New Roman" w:cs="Times New Roman"/>
-        </w:rPr>
-        <w:lastRenderedPageBreak/>
+        <w:jc w:val="both"/>
+        <w:rPr>
+          <w:rFonts w:ascii="Times New Roman" w:hAnsi="Times New Roman" w:cs="Times New Roman"/>
+          <w:b/>
+          <w:bCs/>
+          <w:sz w:val="40"/>
+          <w:szCs w:val="40"/>
+        </w:rPr>
+      </w:pPr>
+      <w:r>
+        <w:rPr>
+          <w:rFonts w:ascii="Times New Roman" w:hAnsi="Times New Roman" w:cs="Times New Roman"/>
+          <w:b/>
+          <w:bCs/>
+          <w:sz w:val="40"/>
+          <w:szCs w:val="40"/>
+        </w:rPr>
         <w:t>B14. Teach your friends about cybersecurity topic of your choice.</w:t>
       </w:r>
     </w:p>
@@ -2552,6 +3125,7 @@
           <w:ilvl w:val="0"/>
           <w:numId w:val="3"/>
         </w:numPr>
+        <w:jc w:val="both"/>
         <w:rPr>
           <w:rFonts w:ascii="Times New Roman" w:hAnsi="Times New Roman" w:cs="Times New Roman"/>
         </w:rPr>
@@ -2565,166 +3139,272 @@
     </w:p>
     <w:p>
       <w:pPr>
-        <w:rPr>
-          <w:rFonts w:ascii="Times New Roman" w:hAnsi="Times New Roman" w:cs="Times New Roman"/>
-        </w:rPr>
-      </w:pPr>
-      <w:r>
-        <w:rPr>
-          <w:rFonts w:ascii="Times New Roman" w:hAnsi="Times New Roman" w:cs="Times New Roman"/>
+        <w:jc w:val="both"/>
+        <w:rPr>
+          <w:rFonts w:ascii="Times New Roman" w:hAnsi="Times New Roman" w:cs="Times New Roman"/>
+          <w:b/>
+          <w:bCs/>
+          <w:sz w:val="40"/>
+          <w:szCs w:val="40"/>
+        </w:rPr>
+      </w:pPr>
+      <w:r>
+        <w:rPr>
+          <w:rFonts w:ascii="Times New Roman" w:hAnsi="Times New Roman" w:cs="Times New Roman"/>
+          <w:b/>
+          <w:bCs/>
+          <w:sz w:val="40"/>
+          <w:szCs w:val="40"/>
         </w:rPr>
         <w:t>B15. Teach an elderly person about cybersecurity topic of your choice.</w:t>
       </w:r>
     </w:p>
     <w:p>
       <w:pPr>
-        <w:rPr>
-          <w:rFonts w:ascii="Times New Roman" w:hAnsi="Times New Roman" w:cs="Times New Roman"/>
-        </w:rPr>
-      </w:pPr>
-      <w:r>
-        <w:rPr>
-          <w:rFonts w:ascii="Times New Roman" w:hAnsi="Times New Roman" w:cs="Times New Roman"/>
+        <w:jc w:val="both"/>
+        <w:rPr>
+          <w:rFonts w:ascii="Times New Roman" w:hAnsi="Times New Roman" w:cs="Times New Roman"/>
+          <w:b/>
+          <w:bCs/>
+          <w:sz w:val="40"/>
+          <w:szCs w:val="40"/>
+        </w:rPr>
+      </w:pPr>
+      <w:r>
+        <w:rPr>
+          <w:rFonts w:ascii="Times New Roman" w:hAnsi="Times New Roman" w:cs="Times New Roman"/>
+          <w:b/>
+          <w:bCs/>
+          <w:sz w:val="40"/>
+          <w:szCs w:val="40"/>
         </w:rPr>
         <w:t>B16. Survey the current state-of-the-art solutions in cybersecurity.</w:t>
       </w:r>
     </w:p>
     <w:p>
       <w:pPr>
-        <w:rPr>
-          <w:rFonts w:ascii="Times New Roman" w:hAnsi="Times New Roman" w:cs="Times New Roman"/>
-        </w:rPr>
-      </w:pPr>
-      <w:r>
-        <w:rPr>
-          <w:rFonts w:ascii="Times New Roman" w:hAnsi="Times New Roman" w:cs="Times New Roman"/>
+        <w:jc w:val="both"/>
+        <w:rPr>
+          <w:rFonts w:ascii="Times New Roman" w:hAnsi="Times New Roman" w:cs="Times New Roman"/>
+          <w:b/>
+          <w:bCs/>
+          <w:sz w:val="40"/>
+          <w:szCs w:val="40"/>
+        </w:rPr>
+      </w:pPr>
+      <w:r>
+        <w:rPr>
+          <w:rFonts w:ascii="Times New Roman" w:hAnsi="Times New Roman" w:cs="Times New Roman"/>
+          <w:b/>
+          <w:bCs/>
+          <w:sz w:val="40"/>
+          <w:szCs w:val="40"/>
         </w:rPr>
         <w:t>B17. Implement one of the current state-of-the-art solutions and evaluate it.</w:t>
       </w:r>
     </w:p>
     <w:p>
       <w:pPr>
-        <w:rPr>
-          <w:rFonts w:ascii="Times New Roman" w:hAnsi="Times New Roman" w:cs="Times New Roman"/>
-        </w:rPr>
-      </w:pPr>
-      <w:r>
-        <w:rPr>
-          <w:rFonts w:ascii="Times New Roman" w:hAnsi="Times New Roman" w:cs="Times New Roman"/>
+        <w:jc w:val="both"/>
+        <w:rPr>
+          <w:rFonts w:ascii="Times New Roman" w:hAnsi="Times New Roman" w:cs="Times New Roman"/>
+          <w:b/>
+          <w:bCs/>
+          <w:sz w:val="40"/>
+          <w:szCs w:val="40"/>
+        </w:rPr>
+      </w:pPr>
+      <w:r>
+        <w:rPr>
+          <w:rFonts w:ascii="Times New Roman" w:hAnsi="Times New Roman" w:cs="Times New Roman"/>
+          <w:b/>
+          <w:bCs/>
+          <w:sz w:val="40"/>
+          <w:szCs w:val="40"/>
         </w:rPr>
         <w:t>B18. Contribute to an open-source project related to cybersecurity.</w:t>
       </w:r>
     </w:p>
     <w:p>
       <w:pPr>
-        <w:rPr>
-          <w:rFonts w:ascii="Times New Roman" w:hAnsi="Times New Roman" w:cs="Times New Roman"/>
-        </w:rPr>
-      </w:pPr>
-      <w:r>
-        <w:rPr>
-          <w:rFonts w:ascii="Times New Roman" w:hAnsi="Times New Roman" w:cs="Times New Roman"/>
+        <w:jc w:val="both"/>
+        <w:rPr>
+          <w:rFonts w:ascii="Times New Roman" w:hAnsi="Times New Roman" w:cs="Times New Roman"/>
+          <w:b/>
+          <w:bCs/>
+          <w:sz w:val="40"/>
+          <w:szCs w:val="40"/>
+        </w:rPr>
+      </w:pPr>
+      <w:r>
+        <w:rPr>
+          <w:rFonts w:ascii="Times New Roman" w:hAnsi="Times New Roman" w:cs="Times New Roman"/>
+          <w:b/>
+          <w:bCs/>
+          <w:sz w:val="40"/>
+          <w:szCs w:val="40"/>
         </w:rPr>
         <w:t>B19. Find and fix a vulnerability from a GitHub project.</w:t>
       </w:r>
     </w:p>
     <w:p>
       <w:pPr>
-        <w:rPr>
-          <w:rFonts w:ascii="Times New Roman" w:hAnsi="Times New Roman" w:cs="Times New Roman"/>
-        </w:rPr>
-      </w:pPr>
-      <w:r>
-        <w:rPr>
-          <w:rFonts w:ascii="Times New Roman" w:hAnsi="Times New Roman" w:cs="Times New Roman"/>
+        <w:jc w:val="both"/>
+        <w:rPr>
+          <w:rFonts w:ascii="Times New Roman" w:hAnsi="Times New Roman" w:cs="Times New Roman"/>
+          <w:b/>
+          <w:bCs/>
+          <w:sz w:val="40"/>
+          <w:szCs w:val="40"/>
+        </w:rPr>
+      </w:pPr>
+      <w:r>
+        <w:rPr>
+          <w:rFonts w:ascii="Times New Roman" w:hAnsi="Times New Roman" w:cs="Times New Roman"/>
+          <w:b/>
+          <w:bCs/>
+          <w:sz w:val="40"/>
+          <w:szCs w:val="40"/>
         </w:rPr>
         <w:t>B20. Enhance the security of a GitHub project.</w:t>
       </w:r>
     </w:p>
     <w:p>
       <w:pPr>
-        <w:rPr>
-          <w:rFonts w:ascii="Times New Roman" w:hAnsi="Times New Roman" w:cs="Times New Roman"/>
-        </w:rPr>
-      </w:pPr>
-      <w:r>
-        <w:rPr>
-          <w:rFonts w:ascii="Times New Roman" w:hAnsi="Times New Roman" w:cs="Times New Roman"/>
-        </w:rPr>
+        <w:jc w:val="both"/>
+        <w:rPr>
+          <w:rFonts w:ascii="Times New Roman" w:hAnsi="Times New Roman" w:cs="Times New Roman"/>
+          <w:b/>
+          <w:bCs/>
+          <w:sz w:val="40"/>
+          <w:szCs w:val="40"/>
+        </w:rPr>
+      </w:pPr>
+      <w:r>
+        <w:rPr>
+          <w:rFonts w:ascii="Times New Roman" w:hAnsi="Times New Roman" w:cs="Times New Roman"/>
+          <w:b/>
+          <w:bCs/>
+          <w:sz w:val="40"/>
+          <w:szCs w:val="40"/>
+        </w:rPr>
+        <w:lastRenderedPageBreak/>
         <w:t>B21. Design and implement a cybersecurity learning activity.</w:t>
       </w:r>
     </w:p>
     <w:p>
       <w:pPr>
-        <w:rPr>
-          <w:rFonts w:ascii="Times New Roman" w:hAnsi="Times New Roman" w:cs="Times New Roman"/>
-        </w:rPr>
-      </w:pPr>
-      <w:r>
-        <w:rPr>
-          <w:rFonts w:ascii="Times New Roman" w:hAnsi="Times New Roman" w:cs="Times New Roman"/>
+        <w:jc w:val="both"/>
+        <w:rPr>
+          <w:rFonts w:ascii="Times New Roman" w:hAnsi="Times New Roman" w:cs="Times New Roman"/>
+          <w:b/>
+          <w:bCs/>
+          <w:sz w:val="40"/>
+          <w:szCs w:val="40"/>
+        </w:rPr>
+      </w:pPr>
+      <w:r>
+        <w:rPr>
+          <w:rFonts w:ascii="Times New Roman" w:hAnsi="Times New Roman" w:cs="Times New Roman"/>
+          <w:b/>
+          <w:bCs/>
+          <w:sz w:val="40"/>
+          <w:szCs w:val="40"/>
         </w:rPr>
         <w:t>B22. Enhance the cybersecurity of a website from your community.</w:t>
       </w:r>
     </w:p>
     <w:p>
       <w:pPr>
-        <w:rPr>
-          <w:rFonts w:ascii="Times New Roman" w:hAnsi="Times New Roman" w:cs="Times New Roman"/>
-        </w:rPr>
-      </w:pPr>
-      <w:r>
-        <w:rPr>
-          <w:rFonts w:ascii="Times New Roman" w:hAnsi="Times New Roman" w:cs="Times New Roman"/>
+        <w:jc w:val="both"/>
+        <w:rPr>
+          <w:rFonts w:ascii="Times New Roman" w:hAnsi="Times New Roman" w:cs="Times New Roman"/>
+          <w:b/>
+          <w:bCs/>
+          <w:sz w:val="40"/>
+          <w:szCs w:val="40"/>
+        </w:rPr>
+      </w:pPr>
+      <w:r>
+        <w:rPr>
+          <w:rFonts w:ascii="Times New Roman" w:hAnsi="Times New Roman" w:cs="Times New Roman"/>
+          <w:b/>
+          <w:bCs/>
+          <w:sz w:val="40"/>
+          <w:szCs w:val="40"/>
         </w:rPr>
         <w:t>B23. Test an intrusion detection system and discuss its effectiveness.</w:t>
       </w:r>
     </w:p>
     <w:p>
       <w:pPr>
-        <w:rPr>
-          <w:rFonts w:ascii="Times New Roman" w:hAnsi="Times New Roman" w:cs="Times New Roman"/>
-        </w:rPr>
-      </w:pPr>
-      <w:r>
-        <w:rPr>
-          <w:rFonts w:ascii="Times New Roman" w:hAnsi="Times New Roman" w:cs="Times New Roman"/>
+        <w:jc w:val="both"/>
+        <w:rPr>
+          <w:rFonts w:ascii="Times New Roman" w:hAnsi="Times New Roman" w:cs="Times New Roman"/>
+          <w:b/>
+          <w:bCs/>
+          <w:sz w:val="40"/>
+          <w:szCs w:val="40"/>
+        </w:rPr>
+      </w:pPr>
+      <w:r>
+        <w:rPr>
+          <w:rFonts w:ascii="Times New Roman" w:hAnsi="Times New Roman" w:cs="Times New Roman"/>
+          <w:b/>
+          <w:bCs/>
+          <w:sz w:val="40"/>
+          <w:szCs w:val="40"/>
         </w:rPr>
         <w:t>B24. Design and implement access control of your choice.</w:t>
       </w:r>
     </w:p>
     <w:p>
       <w:pPr>
-        <w:rPr>
-          <w:rFonts w:ascii="Times New Roman" w:hAnsi="Times New Roman" w:cs="Times New Roman"/>
-        </w:rPr>
-      </w:pPr>
-      <w:r>
-        <w:rPr>
-          <w:rFonts w:ascii="Times New Roman" w:hAnsi="Times New Roman" w:cs="Times New Roman"/>
+        <w:jc w:val="both"/>
+        <w:rPr>
+          <w:rFonts w:ascii="Times New Roman" w:hAnsi="Times New Roman" w:cs="Times New Roman"/>
+          <w:b/>
+          <w:bCs/>
+          <w:sz w:val="40"/>
+          <w:szCs w:val="40"/>
+        </w:rPr>
+      </w:pPr>
+      <w:r>
+        <w:rPr>
+          <w:rFonts w:ascii="Times New Roman" w:hAnsi="Times New Roman" w:cs="Times New Roman"/>
+          <w:b/>
+          <w:bCs/>
+          <w:sz w:val="40"/>
+          <w:szCs w:val="40"/>
         </w:rPr>
         <w:t>B25. Design and implement a threat intelligence module of your choice.</w:t>
       </w:r>
     </w:p>
     <w:p>
       <w:pPr>
-        <w:rPr>
-          <w:rFonts w:ascii="Times New Roman" w:hAnsi="Times New Roman" w:cs="Times New Roman"/>
-          <w:b/>
-          <w:bCs/>
-        </w:rPr>
-      </w:pPr>
-      <w:r>
-        <w:rPr>
-          <w:rFonts w:ascii="Times New Roman" w:hAnsi="Times New Roman" w:cs="Times New Roman"/>
-          <w:b/>
-          <w:bCs/>
+        <w:jc w:val="both"/>
+        <w:rPr>
+          <w:rFonts w:ascii="Times New Roman" w:hAnsi="Times New Roman" w:cs="Times New Roman"/>
+          <w:b/>
+          <w:bCs/>
+          <w:sz w:val="40"/>
+          <w:szCs w:val="40"/>
+        </w:rPr>
+      </w:pPr>
+      <w:r>
+        <w:rPr>
+          <w:rFonts w:ascii="Times New Roman" w:hAnsi="Times New Roman" w:cs="Times New Roman"/>
+          <w:b/>
+          <w:bCs/>
+          <w:sz w:val="40"/>
+          <w:szCs w:val="40"/>
         </w:rPr>
         <w:t>B26. Help another student in this unit struggling to understand/learn a cybersecurity concept.</w:t>
       </w:r>
     </w:p>
     <w:p>
       <w:pPr>
+        <w:jc w:val="both"/>
         <w:rPr>
           <w:rFonts w:ascii="Times New Roman" w:hAnsi="Times New Roman" w:cs="Times New Roman"/>
         </w:rPr>
@@ -2750,7 +3430,7 @@
                     <pic:cNvPicPr/>
                   </pic:nvPicPr>
                   <pic:blipFill>
-                    <a:blip r:embed="rId6"/>
+                    <a:blip r:embed="rId7"/>
                     <a:stretch>
                       <a:fillRect/>
                     </a:stretch>
@@ -2773,6 +3453,7 @@
     </w:p>
     <w:p>
       <w:pPr>
+        <w:jc w:val="both"/>
         <w:rPr>
           <w:rFonts w:ascii="Times New Roman" w:hAnsi="Times New Roman" w:cs="Times New Roman"/>
         </w:rPr>
@@ -2809,22 +3490,17 @@
           <w:ilvl w:val="0"/>
           <w:numId w:val="2"/>
         </w:numPr>
-        <w:rPr>
-          <w:rFonts w:ascii="Times New Roman" w:hAnsi="Times New Roman" w:cs="Times New Roman"/>
-        </w:rPr>
-      </w:pPr>
-      <w:r>
-        <w:rPr>
-          <w:rFonts w:ascii="Times New Roman" w:hAnsi="Times New Roman" w:cs="Times New Roman"/>
-        </w:rPr>
-        <w:t xml:space="preserve">One-way property means that it is easy to get the hash of the message (forward direction), but it is very difficult/computationally infeasible to do the inverse, i.e. </w:t>
-      </w:r>
+        <w:jc w:val="both"/>
+        <w:rPr>
+          <w:rFonts w:ascii="Times New Roman" w:hAnsi="Times New Roman" w:cs="Times New Roman"/>
+        </w:rPr>
+      </w:pPr>
       <w:r>
         <w:rPr>
           <w:rFonts w:ascii="Times New Roman" w:hAnsi="Times New Roman" w:cs="Times New Roman"/>
         </w:rPr>
         <w:lastRenderedPageBreak/>
-        <w:t>figure out the message from its hash.</w:t>
+        <w:t>One-way property means that it is easy to get the hash of the message (forward direction), but it is very difficult/computationally infeasible to do the inverse, i.e. figure out the message from its hash.</w:t>
       </w:r>
       <w:r>
         <w:rPr>
@@ -2840,6 +3516,7 @@
           <w:ilvl w:val="0"/>
           <w:numId w:val="2"/>
         </w:numPr>
+        <w:jc w:val="both"/>
         <w:rPr>
           <w:rFonts w:ascii="Times New Roman" w:hAnsi="Times New Roman" w:cs="Times New Roman"/>
         </w:rPr>
@@ -2864,6 +3541,7 @@
           <w:ilvl w:val="0"/>
           <w:numId w:val="2"/>
         </w:numPr>
+        <w:jc w:val="both"/>
         <w:rPr>
           <w:rFonts w:ascii="Times New Roman" w:hAnsi="Times New Roman" w:cs="Times New Roman"/>
         </w:rPr>
@@ -2877,52 +3555,88 @@
     </w:p>
     <w:p>
       <w:pPr>
-        <w:rPr>
-          <w:rFonts w:ascii="Times New Roman" w:hAnsi="Times New Roman" w:cs="Times New Roman"/>
-        </w:rPr>
-      </w:pPr>
-      <w:r>
-        <w:rPr>
-          <w:rFonts w:ascii="Times New Roman" w:hAnsi="Times New Roman" w:cs="Times New Roman"/>
+        <w:jc w:val="both"/>
+        <w:rPr>
+          <w:rFonts w:ascii="Times New Roman" w:hAnsi="Times New Roman" w:cs="Times New Roman"/>
+          <w:b/>
+          <w:bCs/>
+          <w:sz w:val="40"/>
+          <w:szCs w:val="40"/>
+        </w:rPr>
+      </w:pPr>
+      <w:r>
+        <w:rPr>
+          <w:rFonts w:ascii="Times New Roman" w:hAnsi="Times New Roman" w:cs="Times New Roman"/>
+          <w:b/>
+          <w:bCs/>
+          <w:sz w:val="40"/>
+          <w:szCs w:val="40"/>
         </w:rPr>
         <w:t>B27. Apply a learned concept in this unit to a real-world application/problem/environment.</w:t>
       </w:r>
     </w:p>
     <w:p>
       <w:pPr>
-        <w:rPr>
-          <w:rFonts w:ascii="Times New Roman" w:hAnsi="Times New Roman" w:cs="Times New Roman"/>
-        </w:rPr>
-      </w:pPr>
-      <w:r>
-        <w:rPr>
-          <w:rFonts w:ascii="Times New Roman" w:hAnsi="Times New Roman" w:cs="Times New Roman"/>
+        <w:jc w:val="both"/>
+        <w:rPr>
+          <w:rFonts w:ascii="Times New Roman" w:hAnsi="Times New Roman" w:cs="Times New Roman"/>
+          <w:b/>
+          <w:bCs/>
+          <w:sz w:val="40"/>
+          <w:szCs w:val="40"/>
+        </w:rPr>
+      </w:pPr>
+      <w:r>
+        <w:rPr>
+          <w:rFonts w:ascii="Times New Roman" w:hAnsi="Times New Roman" w:cs="Times New Roman"/>
+          <w:b/>
+          <w:bCs/>
+          <w:sz w:val="40"/>
+          <w:szCs w:val="40"/>
         </w:rPr>
         <w:t>B28. Produce a cyber safety flyer for (choose 1): elders, high school students, CEOs, Uni students.</w:t>
       </w:r>
     </w:p>
     <w:p>
       <w:pPr>
-        <w:rPr>
-          <w:rFonts w:ascii="Times New Roman" w:hAnsi="Times New Roman" w:cs="Times New Roman"/>
-        </w:rPr>
-      </w:pPr>
-      <w:r>
-        <w:rPr>
-          <w:rFonts w:ascii="Times New Roman" w:hAnsi="Times New Roman" w:cs="Times New Roman"/>
+        <w:jc w:val="both"/>
+        <w:rPr>
+          <w:rFonts w:ascii="Times New Roman" w:hAnsi="Times New Roman" w:cs="Times New Roman"/>
+          <w:b/>
+          <w:bCs/>
+          <w:sz w:val="40"/>
+          <w:szCs w:val="40"/>
+        </w:rPr>
+      </w:pPr>
+      <w:r>
+        <w:rPr>
+          <w:rFonts w:ascii="Times New Roman" w:hAnsi="Times New Roman" w:cs="Times New Roman"/>
+          <w:b/>
+          <w:bCs/>
+          <w:sz w:val="40"/>
+          <w:szCs w:val="40"/>
         </w:rPr>
         <w:t>B29. Find a CVE in this year and fix it using three different generative AI systems (e.g., ChatGPT, Gemini), comparing the consistency.</w:t>
       </w:r>
     </w:p>
     <w:p>
       <w:pPr>
-        <w:rPr>
-          <w:rFonts w:ascii="Times New Roman" w:hAnsi="Times New Roman" w:cs="Times New Roman"/>
-        </w:rPr>
-      </w:pPr>
-      <w:r>
-        <w:rPr>
-          <w:rFonts w:ascii="Times New Roman" w:hAnsi="Times New Roman" w:cs="Times New Roman"/>
+        <w:jc w:val="both"/>
+        <w:rPr>
+          <w:rFonts w:ascii="Times New Roman" w:hAnsi="Times New Roman" w:cs="Times New Roman"/>
+          <w:b/>
+          <w:bCs/>
+          <w:sz w:val="40"/>
+          <w:szCs w:val="40"/>
+        </w:rPr>
+      </w:pPr>
+      <w:r>
+        <w:rPr>
+          <w:rFonts w:ascii="Times New Roman" w:hAnsi="Times New Roman" w:cs="Times New Roman"/>
+          <w:b/>
+          <w:bCs/>
+          <w:sz w:val="40"/>
+          <w:szCs w:val="40"/>
         </w:rPr>
         <w:t>B30. Generate an AI-created image, applying an imperceptible watermark on it and then perform an image-to-image regeneration or editing process to make sure the watermark is detectable---the watermark survives.</w:t>
       </w:r>
@@ -2940,10 +3654,10 @@
 <file path=word/numbering.xml><?xml version="1.0" encoding="utf-8"?>
 <w:numbering xmlns:wpc="http://schemas.microsoft.com/office/word/2010/wordprocessingCanvas" xmlns:cx="http://schemas.microsoft.com/office/drawing/2014/chartex" xmlns:cx1="http://schemas.microsoft.com/office/drawing/2015/9/8/chartex" xmlns:cx2="http://schemas.microsoft.com/office/drawing/2015/10/21/chartex" xmlns:cx3="http://schemas.microsoft.com/office/drawing/2016/5/9/chartex" xmlns:cx4="http://schemas.microsoft.com/office/drawing/2016/5/10/chartex" xmlns:cx5="http://schemas.microsoft.com/office/drawing/2016/5/11/chartex" xmlns:cx6="http://schemas.microsoft.com/office/drawing/2016/5/12/chartex" xmlns:cx7="http://schemas.microsoft.com/office/drawing/2016/5/13/chartex" xmlns:cx8="http://schemas.microsoft.com/office/drawing/2016/5/14/chartex" xmlns:mc="http://schemas.openxmlformats.org/markup-compatibility/2006" xmlns:aink="http://schemas.microsoft.com/office/drawing/2016/ink" xmlns:am3d="http://schemas.microsoft.com/office/drawing/2017/model3d" xmlns:o="urn:schemas-microsoft-com:office:office" xmlns:oel="http://schemas.microsoft.com/office/2019/extlst" xmlns:r="http://schemas.openxmlformats.org/officeDocument/2006/relationships" xmlns:m="http://schemas.openxmlformats.org/officeDocument/2006/math" xmlns:v="urn:schemas-microsoft-com:vml" xmlns:wp14="http://schemas.microsoft.com/office/word/2010/wordprocessingDrawing" xmlns:wp="http://schemas.openxmlformats.org/drawingml/2006/wordprocessingDrawing" xmlns:w10="urn:schemas-microsoft-com:office:word" xmlns:w="http://schemas.openxmlformats.org/wordprocessingml/2006/main" xmlns:w14="http://schemas.microsoft.com/office/word/2010/wordml" xmlns:w15="http://schemas.microsoft.com/office/word/2012/wordml" xmlns:w16cex="http://schemas.microsoft.com/office/word/2018/wordml/cex" xmlns:w16cid="http://schemas.microsoft.com/office/word/2016/wordml/cid" xmlns:w16="http://schemas.microsoft.com/office/word/2018/wordml" xmlns:w16du="http://schemas.microsoft.com/office/word/2023/wordml/word16du" xmlns:w16sdtdh="http://schemas.microsoft.com/office/word/2020/wordml/sdtdatahash" xmlns:w16sdtfl="http://schemas.microsoft.com/office/word/2024/wordml/sdtformatlock" xmlns:w16se="http://schemas.microsoft.com/office/word/2015/wordml/symex" xmlns:wpg="http://schemas.microsoft.com/office/word/2010/wordprocessingGroup" xmlns:wpi="http://schemas.microsoft.com/office/word/2010/wordprocessingInk" xmlns:wne="http://schemas.microsoft.com/office/word/2006/wordml" xmlns:wps="http://schemas.microsoft.com/office/word/2010/wordprocessingShape" mc:Ignorable="w14 w15 w16se w16cid w16 w16cex w16sdtdh w16sdtfl w16du wp14">
   <w:abstractNum w:abstractNumId="0" w15:restartNumberingAfterBreak="0">
-    <w:nsid w:val="2E4E2B84"/>
+    <w:nsid w:val="2CB610C4"/>
     <w:multiLevelType w:val="hybridMultilevel"/>
-    <w:tmpl w:val="607CD28C"/>
-    <w:lvl w:ilvl="0" w:tplc="BA280AD2">
+    <w:tmpl w:val="443041B6"/>
+    <w:lvl w:ilvl="0" w:tplc="2D2AFE60">
       <w:numFmt w:val="bullet"/>
       <w:lvlText w:val="-"/>
       <w:lvlJc w:val="left"/>
@@ -3052,10 +3766,10 @@
     </w:lvl>
   </w:abstractNum>
   <w:abstractNum w:abstractNumId="1" w15:restartNumberingAfterBreak="0">
-    <w:nsid w:val="3A837167"/>
+    <w:nsid w:val="2E4E2B84"/>
     <w:multiLevelType w:val="hybridMultilevel"/>
-    <w:tmpl w:val="22E28BE2"/>
-    <w:lvl w:ilvl="0" w:tplc="8A28A610">
+    <w:tmpl w:val="607CD28C"/>
+    <w:lvl w:ilvl="0" w:tplc="BA280AD2">
       <w:numFmt w:val="bullet"/>
       <w:lvlText w:val="-"/>
       <w:lvlJc w:val="left"/>
@@ -3164,10 +3878,10 @@
     </w:lvl>
   </w:abstractNum>
   <w:abstractNum w:abstractNumId="2" w15:restartNumberingAfterBreak="0">
-    <w:nsid w:val="5BD67332"/>
+    <w:nsid w:val="3A837167"/>
     <w:multiLevelType w:val="hybridMultilevel"/>
-    <w:tmpl w:val="A9B05A78"/>
-    <w:lvl w:ilvl="0" w:tplc="CE1EC964">
+    <w:tmpl w:val="22E28BE2"/>
+    <w:lvl w:ilvl="0" w:tplc="8A28A610">
       <w:numFmt w:val="bullet"/>
       <w:lvlText w:val="-"/>
       <w:lvlJc w:val="left"/>
@@ -3275,13 +3989,128 @@
       </w:rPr>
     </w:lvl>
   </w:abstractNum>
+  <w:abstractNum w:abstractNumId="3" w15:restartNumberingAfterBreak="0">
+    <w:nsid w:val="5BD67332"/>
+    <w:multiLevelType w:val="hybridMultilevel"/>
+    <w:tmpl w:val="A9B05A78"/>
+    <w:lvl w:ilvl="0" w:tplc="CE1EC964">
+      <w:numFmt w:val="bullet"/>
+      <w:lvlText w:val="-"/>
+      <w:lvlJc w:val="left"/>
+      <w:pPr>
+        <w:ind w:left="720" w:hanging="360"/>
+      </w:pPr>
+      <w:rPr>
+        <w:rFonts w:ascii="Times New Roman" w:eastAsiaTheme="minorEastAsia" w:hAnsi="Times New Roman" w:cs="Times New Roman" w:hint="default"/>
+      </w:rPr>
+    </w:lvl>
+    <w:lvl w:ilvl="1" w:tplc="38090003" w:tentative="1">
+      <w:start w:val="1"/>
+      <w:numFmt w:val="bullet"/>
+      <w:lvlText w:val="o"/>
+      <w:lvlJc w:val="left"/>
+      <w:pPr>
+        <w:ind w:left="1440" w:hanging="360"/>
+      </w:pPr>
+      <w:rPr>
+        <w:rFonts w:ascii="Courier New" w:hAnsi="Courier New" w:cs="Courier New" w:hint="default"/>
+      </w:rPr>
+    </w:lvl>
+    <w:lvl w:ilvl="2" w:tplc="38090005" w:tentative="1">
+      <w:start w:val="1"/>
+      <w:numFmt w:val="bullet"/>
+      <w:lvlText w:val=""/>
+      <w:lvlJc w:val="left"/>
+      <w:pPr>
+        <w:ind w:left="2160" w:hanging="360"/>
+      </w:pPr>
+      <w:rPr>
+        <w:rFonts w:ascii="Wingdings" w:hAnsi="Wingdings" w:hint="default"/>
+      </w:rPr>
+    </w:lvl>
+    <w:lvl w:ilvl="3" w:tplc="38090001" w:tentative="1">
+      <w:start w:val="1"/>
+      <w:numFmt w:val="bullet"/>
+      <w:lvlText w:val=""/>
+      <w:lvlJc w:val="left"/>
+      <w:pPr>
+        <w:ind w:left="2880" w:hanging="360"/>
+      </w:pPr>
+      <w:rPr>
+        <w:rFonts w:ascii="Symbol" w:hAnsi="Symbol" w:hint="default"/>
+      </w:rPr>
+    </w:lvl>
+    <w:lvl w:ilvl="4" w:tplc="38090003" w:tentative="1">
+      <w:start w:val="1"/>
+      <w:numFmt w:val="bullet"/>
+      <w:lvlText w:val="o"/>
+      <w:lvlJc w:val="left"/>
+      <w:pPr>
+        <w:ind w:left="3600" w:hanging="360"/>
+      </w:pPr>
+      <w:rPr>
+        <w:rFonts w:ascii="Courier New" w:hAnsi="Courier New" w:cs="Courier New" w:hint="default"/>
+      </w:rPr>
+    </w:lvl>
+    <w:lvl w:ilvl="5" w:tplc="38090005" w:tentative="1">
+      <w:start w:val="1"/>
+      <w:numFmt w:val="bullet"/>
+      <w:lvlText w:val=""/>
+      <w:lvlJc w:val="left"/>
+      <w:pPr>
+        <w:ind w:left="4320" w:hanging="360"/>
+      </w:pPr>
+      <w:rPr>
+        <w:rFonts w:ascii="Wingdings" w:hAnsi="Wingdings" w:hint="default"/>
+      </w:rPr>
+    </w:lvl>
+    <w:lvl w:ilvl="6" w:tplc="38090001" w:tentative="1">
+      <w:start w:val="1"/>
+      <w:numFmt w:val="bullet"/>
+      <w:lvlText w:val=""/>
+      <w:lvlJc w:val="left"/>
+      <w:pPr>
+        <w:ind w:left="5040" w:hanging="360"/>
+      </w:pPr>
+      <w:rPr>
+        <w:rFonts w:ascii="Symbol" w:hAnsi="Symbol" w:hint="default"/>
+      </w:rPr>
+    </w:lvl>
+    <w:lvl w:ilvl="7" w:tplc="38090003" w:tentative="1">
+      <w:start w:val="1"/>
+      <w:numFmt w:val="bullet"/>
+      <w:lvlText w:val="o"/>
+      <w:lvlJc w:val="left"/>
+      <w:pPr>
+        <w:ind w:left="5760" w:hanging="360"/>
+      </w:pPr>
+      <w:rPr>
+        <w:rFonts w:ascii="Courier New" w:hAnsi="Courier New" w:cs="Courier New" w:hint="default"/>
+      </w:rPr>
+    </w:lvl>
+    <w:lvl w:ilvl="8" w:tplc="38090005" w:tentative="1">
+      <w:start w:val="1"/>
+      <w:numFmt w:val="bullet"/>
+      <w:lvlText w:val=""/>
+      <w:lvlJc w:val="left"/>
+      <w:pPr>
+        <w:ind w:left="6480" w:hanging="360"/>
+      </w:pPr>
+      <w:rPr>
+        <w:rFonts w:ascii="Wingdings" w:hAnsi="Wingdings" w:hint="default"/>
+      </w:rPr>
+    </w:lvl>
+  </w:abstractNum>
   <w:num w:numId="1" w16cid:durableId="1117142885">
+    <w:abstractNumId w:val="2"/>
+  </w:num>
+  <w:num w:numId="2" w16cid:durableId="1716612018">
+    <w:abstractNumId w:val="3"/>
+  </w:num>
+  <w:num w:numId="3" w16cid:durableId="273758257">
     <w:abstractNumId w:val="1"/>
   </w:num>
-  <w:num w:numId="2" w16cid:durableId="1716612018">
-    <w:abstractNumId w:val="2"/>
-  </w:num>
-  <w:num w:numId="3" w16cid:durableId="273758257">
+  <w:num w:numId="4" w16cid:durableId="399601645">
     <w:abstractNumId w:val="0"/>
   </w:num>
 </w:numbering>
@@ -3890,6 +4719,7 @@
   <w:style w:type="character" w:default="1" w:styleId="DefaultParagraphFont">
     <w:name w:val="Default Paragraph Font"/>
     <w:uiPriority w:val="1"/>
+    <w:semiHidden/>
     <w:unhideWhenUsed/>
   </w:style>
   <w:style w:type="table" w:default="1" w:styleId="TableNormal">
@@ -4252,6 +5082,18 @@
       </w:tblBorders>
     </w:tblPr>
   </w:style>
+  <w:style w:type="character" w:styleId="UnresolvedMention">
+    <w:name w:val="Unresolved Mention"/>
+    <w:basedOn w:val="DefaultParagraphFont"/>
+    <w:uiPriority w:val="99"/>
+    <w:semiHidden/>
+    <w:unhideWhenUsed/>
+    <w:rsid w:val="003F3EC6"/>
+    <w:rPr>
+      <w:color w:val="605E5C"/>
+      <w:shd w:val="clear" w:color="auto" w:fill="E1DFDD"/>
+    </w:rPr>
+  </w:style>
 </w:styles>
 </file>
 

</xml_diff>

<commit_message>
Finished Activity B4. Wrote about the activities and added evidence.
</commit_message>
<xml_diff>
--- a/Portfolio/Part-2-Activities.docx
+++ b/Portfolio/Part-2-Activities.docx
@@ -690,7 +690,7 @@
               <w:rPr>
                 <w:rFonts w:ascii="Times New Roman" w:hAnsi="Times New Roman" w:cs="Times New Roman"/>
               </w:rPr>
-              <w:t>In Prog.</w:t>
+              <w:t>2</w:t>
             </w:r>
           </w:p>
         </w:tc>
@@ -2581,6 +2581,14 @@
         <w:jc w:val="both"/>
         <w:rPr>
           <w:rFonts w:ascii="Times New Roman" w:hAnsi="Times New Roman" w:cs="Times New Roman"/>
+        </w:rPr>
+      </w:pPr>
+    </w:p>
+    <w:p>
+      <w:pPr>
+        <w:jc w:val="both"/>
+        <w:rPr>
+          <w:rFonts w:ascii="Times New Roman" w:hAnsi="Times New Roman" w:cs="Times New Roman"/>
           <w:u w:val="single"/>
         </w:rPr>
       </w:pPr>
@@ -2597,6 +2605,155 @@
         <w:jc w:val="both"/>
         <w:rPr>
           <w:rFonts w:ascii="Times New Roman" w:hAnsi="Times New Roman" w:cs="Times New Roman"/>
+        </w:rPr>
+      </w:pPr>
+      <w:r>
+        <w:rPr>
+          <w:rFonts w:ascii="Times New Roman" w:hAnsi="Times New Roman" w:cs="Times New Roman"/>
+        </w:rPr>
+        <w:t xml:space="preserve">Since this week’s lecture was about Privacy, the class activity was about Multiple Party Computation (MPC), which is a technique on sharing information to other parties without revealing your own information. In my group, we were told to think of a random number and </w:t>
+      </w:r>
+      <w:r>
+        <w:rPr>
+          <w:rFonts w:ascii="Times New Roman" w:hAnsi="Times New Roman" w:cs="Times New Roman"/>
+        </w:rPr>
+        <w:lastRenderedPageBreak/>
+        <w:t>not tell the others about our number, but somehow get the average of all our numbers combined. We tried following the method shown in the lecture slides (Lecture 03. Privacy Slide 60-63) where we kept a portion of our number to ourselves and split the remaining to the others (some equally shared, some unequal). Then we add up all the numbers we received, including our private portion of the number we kept</w:t>
+      </w:r>
+      <w:r>
+        <w:rPr>
+          <w:rFonts w:ascii="Times New Roman" w:hAnsi="Times New Roman" w:cs="Times New Roman"/>
+        </w:rPr>
+        <w:t xml:space="preserve"> to get the total, which we then will divide by 5 to get the average. Then we compare our average with the other. </w:t>
+      </w:r>
+    </w:p>
+    <w:p>
+      <w:pPr>
+        <w:jc w:val="both"/>
+        <w:rPr>
+          <w:rFonts w:ascii="Times New Roman" w:hAnsi="Times New Roman" w:cs="Times New Roman"/>
+        </w:rPr>
+      </w:pPr>
+      <w:r>
+        <w:rPr>
+          <w:rFonts w:ascii="Times New Roman" w:hAnsi="Times New Roman" w:cs="Times New Roman"/>
+        </w:rPr>
+        <w:t xml:space="preserve">Somehow, we managed to get different results and I think we had some miscalculation or we missed a step along the way since the actual average (once we revealed our numbers to check) was different from the averages everyone calculated, especially since each person got a different average. </w:t>
+      </w:r>
+    </w:p>
+    <w:p>
+      <w:pPr>
+        <w:jc w:val="both"/>
+        <w:rPr>
+          <w:rFonts w:ascii="Times New Roman" w:hAnsi="Times New Roman" w:cs="Times New Roman"/>
+        </w:rPr>
+      </w:pPr>
+      <w:r>
+        <w:rPr>
+          <w:rFonts w:ascii="Times New Roman" w:hAnsi="Times New Roman" w:cs="Times New Roman"/>
+        </w:rPr>
+        <w:t xml:space="preserve">The method the lab facilitator gave was quite simple. The starting person picks a random number and adds it to their number. Then they pass along that number to the others, where each person will then add their number and pass it along, and so on and so forth, until it comes back to that first person, where they </w:t>
+      </w:r>
+      <w:r>
+        <w:rPr>
+          <w:rFonts w:ascii="Times New Roman" w:hAnsi="Times New Roman" w:cs="Times New Roman"/>
+        </w:rPr>
+        <w:t xml:space="preserve">would </w:t>
+      </w:r>
+      <w:r>
+        <w:rPr>
+          <w:rFonts w:ascii="Times New Roman" w:hAnsi="Times New Roman" w:cs="Times New Roman"/>
+        </w:rPr>
+        <w:t xml:space="preserve">subtract the </w:t>
+      </w:r>
+      <w:r>
+        <w:rPr>
+          <w:rFonts w:ascii="Times New Roman" w:hAnsi="Times New Roman" w:cs="Times New Roman"/>
+        </w:rPr>
+        <w:t>sum</w:t>
+      </w:r>
+      <w:r>
+        <w:rPr>
+          <w:rFonts w:ascii="Times New Roman" w:hAnsi="Times New Roman" w:cs="Times New Roman"/>
+        </w:rPr>
+        <w:t xml:space="preserve"> they received with the random number they added in the beginning, which would then give the total needed to find the average.</w:t>
+      </w:r>
+    </w:p>
+    <w:p>
+      <w:pPr>
+        <w:jc w:val="both"/>
+        <w:rPr>
+          <w:rFonts w:ascii="Times New Roman" w:hAnsi="Times New Roman" w:cs="Times New Roman"/>
+        </w:rPr>
+      </w:pPr>
+      <w:r>
+        <w:rPr>
+          <w:rFonts w:ascii="Times New Roman" w:hAnsi="Times New Roman" w:cs="Times New Roman"/>
+        </w:rPr>
+        <w:t xml:space="preserve">Evidence for this activity </w:t>
+      </w:r>
+      <w:r>
+        <w:rPr>
+          <w:rFonts w:ascii="Times New Roman" w:hAnsi="Times New Roman" w:cs="Times New Roman"/>
+        </w:rPr>
+        <w:t xml:space="preserve">(mostly paper-based calculations and the student names and numbers of our group) </w:t>
+      </w:r>
+      <w:r>
+        <w:rPr>
+          <w:rFonts w:ascii="Times New Roman" w:hAnsi="Times New Roman" w:cs="Times New Roman"/>
+        </w:rPr>
+        <w:t xml:space="preserve">will be under directory “B4” with images “In-Class Lab Activity </w:t>
+      </w:r>
+      <w:r>
+        <w:rPr>
+          <w:rFonts w:ascii="Times New Roman" w:hAnsi="Times New Roman" w:cs="Times New Roman"/>
+        </w:rPr>
+        <w:t>2</w:t>
+      </w:r>
+      <w:r>
+        <w:rPr>
+          <w:rFonts w:ascii="Times New Roman" w:hAnsi="Times New Roman" w:cs="Times New Roman"/>
+        </w:rPr>
+        <w:t xml:space="preserve">.1 </w:t>
+      </w:r>
+      <w:r>
+        <w:rPr>
+          <w:rFonts w:ascii="Times New Roman" w:hAnsi="Times New Roman" w:cs="Times New Roman"/>
+        </w:rPr>
+        <w:t>–</w:t>
+      </w:r>
+      <w:r>
+        <w:rPr>
+          <w:rFonts w:ascii="Times New Roman" w:hAnsi="Times New Roman" w:cs="Times New Roman"/>
+        </w:rPr>
+        <w:t xml:space="preserve"> </w:t>
+      </w:r>
+      <w:r>
+        <w:rPr>
+          <w:rFonts w:ascii="Times New Roman" w:hAnsi="Times New Roman" w:cs="Times New Roman"/>
+        </w:rPr>
+        <w:t>2.4</w:t>
+      </w:r>
+      <w:r>
+        <w:rPr>
+          <w:rFonts w:ascii="Times New Roman" w:hAnsi="Times New Roman" w:cs="Times New Roman"/>
+        </w:rPr>
+        <w:t>”.</w:t>
+      </w:r>
+    </w:p>
+    <w:p>
+      <w:pPr>
+        <w:jc w:val="both"/>
+        <w:rPr>
+          <w:rFonts w:ascii="Times New Roman" w:hAnsi="Times New Roman" w:cs="Times New Roman"/>
+        </w:rPr>
+      </w:pPr>
+    </w:p>
+    <w:p>
+      <w:pPr>
+        <w:jc w:val="both"/>
+        <w:rPr>
+          <w:rFonts w:ascii="Times New Roman" w:hAnsi="Times New Roman" w:cs="Times New Roman"/>
           <w:u w:val="single"/>
         </w:rPr>
       </w:pPr>
@@ -2613,6 +2770,111 @@
         <w:jc w:val="both"/>
         <w:rPr>
           <w:rFonts w:ascii="Times New Roman" w:hAnsi="Times New Roman" w:cs="Times New Roman"/>
+        </w:rPr>
+      </w:pPr>
+      <w:r>
+        <w:rPr>
+          <w:rFonts w:ascii="Times New Roman" w:hAnsi="Times New Roman" w:cs="Times New Roman"/>
+        </w:rPr>
+        <w:t>The topic for this week’s lecture was Access Control, and the lab activity we did was Ruleset-based Access Control, where each of our groups had to come up with 4 rules that had to apply to all the members</w:t>
+      </w:r>
+      <w:r>
+        <w:rPr>
+          <w:rFonts w:ascii="Times New Roman" w:hAnsi="Times New Roman" w:cs="Times New Roman"/>
+        </w:rPr>
+        <w:t>, then another group has to guess what all our rules were. My evidence for this, as shown below and in the directory “B4” under “In-Class Lab Activity 3.1”, contains the rules my group made, along with the group members’ name and student number. I forgot to take a picture of the rules of the other group we had to guess, but if I remember correctly, one of their rules had to do with a specific amount of laptop Operating Systems</w:t>
+      </w:r>
+      <w:r>
+        <w:rPr>
+          <w:rFonts w:ascii="Times New Roman" w:hAnsi="Times New Roman" w:cs="Times New Roman"/>
+        </w:rPr>
+        <w:t xml:space="preserve"> (t</w:t>
+      </w:r>
+      <w:r>
+        <w:rPr>
+          <w:rFonts w:ascii="Times New Roman" w:hAnsi="Times New Roman" w:cs="Times New Roman"/>
+        </w:rPr>
+        <w:t>he group was all male, around 5-6 members I think</w:t>
+      </w:r>
+      <w:r>
+        <w:rPr>
+          <w:rFonts w:ascii="Times New Roman" w:hAnsi="Times New Roman" w:cs="Times New Roman"/>
+        </w:rPr>
+        <w:t>?).</w:t>
+      </w:r>
+    </w:p>
+    <w:p>
+      <w:pPr>
+        <w:jc w:val="both"/>
+        <w:rPr>
+          <w:rFonts w:ascii="Times New Roman" w:hAnsi="Times New Roman" w:cs="Times New Roman"/>
+        </w:rPr>
+      </w:pPr>
+      <w:r>
+        <w:rPr>
+          <w:noProof/>
+        </w:rPr>
+        <w:lastRenderedPageBreak/>
+        <w:drawing>
+          <wp:inline distT="0" distB="0" distL="0" distR="0" wp14:anchorId="29F39A27" wp14:editId="167B6EDF">
+            <wp:extent cx="4989830" cy="4508500"/>
+            <wp:effectExtent l="0" t="0" r="1270" b="6350"/>
+            <wp:docPr id="445830486" name="Picture 2"/>
+            <wp:cNvGraphicFramePr>
+              <a:graphicFrameLocks xmlns:a="http://schemas.openxmlformats.org/drawingml/2006/main" noChangeAspect="1"/>
+            </wp:cNvGraphicFramePr>
+            <a:graphic xmlns:a="http://schemas.openxmlformats.org/drawingml/2006/main">
+              <a:graphicData uri="http://schemas.openxmlformats.org/drawingml/2006/picture">
+                <pic:pic xmlns:pic="http://schemas.openxmlformats.org/drawingml/2006/picture">
+                  <pic:nvPicPr>
+                    <pic:cNvPr id="0" name="Picture 1"/>
+                    <pic:cNvPicPr>
+                      <a:picLocks noChangeAspect="1" noChangeArrowheads="1"/>
+                    </pic:cNvPicPr>
+                  </pic:nvPicPr>
+                  <pic:blipFill rotWithShape="1">
+                    <a:blip r:embed="rId6" cstate="print">
+                      <a:extLst>
+                        <a:ext uri="{28A0092B-C50C-407E-A947-70E740481C1C}">
+                          <a14:useLocalDpi xmlns:a14="http://schemas.microsoft.com/office/drawing/2010/main" val="0"/>
+                        </a:ext>
+                      </a:extLst>
+                    </a:blip>
+                    <a:srcRect b="49133"/>
+                    <a:stretch>
+                      <a:fillRect/>
+                    </a:stretch>
+                  </pic:blipFill>
+                  <pic:spPr bwMode="auto">
+                    <a:xfrm>
+                      <a:off x="0" y="0"/>
+                      <a:ext cx="4989830" cy="4508500"/>
+                    </a:xfrm>
+                    <a:prstGeom prst="rect">
+                      <a:avLst/>
+                    </a:prstGeom>
+                    <a:noFill/>
+                    <a:ln>
+                      <a:noFill/>
+                    </a:ln>
+                    <a:extLst>
+                      <a:ext uri="{53640926-AAD7-44D8-BBD7-CCE9431645EC}">
+                        <a14:shadowObscured xmlns:a14="http://schemas.microsoft.com/office/drawing/2010/main"/>
+                      </a:ext>
+                    </a:extLst>
+                  </pic:spPr>
+                </pic:pic>
+              </a:graphicData>
+            </a:graphic>
+          </wp:inline>
+        </w:drawing>
+      </w:r>
+    </w:p>
+    <w:p>
+      <w:pPr>
+        <w:jc w:val="both"/>
+        <w:rPr>
+          <w:rFonts w:ascii="Times New Roman" w:hAnsi="Times New Roman" w:cs="Times New Roman"/>
           <w:b/>
           <w:bCs/>
           <w:sz w:val="40"/>
@@ -2663,7 +2925,6 @@
           <w:sz w:val="40"/>
           <w:szCs w:val="40"/>
         </w:rPr>
-        <w:lastRenderedPageBreak/>
         <w:t>B6. Attend 2 cyber ethics/law related talks/seminars.</w:t>
       </w:r>
     </w:p>
@@ -2795,6 +3056,7 @@
           <w:sz w:val="40"/>
           <w:szCs w:val="40"/>
         </w:rPr>
+        <w:lastRenderedPageBreak/>
         <w:t>B11. Talk to 2 cybersecurity experts from the industry and find out their latest projects.</w:t>
       </w:r>
     </w:p>
@@ -3021,10 +3283,9 @@
         <w:rPr>
           <w:rFonts w:ascii="Times New Roman" w:hAnsi="Times New Roman" w:cs="Times New Roman"/>
         </w:rPr>
-        <w:lastRenderedPageBreak/>
         <w:t xml:space="preserve">She also mentioned operational technology, which is a physical industrial control system (or according to </w:t>
       </w:r>
-      <w:hyperlink r:id="rId6" w:history="1">
+      <w:hyperlink r:id="rId7" w:history="1">
         <w:r>
           <w:rPr>
             <w:rStyle w:val="Hyperlink"/>
@@ -3115,6 +3376,7 @@
           <w:sz w:val="40"/>
           <w:szCs w:val="40"/>
         </w:rPr>
+        <w:lastRenderedPageBreak/>
         <w:t>B14. Teach your friends about cybersecurity topic of your choice.</w:t>
       </w:r>
     </w:p>
@@ -3288,95 +3550,95 @@
           <w:sz w:val="40"/>
           <w:szCs w:val="40"/>
         </w:rPr>
+        <w:t>B21. Design and implement a cybersecurity learning activity.</w:t>
+      </w:r>
+    </w:p>
+    <w:p>
+      <w:pPr>
+        <w:jc w:val="both"/>
+        <w:rPr>
+          <w:rFonts w:ascii="Times New Roman" w:hAnsi="Times New Roman" w:cs="Times New Roman"/>
+          <w:b/>
+          <w:bCs/>
+          <w:sz w:val="40"/>
+          <w:szCs w:val="40"/>
+        </w:rPr>
+      </w:pPr>
+      <w:r>
+        <w:rPr>
+          <w:rFonts w:ascii="Times New Roman" w:hAnsi="Times New Roman" w:cs="Times New Roman"/>
+          <w:b/>
+          <w:bCs/>
+          <w:sz w:val="40"/>
+          <w:szCs w:val="40"/>
+        </w:rPr>
+        <w:t>B22. Enhance the cybersecurity of a website from your community.</w:t>
+      </w:r>
+    </w:p>
+    <w:p>
+      <w:pPr>
+        <w:jc w:val="both"/>
+        <w:rPr>
+          <w:rFonts w:ascii="Times New Roman" w:hAnsi="Times New Roman" w:cs="Times New Roman"/>
+          <w:b/>
+          <w:bCs/>
+          <w:sz w:val="40"/>
+          <w:szCs w:val="40"/>
+        </w:rPr>
+      </w:pPr>
+      <w:r>
+        <w:rPr>
+          <w:rFonts w:ascii="Times New Roman" w:hAnsi="Times New Roman" w:cs="Times New Roman"/>
+          <w:b/>
+          <w:bCs/>
+          <w:sz w:val="40"/>
+          <w:szCs w:val="40"/>
+        </w:rPr>
+        <w:t>B23. Test an intrusion detection system and discuss its effectiveness.</w:t>
+      </w:r>
+    </w:p>
+    <w:p>
+      <w:pPr>
+        <w:jc w:val="both"/>
+        <w:rPr>
+          <w:rFonts w:ascii="Times New Roman" w:hAnsi="Times New Roman" w:cs="Times New Roman"/>
+          <w:b/>
+          <w:bCs/>
+          <w:sz w:val="40"/>
+          <w:szCs w:val="40"/>
+        </w:rPr>
+      </w:pPr>
+      <w:r>
+        <w:rPr>
+          <w:rFonts w:ascii="Times New Roman" w:hAnsi="Times New Roman" w:cs="Times New Roman"/>
+          <w:b/>
+          <w:bCs/>
+          <w:sz w:val="40"/>
+          <w:szCs w:val="40"/>
+        </w:rPr>
+        <w:t>B24. Design and implement access control of your choice.</w:t>
+      </w:r>
+    </w:p>
+    <w:p>
+      <w:pPr>
+        <w:jc w:val="both"/>
+        <w:rPr>
+          <w:rFonts w:ascii="Times New Roman" w:hAnsi="Times New Roman" w:cs="Times New Roman"/>
+          <w:b/>
+          <w:bCs/>
+          <w:sz w:val="40"/>
+          <w:szCs w:val="40"/>
+        </w:rPr>
+      </w:pPr>
+      <w:r>
+        <w:rPr>
+          <w:rFonts w:ascii="Times New Roman" w:hAnsi="Times New Roman" w:cs="Times New Roman"/>
+          <w:b/>
+          <w:bCs/>
+          <w:sz w:val="40"/>
+          <w:szCs w:val="40"/>
+        </w:rPr>
         <w:lastRenderedPageBreak/>
-        <w:t>B21. Design and implement a cybersecurity learning activity.</w:t>
-      </w:r>
-    </w:p>
-    <w:p>
-      <w:pPr>
-        <w:jc w:val="both"/>
-        <w:rPr>
-          <w:rFonts w:ascii="Times New Roman" w:hAnsi="Times New Roman" w:cs="Times New Roman"/>
-          <w:b/>
-          <w:bCs/>
-          <w:sz w:val="40"/>
-          <w:szCs w:val="40"/>
-        </w:rPr>
-      </w:pPr>
-      <w:r>
-        <w:rPr>
-          <w:rFonts w:ascii="Times New Roman" w:hAnsi="Times New Roman" w:cs="Times New Roman"/>
-          <w:b/>
-          <w:bCs/>
-          <w:sz w:val="40"/>
-          <w:szCs w:val="40"/>
-        </w:rPr>
-        <w:t>B22. Enhance the cybersecurity of a website from your community.</w:t>
-      </w:r>
-    </w:p>
-    <w:p>
-      <w:pPr>
-        <w:jc w:val="both"/>
-        <w:rPr>
-          <w:rFonts w:ascii="Times New Roman" w:hAnsi="Times New Roman" w:cs="Times New Roman"/>
-          <w:b/>
-          <w:bCs/>
-          <w:sz w:val="40"/>
-          <w:szCs w:val="40"/>
-        </w:rPr>
-      </w:pPr>
-      <w:r>
-        <w:rPr>
-          <w:rFonts w:ascii="Times New Roman" w:hAnsi="Times New Roman" w:cs="Times New Roman"/>
-          <w:b/>
-          <w:bCs/>
-          <w:sz w:val="40"/>
-          <w:szCs w:val="40"/>
-        </w:rPr>
-        <w:t>B23. Test an intrusion detection system and discuss its effectiveness.</w:t>
-      </w:r>
-    </w:p>
-    <w:p>
-      <w:pPr>
-        <w:jc w:val="both"/>
-        <w:rPr>
-          <w:rFonts w:ascii="Times New Roman" w:hAnsi="Times New Roman" w:cs="Times New Roman"/>
-          <w:b/>
-          <w:bCs/>
-          <w:sz w:val="40"/>
-          <w:szCs w:val="40"/>
-        </w:rPr>
-      </w:pPr>
-      <w:r>
-        <w:rPr>
-          <w:rFonts w:ascii="Times New Roman" w:hAnsi="Times New Roman" w:cs="Times New Roman"/>
-          <w:b/>
-          <w:bCs/>
-          <w:sz w:val="40"/>
-          <w:szCs w:val="40"/>
-        </w:rPr>
-        <w:t>B24. Design and implement access control of your choice.</w:t>
-      </w:r>
-    </w:p>
-    <w:p>
-      <w:pPr>
-        <w:jc w:val="both"/>
-        <w:rPr>
-          <w:rFonts w:ascii="Times New Roman" w:hAnsi="Times New Roman" w:cs="Times New Roman"/>
-          <w:b/>
-          <w:bCs/>
-          <w:sz w:val="40"/>
-          <w:szCs w:val="40"/>
-        </w:rPr>
-      </w:pPr>
-      <w:r>
-        <w:rPr>
-          <w:rFonts w:ascii="Times New Roman" w:hAnsi="Times New Roman" w:cs="Times New Roman"/>
-          <w:b/>
-          <w:bCs/>
-          <w:sz w:val="40"/>
-          <w:szCs w:val="40"/>
-        </w:rPr>
         <w:t>B25. Design and implement a threat intelligence module of your choice.</w:t>
       </w:r>
     </w:p>
@@ -3430,7 +3692,7 @@
                     <pic:cNvPicPr/>
                   </pic:nvPicPr>
                   <pic:blipFill>
-                    <a:blip r:embed="rId7"/>
+                    <a:blip r:embed="rId8"/>
                     <a:stretch>
                       <a:fillRect/>
                     </a:stretch>
@@ -3499,7 +3761,6 @@
         <w:rPr>
           <w:rFonts w:ascii="Times New Roman" w:hAnsi="Times New Roman" w:cs="Times New Roman"/>
         </w:rPr>
-        <w:lastRenderedPageBreak/>
         <w:t>One-way property means that it is easy to get the hash of the message (forward direction), but it is very difficult/computationally infeasible to do the inverse, i.e. figure out the message from its hash.</w:t>
       </w:r>
       <w:r>
@@ -3572,6 +3833,7 @@
           <w:sz w:val="40"/>
           <w:szCs w:val="40"/>
         </w:rPr>
+        <w:lastRenderedPageBreak/>
         <w:t>B27. Apply a learned concept in this unit to a real-world application/problem/environment.</w:t>
       </w:r>
     </w:p>

</xml_diff>

<commit_message>
Finished B9 and B14 along with their evidence added to the directory
</commit_message>
<xml_diff>
--- a/Portfolio/Part-2-Activities.docx
+++ b/Portfolio/Part-2-Activities.docx
@@ -751,6 +751,12 @@
               </w:rPr>
               <w:t>1</w:t>
             </w:r>
+            <w:r>
+              <w:rPr>
+                <w:rFonts w:ascii="Times New Roman" w:hAnsi="Times New Roman" w:cs="Times New Roman"/>
+              </w:rPr>
+              <w:t>*</w:t>
+            </w:r>
           </w:p>
         </w:tc>
       </w:tr>
@@ -985,7 +991,7 @@
               <w:rPr>
                 <w:rFonts w:ascii="Times New Roman" w:hAnsi="Times New Roman" w:cs="Times New Roman"/>
               </w:rPr>
-              <w:t>In Prog.</w:t>
+              <w:t>2</w:t>
             </w:r>
           </w:p>
         </w:tc>
@@ -1268,7 +1274,7 @@
               <w:rPr>
                 <w:rFonts w:ascii="Times New Roman" w:hAnsi="Times New Roman" w:cs="Times New Roman"/>
               </w:rPr>
-              <w:t>In Prog.</w:t>
+              <w:t>2</w:t>
             </w:r>
           </w:p>
         </w:tc>
@@ -3273,22 +3279,90 @@
     </w:p>
     <w:p>
       <w:pPr>
-        <w:pStyle w:val="ListParagraph"/>
-        <w:numPr>
-          <w:ilvl w:val="0"/>
-          <w:numId w:val="4"/>
-        </w:numPr>
-        <w:jc w:val="both"/>
-        <w:rPr>
-          <w:rFonts w:ascii="Times New Roman" w:hAnsi="Times New Roman" w:cs="Times New Roman"/>
-        </w:rPr>
-      </w:pPr>
+        <w:jc w:val="both"/>
+        <w:rPr>
+          <w:rFonts w:ascii="Times New Roman" w:hAnsi="Times New Roman" w:cs="Times New Roman"/>
+        </w:rPr>
+      </w:pPr>
+      <w:r>
+        <w:rPr>
+          <w:rFonts w:ascii="Times New Roman" w:hAnsi="Times New Roman" w:cs="Times New Roman"/>
+        </w:rPr>
+        <w:t xml:space="preserve">The </w:t>
+      </w:r>
       <w:r>
         <w:rPr>
           <w:rFonts w:ascii="Times New Roman" w:hAnsi="Times New Roman" w:cs="Times New Roman"/>
         </w:rPr>
         <w:t>CyberThrive x CyberQueens</w:t>
       </w:r>
+      <w:r>
+        <w:rPr>
+          <w:rFonts w:ascii="Times New Roman" w:hAnsi="Times New Roman" w:cs="Times New Roman"/>
+        </w:rPr>
+        <w:t xml:space="preserve"> event hosted by CyberWest and WiTWA had a facilitated networking event, where all the participants were grouped based on their current stage of their cybersecurity career (green for student/currently studying, yellow for early stage in their career, orange for mid stage, and red for executive stage).</w:t>
+      </w:r>
+      <w:r>
+        <w:rPr>
+          <w:rFonts w:ascii="Times New Roman" w:hAnsi="Times New Roman" w:cs="Times New Roman"/>
+        </w:rPr>
+        <w:t xml:space="preserve"> Me, along with 2 other guys and 3 other mature aged female students, were grouped with a mentor who asked us questions about what problems have you encountered in your career and what resources have helped you so far in your career. One of the mature aged females in the group mentioned how she had difficulties getting back to her career after a break due to pregnancy, me and the other two guys (both of whom were UWA students) mentioned difficulties in group project and getting internships, while the other 2 mature aged females, who were Murdoch TAFE students, mentioned how they had difficulty in following their lectures because there was no recording where they can rewatch the lecture (which surprised me since UWA had lecture recordings, and we spent some time discussing this topic).</w:t>
+      </w:r>
+    </w:p>
+    <w:p>
+      <w:pPr>
+        <w:jc w:val="both"/>
+        <w:rPr>
+          <w:rFonts w:ascii="Times New Roman" w:hAnsi="Times New Roman" w:cs="Times New Roman"/>
+        </w:rPr>
+      </w:pPr>
+      <w:r>
+        <w:rPr>
+          <w:rFonts w:ascii="Times New Roman" w:hAnsi="Times New Roman" w:cs="Times New Roman"/>
+        </w:rPr>
+        <w:t xml:space="preserve">The cybersecurity resources that were mentioned were some websites like W3Schools that could help with the coding aspect of cybersecurity, and the mentor suggested whether we would </w:t>
+      </w:r>
+      <w:r>
+        <w:rPr>
+          <w:rFonts w:ascii="Times New Roman" w:hAnsi="Times New Roman" w:cs="Times New Roman"/>
+        </w:rPr>
+        <w:lastRenderedPageBreak/>
+        <w:t>be interested in a cross-school event where fellow cybersecurity students can connect with and help out one another (or something along those lines).</w:t>
+      </w:r>
+    </w:p>
+    <w:p>
+      <w:pPr>
+        <w:jc w:val="both"/>
+        <w:rPr>
+          <w:rFonts w:ascii="Times New Roman" w:hAnsi="Times New Roman" w:cs="Times New Roman"/>
+        </w:rPr>
+      </w:pPr>
+      <w:r>
+        <w:rPr>
+          <w:rFonts w:ascii="Times New Roman" w:hAnsi="Times New Roman" w:cs="Times New Roman"/>
+        </w:rPr>
+        <w:t>While talking with the others, I asked about whether they knew some cybersecurity events that were going to take place soon and was recommended to join</w:t>
+      </w:r>
+      <w:r>
+        <w:rPr>
+          <w:rFonts w:ascii="Times New Roman" w:hAnsi="Times New Roman" w:cs="Times New Roman"/>
+        </w:rPr>
+        <w:t xml:space="preserve"> two events (as shown in evidence B9-rec1 and B9-rec2). </w:t>
+      </w:r>
+    </w:p>
+    <w:p>
+      <w:pPr>
+        <w:jc w:val="both"/>
+        <w:rPr>
+          <w:rFonts w:ascii="Times New Roman" w:hAnsi="Times New Roman" w:cs="Times New Roman"/>
+        </w:rPr>
+      </w:pPr>
+      <w:r>
+        <w:rPr>
+          <w:rFonts w:ascii="Times New Roman" w:hAnsi="Times New Roman" w:cs="Times New Roman"/>
+        </w:rPr>
+        <w:t>Evidence for this activity can be found under the directory /Evidences/B9.</w:t>
+      </w:r>
     </w:p>
     <w:p>
       <w:pPr>
@@ -3439,7 +3513,6 @@
         <w:rPr>
           <w:rFonts w:ascii="Times New Roman" w:hAnsi="Times New Roman" w:cs="Times New Roman"/>
         </w:rPr>
-        <w:lastRenderedPageBreak/>
         <w:t xml:space="preserve">Most cybersecurity incidents come from human error, and instead of allocating their budget to </w:t>
       </w:r>
       <w:r>
@@ -3585,6 +3658,7 @@
           <w:sz w:val="40"/>
           <w:szCs w:val="40"/>
         </w:rPr>
+        <w:lastRenderedPageBreak/>
         <w:t>B12. Discover two bias cases when using a generative AI system.</w:t>
       </w:r>
     </w:p>
@@ -3634,21 +3708,151 @@
     </w:p>
     <w:p>
       <w:pPr>
-        <w:pStyle w:val="ListParagraph"/>
-        <w:numPr>
-          <w:ilvl w:val="0"/>
-          <w:numId w:val="3"/>
-        </w:numPr>
-        <w:jc w:val="both"/>
-        <w:rPr>
-          <w:rFonts w:ascii="Times New Roman" w:hAnsi="Times New Roman" w:cs="Times New Roman"/>
-        </w:rPr>
-      </w:pPr>
-      <w:r>
-        <w:rPr>
-          <w:rFonts w:ascii="Times New Roman" w:hAnsi="Times New Roman" w:cs="Times New Roman"/>
-        </w:rPr>
-        <w:t>Taught MCP during lab</w:t>
+        <w:jc w:val="both"/>
+        <w:rPr>
+          <w:rFonts w:ascii="Times New Roman" w:hAnsi="Times New Roman" w:cs="Times New Roman"/>
+        </w:rPr>
+      </w:pPr>
+      <w:r>
+        <w:rPr>
+          <w:rFonts w:ascii="Times New Roman" w:hAnsi="Times New Roman" w:cs="Times New Roman"/>
+        </w:rPr>
+        <w:t>Du</w:t>
+      </w:r>
+      <w:r>
+        <w:rPr>
+          <w:rFonts w:ascii="Times New Roman" w:hAnsi="Times New Roman" w:cs="Times New Roman"/>
+        </w:rPr>
+        <w:t>ring the in-class lab activity 2 about privacy</w:t>
+      </w:r>
+      <w:r>
+        <w:rPr>
+          <w:rFonts w:ascii="Times New Roman" w:hAnsi="Times New Roman" w:cs="Times New Roman"/>
+        </w:rPr>
+        <w:t xml:space="preserve"> (week 3)</w:t>
+      </w:r>
+      <w:r>
+        <w:rPr>
+          <w:rFonts w:ascii="Times New Roman" w:hAnsi="Times New Roman" w:cs="Times New Roman"/>
+        </w:rPr>
+        <w:t>, I had to teach my group about Multiple Party Computation (MPC) since some of them were still confused about the method.</w:t>
+      </w:r>
+      <w:r>
+        <w:rPr>
+          <w:rFonts w:ascii="Times New Roman" w:hAnsi="Times New Roman" w:cs="Times New Roman"/>
+        </w:rPr>
+        <w:t xml:space="preserve"> I surprisingly had to teach this twice since I attended the Monday and Thursday lab during that week (went to the Thursday one to find a group member).</w:t>
+      </w:r>
+      <w:r>
+        <w:rPr>
+          <w:rFonts w:ascii="Times New Roman" w:hAnsi="Times New Roman" w:cs="Times New Roman"/>
+        </w:rPr>
+        <w:t xml:space="preserve"> Using the slides as my point of reference, I explained how each person would have their own number they want to keep private, similar to the hospital’s raw patient counts. Then they would have to keep a split their number into multiple shares, one share is their own portion to keep, while the other share will be sent to the other people in the group/hospital. The remainder can be shared equally (like Hospital A sending both 30 to B and C) or unequally (like Hospital B and C sending 20 and 15, and 50 and 60). Then each person will add their own kept share with the shares they received from the others, and then the sum they calculated will be shared with others to get the total of everyone’s number. </w:t>
+      </w:r>
+    </w:p>
+    <w:p>
+      <w:pPr>
+        <w:jc w:val="both"/>
+        <w:rPr>
+          <w:rFonts w:ascii="Times New Roman" w:hAnsi="Times New Roman" w:cs="Times New Roman"/>
+        </w:rPr>
+      </w:pPr>
+      <w:r>
+        <w:rPr>
+          <w:rFonts w:ascii="Times New Roman" w:hAnsi="Times New Roman" w:cs="Times New Roman"/>
+        </w:rPr>
+        <w:drawing>
+          <wp:inline distT="0" distB="0" distL="0" distR="0" wp14:anchorId="72C7528F" wp14:editId="10A355AB">
+            <wp:extent cx="5731510" cy="3039110"/>
+            <wp:effectExtent l="0" t="0" r="2540" b="8890"/>
+            <wp:docPr id="1553742021" name="Picture 1"/>
+            <wp:cNvGraphicFramePr>
+              <a:graphicFrameLocks xmlns:a="http://schemas.openxmlformats.org/drawingml/2006/main" noChangeAspect="1"/>
+            </wp:cNvGraphicFramePr>
+            <a:graphic xmlns:a="http://schemas.openxmlformats.org/drawingml/2006/main">
+              <a:graphicData uri="http://schemas.openxmlformats.org/drawingml/2006/picture">
+                <pic:pic xmlns:pic="http://schemas.openxmlformats.org/drawingml/2006/picture">
+                  <pic:nvPicPr>
+                    <pic:cNvPr id="1553742021" name=""/>
+                    <pic:cNvPicPr/>
+                  </pic:nvPicPr>
+                  <pic:blipFill>
+                    <a:blip r:embed="rId11"/>
+                    <a:stretch>
+                      <a:fillRect/>
+                    </a:stretch>
+                  </pic:blipFill>
+                  <pic:spPr>
+                    <a:xfrm>
+                      <a:off x="0" y="0"/>
+                      <a:ext cx="5731510" cy="3039110"/>
+                    </a:xfrm>
+                    <a:prstGeom prst="rect">
+                      <a:avLst/>
+                    </a:prstGeom>
+                  </pic:spPr>
+                </pic:pic>
+              </a:graphicData>
+            </a:graphic>
+          </wp:inline>
+        </w:drawing>
+      </w:r>
+    </w:p>
+    <w:p>
+      <w:pPr>
+        <w:jc w:val="both"/>
+        <w:rPr>
+          <w:rFonts w:ascii="Times New Roman" w:hAnsi="Times New Roman" w:cs="Times New Roman"/>
+          <w:b/>
+          <w:bCs/>
+          <w:sz w:val="40"/>
+          <w:szCs w:val="40"/>
+        </w:rPr>
+      </w:pPr>
+      <w:r>
+        <w:rPr>
+          <w:rFonts w:ascii="Times New Roman" w:hAnsi="Times New Roman" w:cs="Times New Roman"/>
+          <w:b/>
+          <w:bCs/>
+          <w:sz w:val="40"/>
+          <w:szCs w:val="40"/>
+        </w:rPr>
+        <w:lastRenderedPageBreak/>
+        <w:drawing>
+          <wp:inline distT="0" distB="0" distL="0" distR="0" wp14:anchorId="5334AC28" wp14:editId="3E6FDFA8">
+            <wp:extent cx="5731510" cy="3052445"/>
+            <wp:effectExtent l="0" t="0" r="2540" b="0"/>
+            <wp:docPr id="989335313" name="Picture 1"/>
+            <wp:cNvGraphicFramePr>
+              <a:graphicFrameLocks xmlns:a="http://schemas.openxmlformats.org/drawingml/2006/main" noChangeAspect="1"/>
+            </wp:cNvGraphicFramePr>
+            <a:graphic xmlns:a="http://schemas.openxmlformats.org/drawingml/2006/main">
+              <a:graphicData uri="http://schemas.openxmlformats.org/drawingml/2006/picture">
+                <pic:pic xmlns:pic="http://schemas.openxmlformats.org/drawingml/2006/picture">
+                  <pic:nvPicPr>
+                    <pic:cNvPr id="989335313" name=""/>
+                    <pic:cNvPicPr/>
+                  </pic:nvPicPr>
+                  <pic:blipFill>
+                    <a:blip r:embed="rId12"/>
+                    <a:stretch>
+                      <a:fillRect/>
+                    </a:stretch>
+                  </pic:blipFill>
+                  <pic:spPr>
+                    <a:xfrm>
+                      <a:off x="0" y="0"/>
+                      <a:ext cx="5731510" cy="3052445"/>
+                    </a:xfrm>
+                    <a:prstGeom prst="rect">
+                      <a:avLst/>
+                    </a:prstGeom>
+                  </pic:spPr>
+                </pic:pic>
+              </a:graphicData>
+            </a:graphic>
+          </wp:inline>
+        </w:drawing>
       </w:r>
     </w:p>
     <w:p>
@@ -3714,117 +3918,117 @@
           <w:sz w:val="40"/>
           <w:szCs w:val="40"/>
         </w:rPr>
+        <w:t>B17. Implement one of the current state-of-the-art solutions and evaluate it.</w:t>
+      </w:r>
+    </w:p>
+    <w:p>
+      <w:pPr>
+        <w:jc w:val="both"/>
+        <w:rPr>
+          <w:rFonts w:ascii="Times New Roman" w:hAnsi="Times New Roman" w:cs="Times New Roman"/>
+          <w:b/>
+          <w:bCs/>
+          <w:sz w:val="40"/>
+          <w:szCs w:val="40"/>
+        </w:rPr>
+      </w:pPr>
+      <w:r>
+        <w:rPr>
+          <w:rFonts w:ascii="Times New Roman" w:hAnsi="Times New Roman" w:cs="Times New Roman"/>
+          <w:b/>
+          <w:bCs/>
+          <w:sz w:val="40"/>
+          <w:szCs w:val="40"/>
+        </w:rPr>
+        <w:t>B18. Contribute to an open-source project related to cybersecurity.</w:t>
+      </w:r>
+    </w:p>
+    <w:p>
+      <w:pPr>
+        <w:jc w:val="both"/>
+        <w:rPr>
+          <w:rFonts w:ascii="Times New Roman" w:hAnsi="Times New Roman" w:cs="Times New Roman"/>
+          <w:b/>
+          <w:bCs/>
+          <w:sz w:val="40"/>
+          <w:szCs w:val="40"/>
+        </w:rPr>
+      </w:pPr>
+      <w:r>
+        <w:rPr>
+          <w:rFonts w:ascii="Times New Roman" w:hAnsi="Times New Roman" w:cs="Times New Roman"/>
+          <w:b/>
+          <w:bCs/>
+          <w:sz w:val="40"/>
+          <w:szCs w:val="40"/>
+        </w:rPr>
+        <w:t>B19. Find and fix a vulnerability from a GitHub project.</w:t>
+      </w:r>
+    </w:p>
+    <w:p>
+      <w:pPr>
+        <w:jc w:val="both"/>
+        <w:rPr>
+          <w:rFonts w:ascii="Times New Roman" w:hAnsi="Times New Roman" w:cs="Times New Roman"/>
+          <w:b/>
+          <w:bCs/>
+          <w:sz w:val="40"/>
+          <w:szCs w:val="40"/>
+        </w:rPr>
+      </w:pPr>
+      <w:r>
+        <w:rPr>
+          <w:rFonts w:ascii="Times New Roman" w:hAnsi="Times New Roman" w:cs="Times New Roman"/>
+          <w:b/>
+          <w:bCs/>
+          <w:sz w:val="40"/>
+          <w:szCs w:val="40"/>
+        </w:rPr>
+        <w:t>B20. Enhance the security of a GitHub project.</w:t>
+      </w:r>
+    </w:p>
+    <w:p>
+      <w:pPr>
+        <w:jc w:val="both"/>
+        <w:rPr>
+          <w:rFonts w:ascii="Times New Roman" w:hAnsi="Times New Roman" w:cs="Times New Roman"/>
+          <w:b/>
+          <w:bCs/>
+          <w:sz w:val="40"/>
+          <w:szCs w:val="40"/>
+        </w:rPr>
+      </w:pPr>
+      <w:r>
+        <w:rPr>
+          <w:rFonts w:ascii="Times New Roman" w:hAnsi="Times New Roman" w:cs="Times New Roman"/>
+          <w:b/>
+          <w:bCs/>
+          <w:sz w:val="40"/>
+          <w:szCs w:val="40"/>
+        </w:rPr>
+        <w:t>B21. Design and implement a cybersecurity learning activity.</w:t>
+      </w:r>
+    </w:p>
+    <w:p>
+      <w:pPr>
+        <w:jc w:val="both"/>
+        <w:rPr>
+          <w:rFonts w:ascii="Times New Roman" w:hAnsi="Times New Roman" w:cs="Times New Roman"/>
+          <w:b/>
+          <w:bCs/>
+          <w:sz w:val="40"/>
+          <w:szCs w:val="40"/>
+        </w:rPr>
+      </w:pPr>
+      <w:r>
+        <w:rPr>
+          <w:rFonts w:ascii="Times New Roman" w:hAnsi="Times New Roman" w:cs="Times New Roman"/>
+          <w:b/>
+          <w:bCs/>
+          <w:sz w:val="40"/>
+          <w:szCs w:val="40"/>
+        </w:rPr>
         <w:lastRenderedPageBreak/>
-        <w:t>B17. Implement one of the current state-of-the-art solutions and evaluate it.</w:t>
-      </w:r>
-    </w:p>
-    <w:p>
-      <w:pPr>
-        <w:jc w:val="both"/>
-        <w:rPr>
-          <w:rFonts w:ascii="Times New Roman" w:hAnsi="Times New Roman" w:cs="Times New Roman"/>
-          <w:b/>
-          <w:bCs/>
-          <w:sz w:val="40"/>
-          <w:szCs w:val="40"/>
-        </w:rPr>
-      </w:pPr>
-      <w:r>
-        <w:rPr>
-          <w:rFonts w:ascii="Times New Roman" w:hAnsi="Times New Roman" w:cs="Times New Roman"/>
-          <w:b/>
-          <w:bCs/>
-          <w:sz w:val="40"/>
-          <w:szCs w:val="40"/>
-        </w:rPr>
-        <w:t>B18. Contribute to an open-source project related to cybersecurity.</w:t>
-      </w:r>
-    </w:p>
-    <w:p>
-      <w:pPr>
-        <w:jc w:val="both"/>
-        <w:rPr>
-          <w:rFonts w:ascii="Times New Roman" w:hAnsi="Times New Roman" w:cs="Times New Roman"/>
-          <w:b/>
-          <w:bCs/>
-          <w:sz w:val="40"/>
-          <w:szCs w:val="40"/>
-        </w:rPr>
-      </w:pPr>
-      <w:r>
-        <w:rPr>
-          <w:rFonts w:ascii="Times New Roman" w:hAnsi="Times New Roman" w:cs="Times New Roman"/>
-          <w:b/>
-          <w:bCs/>
-          <w:sz w:val="40"/>
-          <w:szCs w:val="40"/>
-        </w:rPr>
-        <w:t>B19. Find and fix a vulnerability from a GitHub project.</w:t>
-      </w:r>
-    </w:p>
-    <w:p>
-      <w:pPr>
-        <w:jc w:val="both"/>
-        <w:rPr>
-          <w:rFonts w:ascii="Times New Roman" w:hAnsi="Times New Roman" w:cs="Times New Roman"/>
-          <w:b/>
-          <w:bCs/>
-          <w:sz w:val="40"/>
-          <w:szCs w:val="40"/>
-        </w:rPr>
-      </w:pPr>
-      <w:r>
-        <w:rPr>
-          <w:rFonts w:ascii="Times New Roman" w:hAnsi="Times New Roman" w:cs="Times New Roman"/>
-          <w:b/>
-          <w:bCs/>
-          <w:sz w:val="40"/>
-          <w:szCs w:val="40"/>
-        </w:rPr>
-        <w:t>B20. Enhance the security of a GitHub project.</w:t>
-      </w:r>
-    </w:p>
-    <w:p>
-      <w:pPr>
-        <w:jc w:val="both"/>
-        <w:rPr>
-          <w:rFonts w:ascii="Times New Roman" w:hAnsi="Times New Roman" w:cs="Times New Roman"/>
-          <w:b/>
-          <w:bCs/>
-          <w:sz w:val="40"/>
-          <w:szCs w:val="40"/>
-        </w:rPr>
-      </w:pPr>
-      <w:r>
-        <w:rPr>
-          <w:rFonts w:ascii="Times New Roman" w:hAnsi="Times New Roman" w:cs="Times New Roman"/>
-          <w:b/>
-          <w:bCs/>
-          <w:sz w:val="40"/>
-          <w:szCs w:val="40"/>
-        </w:rPr>
-        <w:t>B21. Design and implement a cybersecurity learning activity.</w:t>
-      </w:r>
-    </w:p>
-    <w:p>
-      <w:pPr>
-        <w:jc w:val="both"/>
-        <w:rPr>
-          <w:rFonts w:ascii="Times New Roman" w:hAnsi="Times New Roman" w:cs="Times New Roman"/>
-          <w:b/>
-          <w:bCs/>
-          <w:sz w:val="40"/>
-          <w:szCs w:val="40"/>
-        </w:rPr>
-      </w:pPr>
-      <w:r>
-        <w:rPr>
-          <w:rFonts w:ascii="Times New Roman" w:hAnsi="Times New Roman" w:cs="Times New Roman"/>
-          <w:b/>
-          <w:bCs/>
-          <w:sz w:val="40"/>
-          <w:szCs w:val="40"/>
-        </w:rPr>
         <w:t>B22. Enhance the cybersecurity of a website from your community.</w:t>
       </w:r>
     </w:p>
@@ -3928,7 +4132,6 @@
           <w:rFonts w:ascii="Times New Roman" w:hAnsi="Times New Roman" w:cs="Times New Roman"/>
           <w:noProof/>
         </w:rPr>
-        <w:lastRenderedPageBreak/>
         <w:drawing>
           <wp:inline distT="0" distB="0" distL="0" distR="0" wp14:anchorId="7C65F98A" wp14:editId="735A432A">
             <wp:extent cx="5731510" cy="2920365"/>
@@ -3945,7 +4148,7 @@
                     <pic:cNvPicPr/>
                   </pic:nvPicPr>
                   <pic:blipFill>
-                    <a:blip r:embed="rId11"/>
+                    <a:blip r:embed="rId13"/>
                     <a:stretch>
                       <a:fillRect/>
                     </a:stretch>
@@ -4039,6 +4242,7 @@
         <w:rPr>
           <w:rFonts w:ascii="Times New Roman" w:hAnsi="Times New Roman" w:cs="Times New Roman"/>
         </w:rPr>
+        <w:lastRenderedPageBreak/>
         <w:t>Collision-free property (which is apparently also known as collision resistance property) means that it is hard to find two inputs that hash to the same output value.</w:t>
       </w:r>
       <w:r>
@@ -4130,7 +4334,6 @@
           <w:sz w:val="40"/>
           <w:szCs w:val="40"/>
         </w:rPr>
-        <w:lastRenderedPageBreak/>
         <w:t>B29. Find a CVE in this year and fix it using three different generative AI systems (e.g., ChatGPT, Gemini), comparing the consistency.</w:t>
       </w:r>
     </w:p>

</xml_diff>

<commit_message>
Finished B28 and added the poster as evidence in the docs
</commit_message>
<xml_diff>
--- a/Portfolio/Part-2-Activities.docx
+++ b/Portfolio/Part-2-Activities.docx
@@ -2024,6 +2024,12 @@
                 <w:rFonts w:ascii="Times New Roman" w:hAnsi="Times New Roman" w:cs="Times New Roman"/>
               </w:rPr>
             </w:pPr>
+            <w:r>
+              <w:rPr>
+                <w:rFonts w:ascii="Times New Roman" w:hAnsi="Times New Roman" w:cs="Times New Roman"/>
+              </w:rPr>
+              <w:t>2</w:t>
+            </w:r>
           </w:p>
         </w:tc>
       </w:tr>
@@ -2157,7 +2163,19 @@
         <w:rPr>
           <w:rFonts w:ascii="Times New Roman" w:hAnsi="Times New Roman" w:cs="Times New Roman"/>
         </w:rPr>
-        <w:t xml:space="preserve">Done: 2/25 </w:t>
+        <w:t xml:space="preserve">Done: </w:t>
+      </w:r>
+      <w:r>
+        <w:rPr>
+          <w:rFonts w:ascii="Times New Roman" w:hAnsi="Times New Roman" w:cs="Times New Roman"/>
+        </w:rPr>
+        <w:t>6</w:t>
+      </w:r>
+      <w:r>
+        <w:rPr>
+          <w:rFonts w:ascii="Times New Roman" w:hAnsi="Times New Roman" w:cs="Times New Roman"/>
+        </w:rPr>
+        <w:t xml:space="preserve">/25 </w:t>
       </w:r>
     </w:p>
     <w:p>
@@ -2177,7 +2195,13 @@
         <w:rPr>
           <w:rFonts w:ascii="Times New Roman" w:hAnsi="Times New Roman" w:cs="Times New Roman"/>
         </w:rPr>
-        <w:t xml:space="preserve"> 4</w:t>
+        <w:t xml:space="preserve"> </w:t>
+      </w:r>
+      <w:r>
+        <w:rPr>
+          <w:rFonts w:ascii="Times New Roman" w:hAnsi="Times New Roman" w:cs="Times New Roman"/>
+        </w:rPr>
+        <w:t>1</w:t>
       </w:r>
     </w:p>
     <w:p>
@@ -3741,7 +3765,19 @@
         <w:rPr>
           <w:rFonts w:ascii="Times New Roman" w:hAnsi="Times New Roman" w:cs="Times New Roman"/>
         </w:rPr>
-        <w:t xml:space="preserve"> I surprisingly had to teach this twice since I attended the Monday and Thursday lab during that week (went to the Thursday one to find a group member).</w:t>
+        <w:t xml:space="preserve"> I surprisingly had to teach this twice since I attended the Monday and Thursday lab during that week (went to the Thursday one to find a group member</w:t>
+      </w:r>
+      <w:r>
+        <w:rPr>
+          <w:rFonts w:ascii="Times New Roman" w:hAnsi="Times New Roman" w:cs="Times New Roman"/>
+        </w:rPr>
+        <w:t>, which I eventually found</w:t>
+      </w:r>
+      <w:r>
+        <w:rPr>
+          <w:rFonts w:ascii="Times New Roman" w:hAnsi="Times New Roman" w:cs="Times New Roman"/>
+        </w:rPr>
+        <w:t>).</w:t>
       </w:r>
       <w:r>
         <w:rPr>
@@ -4268,8 +4304,16 @@
         <w:rPr>
           <w:rFonts w:ascii="Times New Roman" w:hAnsi="Times New Roman" w:cs="Times New Roman"/>
         </w:rPr>
-        <w:t>So even in one-way property, collisions do exist, but they are very hard to find/compute intentionally.</w:t>
-      </w:r>
+        <w:t xml:space="preserve">So </w:t>
+      </w:r>
+      <w:bookmarkStart w:id="0" w:name="_Hlk227531813"/>
+      <w:r>
+        <w:rPr>
+          <w:rFonts w:ascii="Times New Roman" w:hAnsi="Times New Roman" w:cs="Times New Roman"/>
+        </w:rPr>
+        <w:t>even in one-way property, collisions do exist, but they are very hard to find/compute intentionally.</w:t>
+      </w:r>
+      <w:bookmarkEnd w:id="0"/>
     </w:p>
     <w:p>
       <w:pPr>
@@ -4329,11 +4373,114 @@
       <w:r>
         <w:rPr>
           <w:rFonts w:ascii="Times New Roman" w:hAnsi="Times New Roman" w:cs="Times New Roman"/>
-          <w:b/>
-          <w:bCs/>
-          <w:sz w:val="40"/>
-          <w:szCs w:val="40"/>
-        </w:rPr>
+        </w:rPr>
+        <w:t>I made a cyber safety flyer for university students, specifically how they would use similar passwords every time the university asks them to change their passwords every semester (I too am unfortunately guilty for this). Changing and coming up with new passwords every time is a hassle for students, especially during the UWA Data Breach 2025, where students had to keep changing their passwords multiple times in the span of a week, and I’m assuming most used the same password they have been using previously, with minor variations such as a number change, or adding one extra character, etc. Hence why I decided to make this flyer</w:t>
+      </w:r>
+      <w:r>
+        <w:rPr>
+          <w:rFonts w:ascii="Times New Roman" w:hAnsi="Times New Roman" w:cs="Times New Roman"/>
+        </w:rPr>
+        <w:t xml:space="preserve"> using Canva</w:t>
+      </w:r>
+      <w:r>
+        <w:rPr>
+          <w:rFonts w:ascii="Times New Roman" w:hAnsi="Times New Roman" w:cs="Times New Roman"/>
+        </w:rPr>
+        <w:t xml:space="preserve"> (used a template for the background)</w:t>
+      </w:r>
+      <w:r>
+        <w:rPr>
+          <w:rFonts w:ascii="Times New Roman" w:hAnsi="Times New Roman" w:cs="Times New Roman"/>
+        </w:rPr>
+        <w:t>.</w:t>
+      </w:r>
+    </w:p>
+    <w:p>
+      <w:pPr>
+        <w:jc w:val="both"/>
+        <w:rPr>
+          <w:rFonts w:ascii="Times New Roman" w:hAnsi="Times New Roman" w:cs="Times New Roman"/>
+          <w:b/>
+          <w:bCs/>
+          <w:sz w:val="40"/>
+          <w:szCs w:val="40"/>
+        </w:rPr>
+      </w:pPr>
+      <w:r>
+        <w:rPr>
+          <w:noProof/>
+        </w:rPr>
+        <w:lastRenderedPageBreak/>
+        <w:drawing>
+          <wp:inline distT="0" distB="0" distL="0" distR="0" wp14:anchorId="45574B1C" wp14:editId="77C2B128">
+            <wp:extent cx="5731510" cy="8110855"/>
+            <wp:effectExtent l="0" t="0" r="2540" b="4445"/>
+            <wp:docPr id="1285784819" name="Picture 6"/>
+            <wp:cNvGraphicFramePr>
+              <a:graphicFrameLocks xmlns:a="http://schemas.openxmlformats.org/drawingml/2006/main" noChangeAspect="1"/>
+            </wp:cNvGraphicFramePr>
+            <a:graphic xmlns:a="http://schemas.openxmlformats.org/drawingml/2006/main">
+              <a:graphicData uri="http://schemas.openxmlformats.org/drawingml/2006/picture">
+                <pic:pic xmlns:pic="http://schemas.openxmlformats.org/drawingml/2006/picture">
+                  <pic:nvPicPr>
+                    <pic:cNvPr id="0" name="Picture 9"/>
+                    <pic:cNvPicPr>
+                      <a:picLocks noChangeAspect="1" noChangeArrowheads="1"/>
+                    </pic:cNvPicPr>
+                  </pic:nvPicPr>
+                  <pic:blipFill>
+                    <a:blip r:embed="rId14" cstate="print">
+                      <a:extLst>
+                        <a:ext uri="{28A0092B-C50C-407E-A947-70E740481C1C}">
+                          <a14:useLocalDpi xmlns:a14="http://schemas.microsoft.com/office/drawing/2010/main" val="0"/>
+                        </a:ext>
+                      </a:extLst>
+                    </a:blip>
+                    <a:srcRect/>
+                    <a:stretch>
+                      <a:fillRect/>
+                    </a:stretch>
+                  </pic:blipFill>
+                  <pic:spPr bwMode="auto">
+                    <a:xfrm>
+                      <a:off x="0" y="0"/>
+                      <a:ext cx="5731510" cy="8110855"/>
+                    </a:xfrm>
+                    <a:prstGeom prst="rect">
+                      <a:avLst/>
+                    </a:prstGeom>
+                    <a:noFill/>
+                    <a:ln>
+                      <a:noFill/>
+                    </a:ln>
+                  </pic:spPr>
+                </pic:pic>
+              </a:graphicData>
+            </a:graphic>
+          </wp:inline>
+        </w:drawing>
+      </w:r>
+    </w:p>
+    <w:p>
+      <w:pPr>
+        <w:jc w:val="both"/>
+        <w:rPr>
+          <w:rFonts w:ascii="Times New Roman" w:hAnsi="Times New Roman" w:cs="Times New Roman"/>
+          <w:b/>
+          <w:bCs/>
+          <w:sz w:val="40"/>
+          <w:szCs w:val="40"/>
+        </w:rPr>
+      </w:pPr>
+      <w:r>
+        <w:rPr>
+          <w:rFonts w:ascii="Times New Roman" w:hAnsi="Times New Roman" w:cs="Times New Roman"/>
+          <w:b/>
+          <w:bCs/>
+          <w:sz w:val="40"/>
+          <w:szCs w:val="40"/>
+        </w:rPr>
+        <w:lastRenderedPageBreak/>
         <w:t>B29. Find a CVE in this year and fix it using three different generative AI systems (e.g., ChatGPT, Gemini), comparing the consistency.</w:t>
       </w:r>
     </w:p>

</xml_diff>